<commit_message>
docs: distinguish MoonSentinel from MoonVerity
</commit_message>
<xml_diff>
--- a/docs/MoonSentinel项目申报书.docx
+++ b/docs/MoonSentinel项目申报书.docx
@@ -12,7 +12,7 @@
         <w:rPr>
           <w:rFonts w:ascii="Microsoft YaHei" w:hAnsi="Microsoft YaHei" w:eastAsia="Microsoft YaHei"/>
           <w:b/>
-          <w:color w:val="17365D"/>
+          <w:color w:val="000000"/>
           <w:sz w:val="44"/>
         </w:rPr>
         <w:t>MoonSentinel 项目申报书</w:t>
@@ -30,7 +30,7 @@
           <w:color w:val="1F1F1F"/>
           <w:sz w:val="25"/>
         </w:rPr>
-        <w:t>面向 Arrow 数据的质量与隐私发布门禁</w:t>
+        <w:t>用途绑定的 Arrow 隐私发布门禁</w:t>
       </w:r>
     </w:p>
     <w:tbl>
@@ -40,12 +40,12 @@
         <w:tblLayout w:type="fixed"/>
         <w:tblLook w:firstColumn="1" w:firstRow="1" w:lastColumn="0" w:lastRow="0" w:noHBand="0" w:noVBand="1" w:val="04A0"/>
         <w:tblBorders>
-          <w:top w:val="single" w:sz="6" w:space="0" w:color="D6DEE6"/>
-          <w:left w:val="single" w:sz="6" w:space="0" w:color="D6DEE6"/>
-          <w:bottom w:val="single" w:sz="6" w:space="0" w:color="D6DEE6"/>
-          <w:right w:val="single" w:sz="6" w:space="0" w:color="D6DEE6"/>
-          <w:insideH w:val="single" w:sz="6" w:space="0" w:color="D6DEE6"/>
-          <w:insideV w:val="single" w:sz="6" w:space="0" w:color="D6DEE6"/>
+          <w:top w:val="single" w:sz="6" w:space="0" w:color="D9D9D9"/>
+          <w:left w:val="single" w:sz="6" w:space="0" w:color="D9D9D9"/>
+          <w:bottom w:val="single" w:sz="6" w:space="0" w:color="D9D9D9"/>
+          <w:right w:val="single" w:sz="6" w:space="0" w:color="D9D9D9"/>
+          <w:insideH w:val="single" w:sz="6" w:space="0" w:color="D9D9D9"/>
+          <w:insideV w:val="single" w:sz="6" w:space="0" w:color="D9D9D9"/>
         </w:tblBorders>
       </w:tblPr>
       <w:tblGrid>
@@ -346,10 +346,10 @@
         <w:rPr>
           <w:rFonts w:ascii="Microsoft YaHei" w:hAnsi="Microsoft YaHei" w:eastAsia="Microsoft YaHei"/>
           <w:b/>
-          <w:color w:val="17365D"/>
+          <w:color w:val="000000"/>
           <w:sz w:val="21"/>
         </w:rPr>
-        <w:t xml:space="preserve">当前成果  </w:t>
+        <w:t xml:space="preserve">本次修订结论  </w:t>
       </w:r>
       <w:r>
         <w:rPr>
@@ -358,7 +358,7 @@
           <w:color w:val="1F1F1F"/>
           <w:sz w:val="21"/>
         </w:rPr>
-        <w:t>项目已经完成从通用查询引擎到 Arrow 数据发布门禁的实质性重构。当前生产代码不包含过滤、排序、分组、连接或 IPC 实现；已完成质量规则、错误与警告、行隔离、诊断上限、放行前脱敏和 Arrow 原生输出，并通过四个目标后端测试。</w:t>
+        <w:t>MoonSentinel 已从通用数据质量规则项目重构为用途绑定的隐私发布授权器。当前生产接口不再提供 Required、Unique、Range、Enum、Profile、Contract Diff 等 MoonVerity 已覆盖的能力，而是围绕用途、接收方、逐行同意、最小化发布和 k 匿名完成可执行决策。</w:t>
       </w:r>
     </w:p>
     <w:p>
@@ -371,10 +371,10 @@
         <w:rPr>
           <w:rFonts w:ascii="Microsoft YaHei" w:hAnsi="Microsoft YaHei" w:eastAsia="Microsoft YaHei"/>
           <w:b/>
-          <w:color w:val="17365D"/>
+          <w:color w:val="000000"/>
           <w:sz w:val="29"/>
         </w:rPr>
-        <w:t>一 项目简介</w:t>
+        <w:t>一 项目定位</w:t>
       </w:r>
     </w:p>
     <w:p>
@@ -389,7 +389,7 @@
           <w:color w:val="1F1F1F"/>
           <w:sz w:val="21"/>
         </w:rPr>
-        <w:t>MoonSentinel 是使用 MoonBit 编写的 Arrow 数据发布门禁。系统接收一个 Arrow RecordBatch 和一组声明式规则，逐行检查质量问题，区分阻断错误与非阻断警告，再生成获准数据、隔离数据和结构化诊断三个 RecordBatch。获准数据还可在交付前替换敏感 UTF-8 字段。</w:t>
+        <w:t>MoonSentinel 是使用 MoonBit 编写的 Arrow 隐私发布门禁。调用方提交 Arrow RecordBatch、PrivacyPolicy 和 ReleaseRequest，系统判断这批数据在指定用途和接收方条件下能否发布，并同时生成获准数据、隔离数据、隐私发现和发布清单四个 Arrow RecordBatch。</w:t>
       </w:r>
     </w:p>
     <w:p>
@@ -404,7 +404,7 @@
           <w:color w:val="1F1F1F"/>
           <w:sz w:val="21"/>
         </w:rPr>
-        <w:t>该项目解决的是数据已经能够交换，但尚不能安全发布的问题。它不提供过滤、排序、分组或连接等通用查询能力，也不实现 Arrow IPC、JSON Schema、Schema 版本治理或迁移计划。</w:t>
+        <w:t>本项目回答的是“这批数据能否因这个用途交给这个接收方”这一授权问题，而不是“字段格式是否正确”这一数据质量问题。它不提供通用合同校验、质量评分、数据画像、合同差异或 CSV/JSONL 验证命令。</w:t>
       </w:r>
     </w:p>
     <w:p>
@@ -417,10 +417,10 @@
         <w:rPr>
           <w:rFonts w:ascii="Microsoft YaHei" w:hAnsi="Microsoft YaHei" w:eastAsia="Microsoft YaHei"/>
           <w:b/>
-          <w:color w:val="17365D"/>
+          <w:color w:val="000000"/>
           <w:sz w:val="29"/>
         </w:rPr>
-        <w:t>二 问题和实际价值</w:t>
+        <w:t>二 实际问题和目标用户</w:t>
       </w:r>
     </w:p>
     <w:p>
@@ -435,7 +435,7 @@
           <w:color w:val="1F1F1F"/>
           <w:sz w:val="21"/>
         </w:rPr>
-        <w:t>真实数据批次可能包含重复标识、越界年龄、无效枚举、颠倒的上下界、缺失联系方式或未脱敏字段。若每个应用分别编写临时检查逻辑，规则、错误格式和处置方式会逐渐不一致。MoonSentinel 把这一步收敛为可测试的发布门禁。</w:t>
+        <w:t>研究数据、风控样本、合作方数据集和 AI 训练数据经常已经满足格式要求，却仍可能因为用途越界、接收方未获授权、用户未同意、准标识符群体过小或多余字段外泄而不能发布。MoonSentinel 把这些隐私条件变成可测试、可审计的代码路径。</w:t>
       </w:r>
     </w:p>
     <w:p>
@@ -450,7 +450,7 @@
           <w:color w:val="1F1F1F"/>
           <w:sz w:val="21"/>
         </w:rPr>
-        <w:t>1. 数据产品发布。导出数据通过规则后才能进入报表、下载文件或下游 API。</w:t>
+        <w:t>1. 数据负责人在向合作方交付数据前，验证用途、接收方和最小群体规模。</w:t>
       </w:r>
     </w:p>
     <w:p>
@@ -465,7 +465,7 @@
           <w:color w:val="1F1F1F"/>
           <w:sz w:val="21"/>
         </w:rPr>
-        <w:t>2. 浏览器与边缘应用。MoonBit/Wasm 在本地检查 Arrow 数据，错误行不进入后续计算。</w:t>
+        <w:t>2. 研究与风控团队只获得与申请用途相关的字段和已同意的记录。</w:t>
       </w:r>
     </w:p>
     <w:p>
@@ -480,7 +480,7 @@
           <w:color w:val="1F1F1F"/>
           <w:sz w:val="21"/>
         </w:rPr>
-        <w:t>3. AI 数据准备。数据进入模型或检索流程前先隔离错误行，并替换敏感文本字段。</w:t>
+        <w:t>3. 浏览器或边缘应用通过 MoonBit/Wasm 在本地执行同一套发布策略。</w:t>
       </w:r>
     </w:p>
     <w:p>
@@ -495,7 +495,7 @@
           <w:color w:val="1F1F1F"/>
           <w:sz w:val="21"/>
         </w:rPr>
-        <w:t>4. 数据管道排错。诊断结果仍是 Arrow RecordBatch，可写入 IPC、存档或展示。</w:t>
+        <w:t>4. 审计人员通过 Arrow 发布清单追踪申请编号、策略编号、放行量和隔离量。</w:t>
       </w:r>
     </w:p>
     <w:p>
@@ -508,10 +508,10 @@
         <w:rPr>
           <w:rFonts w:ascii="Microsoft YaHei" w:hAnsi="Microsoft YaHei" w:eastAsia="Microsoft YaHei"/>
           <w:b/>
-          <w:color w:val="17365D"/>
+          <w:color w:val="000000"/>
           <w:sz w:val="29"/>
         </w:rPr>
-        <w:t>三 已完成成果</w:t>
+        <w:t>三 已完成的 MVP</w:t>
       </w:r>
     </w:p>
     <w:tbl>
@@ -521,12 +521,12 @@
         <w:tblLayout w:type="fixed"/>
         <w:tblLook w:firstColumn="1" w:firstRow="1" w:lastColumn="0" w:lastRow="0" w:noHBand="0" w:noVBand="1" w:val="04A0"/>
         <w:tblBorders>
-          <w:top w:val="single" w:sz="6" w:space="0" w:color="D6DEE6"/>
-          <w:left w:val="single" w:sz="6" w:space="0" w:color="D6DEE6"/>
-          <w:bottom w:val="single" w:sz="6" w:space="0" w:color="D6DEE6"/>
-          <w:right w:val="single" w:sz="6" w:space="0" w:color="D6DEE6"/>
-          <w:insideH w:val="single" w:sz="6" w:space="0" w:color="D6DEE6"/>
-          <w:insideV w:val="single" w:sz="6" w:space="0" w:color="D6DEE6"/>
+          <w:top w:val="single" w:sz="6" w:space="0" w:color="D9D9D9"/>
+          <w:left w:val="single" w:sz="6" w:space="0" w:color="D9D9D9"/>
+          <w:bottom w:val="single" w:sz="6" w:space="0" w:color="D9D9D9"/>
+          <w:right w:val="single" w:sz="6" w:space="0" w:color="D9D9D9"/>
+          <w:insideH w:val="single" w:sz="6" w:space="0" w:color="D9D9D9"/>
+          <w:insideV w:val="single" w:sz="6" w:space="0" w:color="D9D9D9"/>
         </w:tblBorders>
       </w:tblPr>
       <w:tblGrid>
@@ -651,7 +651,7 @@
                 <w:color w:val="1F1F1F"/>
                 <w:sz w:val="19"/>
               </w:rPr>
-              <w:t>规则</w:t>
+              <w:t>用途约束</w:t>
             </w:r>
           </w:p>
         </w:tc>
@@ -678,7 +678,7 @@
                 <w:color w:val="1F1F1F"/>
                 <w:sz w:val="19"/>
               </w:rPr>
-              <w:t>必需列、非空、Int32/Int64 范围、非空字符串、允许列表、唯一性、跨字段顺序</w:t>
+              <w:t>策略列出允许用途，越界用途整批拒绝</w:t>
             </w:r>
           </w:p>
         </w:tc>
@@ -705,7 +705,7 @@
                 <w:color w:val="1F1F1F"/>
                 <w:sz w:val="19"/>
               </w:rPr>
-              <w:t>单元测试</w:t>
+              <w:t>自动化测试</w:t>
             </w:r>
           </w:p>
         </w:tc>
@@ -738,7 +738,7 @@
                 <w:color w:val="1F1F1F"/>
                 <w:sz w:val="19"/>
               </w:rPr>
-              <w:t>严重度</w:t>
+              <w:t>接收方约束</w:t>
             </w:r>
           </w:p>
         </w:tc>
@@ -766,7 +766,7 @@
                 <w:color w:val="1F1F1F"/>
                 <w:sz w:val="19"/>
               </w:rPr>
-              <w:t>Error 隔离行；Warning 只记录</w:t>
+              <w:t>Internal、Partner、Public 分级授权</w:t>
             </w:r>
           </w:p>
         </w:tc>
@@ -794,7 +794,7 @@
                 <w:color w:val="1F1F1F"/>
                 <w:sz w:val="19"/>
               </w:rPr>
-              <w:t>处置测试</w:t>
+              <w:t>自动化测试</w:t>
             </w:r>
           </w:p>
         </w:tc>
@@ -826,7 +826,7 @@
                 <w:color w:val="1F1F1F"/>
                 <w:sz w:val="19"/>
               </w:rPr>
-              <w:t>数据集错误</w:t>
+              <w:t>逐行同意</w:t>
             </w:r>
           </w:p>
         </w:tc>
@@ -853,7 +853,7 @@
                 <w:color w:val="1F1F1F"/>
                 <w:sz w:val="19"/>
               </w:rPr>
-              <w:t>缺失列和类型不符阻断整个批次</w:t>
+              <w:t>按同意列筛选候选记录，未同意行进入隔离</w:t>
             </w:r>
           </w:p>
         </w:tc>
@@ -880,7 +880,7 @@
                 <w:color w:val="1F1F1F"/>
                 <w:sz w:val="19"/>
               </w:rPr>
-              <w:t>Schema 测试</w:t>
+              <w:t>自动化测试</w:t>
             </w:r>
           </w:p>
         </w:tc>
@@ -913,7 +913,7 @@
                 <w:color w:val="1F1F1F"/>
                 <w:sz w:val="19"/>
               </w:rPr>
-              <w:t>诊断上限</w:t>
+              <w:t>k 匿名</w:t>
             </w:r>
           </w:p>
         </w:tc>
@@ -941,7 +941,7 @@
                 <w:color w:val="1F1F1F"/>
                 <w:sz w:val="19"/>
               </w:rPr>
-              <w:t>明细可截断，错误和警告总数保持准确</w:t>
+              <w:t>只在已同意候选行中按准标识符组合计算等价类</w:t>
             </w:r>
           </w:p>
         </w:tc>
@@ -969,7 +969,7 @@
                 <w:color w:val="1F1F1F"/>
                 <w:sz w:val="19"/>
               </w:rPr>
-              <w:t>截断测试</w:t>
+              <w:t>自动化测试</w:t>
             </w:r>
           </w:p>
         </w:tc>
@@ -1001,7 +1001,7 @@
                 <w:color w:val="1F1F1F"/>
                 <w:sz w:val="19"/>
               </w:rPr>
-              <w:t>发布结果</w:t>
+              <w:t>最小化发布</w:t>
             </w:r>
           </w:p>
         </w:tc>
@@ -1028,7 +1028,7 @@
                 <w:color w:val="1F1F1F"/>
                 <w:sz w:val="19"/>
               </w:rPr>
-              <w:t>approved、quarantine、findings 三个 RecordBatch</w:t>
+              <w:t>仅发布策略列明字段，未列字段默认不输出</w:t>
             </w:r>
           </w:p>
         </w:tc>
@@ -1055,7 +1055,7 @@
                 <w:color w:val="1F1F1F"/>
                 <w:sz w:val="19"/>
               </w:rPr>
-              <w:t>端到端测试</w:t>
+              <w:t>自动化测试</w:t>
             </w:r>
           </w:p>
         </w:tc>
@@ -1088,7 +1088,7 @@
                 <w:color w:val="1F1F1F"/>
                 <w:sz w:val="19"/>
               </w:rPr>
-              <w:t>隐私处理</w:t>
+              <w:t>敏感处理</w:t>
             </w:r>
           </w:p>
         </w:tc>
@@ -1116,7 +1116,7 @@
                 <w:color w:val="1F1F1F"/>
                 <w:sz w:val="19"/>
               </w:rPr>
-              <w:t>只替换 approved 的 UTF-8 敏感列</w:t>
+              <w:t>直接标识符和敏感字段必须替换或删除，禁止原值 Keep</w:t>
             </w:r>
           </w:p>
         </w:tc>
@@ -1144,7 +1144,7 @@
                 <w:color w:val="1F1F1F"/>
                 <w:sz w:val="19"/>
               </w:rPr>
-              <w:t>脱敏测试</w:t>
+              <w:t>策略校验</w:t>
             </w:r>
           </w:p>
         </w:tc>
@@ -1176,7 +1176,7 @@
                 <w:color w:val="1F1F1F"/>
                 <w:sz w:val="19"/>
               </w:rPr>
-              <w:t>Arrow 交接</w:t>
+              <w:t>Arrow 结果</w:t>
             </w:r>
           </w:p>
         </w:tc>
@@ -1203,7 +1203,7 @@
                 <w:color w:val="1F1F1F"/>
                 <w:sz w:val="19"/>
               </w:rPr>
-              <w:t>findings 写入 IPC Stream 并重新读取</w:t>
+              <w:t>approved、quarantine、findings、manifest 四类 RecordBatch</w:t>
             </w:r>
           </w:p>
         </w:tc>
@@ -1230,7 +1230,7 @@
                 <w:color w:val="1F1F1F"/>
                 <w:sz w:val="19"/>
               </w:rPr>
-              <w:t>回环测试</w:t>
+              <w:t>IPC 回环</w:t>
             </w:r>
           </w:p>
         </w:tc>
@@ -1263,7 +1263,7 @@
                 <w:color w:val="1F1F1F"/>
                 <w:sz w:val="19"/>
               </w:rPr>
-              <w:t>后端</w:t>
+              <w:t>跨目标</w:t>
             </w:r>
           </w:p>
         </w:tc>
@@ -1319,7 +1319,7 @@
                 <w:color w:val="1F1F1F"/>
                 <w:sz w:val="19"/>
               </w:rPr>
-              <w:t>7 项测试全部通过</w:t>
+              <w:t>8 项测试全通过</w:t>
             </w:r>
           </w:p>
         </w:tc>
@@ -1340,10 +1340,10 @@
         <w:rPr>
           <w:rFonts w:ascii="Microsoft YaHei" w:hAnsi="Microsoft YaHei" w:eastAsia="Microsoft YaHei"/>
           <w:b/>
-          <w:color w:val="17365D"/>
+          <w:color w:val="000000"/>
           <w:sz w:val="29"/>
         </w:rPr>
-        <w:t>四 核心流程</w:t>
+        <w:t>四 发布决策流程</w:t>
       </w:r>
     </w:p>
     <w:p>
@@ -1358,7 +1358,7 @@
           <w:color w:val="1F1F1F"/>
           <w:sz w:val="21"/>
         </w:rPr>
-        <w:t>1. 校验 RecordBatch 的字段数量、列长度、类型和 nullability。</w:t>
+        <w:t>1. 校验 PrivacyPolicy 和 ReleaseRequest 是否完整、互相匹配。</w:t>
       </w:r>
     </w:p>
     <w:p>
@@ -1373,7 +1373,7 @@
           <w:color w:val="1F1F1F"/>
           <w:sz w:val="21"/>
         </w:rPr>
-        <w:t>2. 校验合同名称、规则编号、范围端点、允许列表和编号唯一性。</w:t>
+        <w:t>2. 检查用途和接收方是否在策略允许范围内；不允许则整批拒绝。</w:t>
       </w:r>
     </w:p>
     <w:p>
@@ -1388,7 +1388,7 @@
           <w:color w:val="1F1F1F"/>
           <w:sz w:val="21"/>
         </w:rPr>
-        <w:t>3. 按规则声明顺序和源行顺序检查数据，累计错误与警告。</w:t>
+        <w:t>3. 依据同意列筛出候选行，未同意或缺少同意的数据进入隔离。</w:t>
       </w:r>
     </w:p>
     <w:p>
@@ -1403,7 +1403,7 @@
           <w:color w:val="1F1F1F"/>
           <w:sz w:val="21"/>
         </w:rPr>
-        <w:t>4. 错误对应的行进入 quarantine，没有错误的行进入 approved。</w:t>
+        <w:t>4. 在候选行内按所有准标识符组合计算等价类，低于 k 的记录不得发布。</w:t>
       </w:r>
     </w:p>
     <w:p>
@@ -1418,7 +1418,7 @@
           <w:color w:val="1F1F1F"/>
           <w:sz w:val="21"/>
         </w:rPr>
-        <w:t>5. 只对 approved 执行配置的字段替换脱敏。</w:t>
+        <w:t>5. 对获准行执行 Keep、ReplaceUtf8 或 Drop，并默认删除未声明字段。</w:t>
       </w:r>
     </w:p>
     <w:p>
@@ -1433,7 +1433,7 @@
           <w:color w:val="1F1F1F"/>
           <w:sz w:val="21"/>
         </w:rPr>
-        <w:t>6. 把诊断转换为包含六个字段的 Arrow RecordBatch。</w:t>
+        <w:t>6. 输出获准、隔离、隐私发现和单行发布清单，供下游与审计共同使用。</w:t>
       </w:r>
     </w:p>
     <w:p>
@@ -1448,7 +1448,7 @@
           <w:color w:val="1F1F1F"/>
           <w:sz w:val="21"/>
         </w:rPr>
-        <w:t>findings 的字段为 rule_id、severity、row、column、code 和 message。row 为空表示缺失列或类型不符等数据集级问题。诊断文本只描述规则和字段，不包含原始敏感值。</w:t>
+        <w:t>策略采用 fail-closed 设计：直接标识符或敏感字段不能以 Keep 发布；准标识符必须保留并参与 k 匿名；缺失关键列、字段类型错误或请求与策略不匹配均阻断发布。发现明细可以截断，但拒绝计数保持准确。</w:t>
       </w:r>
     </w:p>
     <w:p>
@@ -1461,10 +1461,10 @@
         <w:rPr>
           <w:rFonts w:ascii="Microsoft YaHei" w:hAnsi="Microsoft YaHei" w:eastAsia="Microsoft YaHei"/>
           <w:b/>
-          <w:color w:val="17365D"/>
+          <w:color w:val="000000"/>
           <w:sz w:val="29"/>
         </w:rPr>
-        <w:t>五 示例结果</w:t>
+        <w:t>五 可运行演示</w:t>
       </w:r>
     </w:p>
     <w:p>
@@ -1479,11 +1479,12 @@
           <w:color w:val="1F1F1F"/>
           <w:sz w:val="21"/>
         </w:rPr>
-        <w:t>仓库演示构造 4 行客户导出数据，并检查客户编号唯一性、年龄范围、国家允许列表、订单上下界和邮件完整性。运行结果如下。</w:t>
+        <w:t>仓库演示申请把客户风控样本交给合作方，用途为 fraud_research。六行输入中四行满足同意与 k=2，两个不满足的记录被隔离，邮件字段替换为 [EMAIL]，未申报字段不会进入获准批次。</w:t>
       </w:r>
     </w:p>
     <w:p>
       <w:pPr>
+        <w:keepLines/>
         <w:spacing w:before="60" w:after="120" w:line="259" w:lineRule="auto"/>
         <w:ind w:left="403"/>
         <w:shd w:fill="F2F4F7"/>
@@ -1495,7 +1496,7 @@
           <w:color w:val="202124"/>
           <w:sz w:val="17"/>
         </w:rPr>
-        <w:t>customer-export-v1: FAIL; rows=4; accepted=1; quarantined=3;</w:t>
+        <w:t>fraud-research-v1/req-2026-001: partial; purpose=fraud_research;</w:t>
         <w:br/>
       </w:r>
       <w:r>
@@ -1505,7 +1506,7 @@
           <w:color w:val="202124"/>
           <w:sz w:val="17"/>
         </w:rPr>
-        <w:t>errors=7; warnings=1; findings_shown=8; truncated=false</w:t>
+        <w:t>recipient=partner; rows=6; released=4; quarantined=2; denials=2; k=2</w:t>
         <w:br/>
       </w:r>
       <w:r>
@@ -1515,7 +1516,7 @@
           <w:color w:val="202124"/>
           <w:sz w:val="17"/>
         </w:rPr>
-        <w:t>approved rows: 1</w:t>
+        <w:t>released columns: email, country, age_band, risk_score</w:t>
         <w:br/>
       </w:r>
       <w:r>
@@ -1525,7 +1526,7 @@
           <w:color w:val="202124"/>
           <w:sz w:val="17"/>
         </w:rPr>
-        <w:t>quarantined rows: 3</w:t>
+        <w:t>approved rows: 4    quarantined rows: 2    privacy findings: 2</w:t>
         <w:br/>
       </w:r>
       <w:r>
@@ -1535,7 +1536,7 @@
           <w:color w:val="202124"/>
           <w:sz w:val="17"/>
         </w:rPr>
-        <w:t>diagnostic rows: 8</w:t>
+        <w:t>release manifest rows: 1    masked email: [EMAIL]</w:t>
         <w:br/>
       </w:r>
       <w:r>
@@ -1545,26 +1546,17 @@
           <w:color w:val="202124"/>
           <w:sz w:val="17"/>
         </w:rPr>
-        <w:t>approved email: [REDACTED]</w:t>
+        <w:t>Arrow IPC handoff: 1136 bytes, 4 released rows</w:t>
         <w:br/>
       </w:r>
     </w:p>
     <w:p>
       <w:pPr>
+        <w:keepLines/>
         <w:spacing w:before="60" w:after="120" w:line="259" w:lineRule="auto"/>
         <w:ind w:left="403"/>
         <w:shd w:fill="F2F4F7"/>
       </w:pPr>
-      <w:r>
-        <w:rPr>
-          <w:rFonts w:ascii="Consolas" w:hAnsi="Consolas" w:eastAsia="Consolas"/>
-          <w:b w:val="0"/>
-          <w:color w:val="202124"/>
-          <w:sz w:val="17"/>
-        </w:rPr>
-        <w:t>moon update</w:t>
-        <w:br/>
-      </w:r>
       <w:r>
         <w:rPr>
           <w:rFonts w:ascii="Consolas" w:hAnsi="Consolas" w:eastAsia="Consolas"/>
@@ -1616,10 +1608,10 @@
         <w:rPr>
           <w:rFonts w:ascii="Microsoft YaHei" w:hAnsi="Microsoft YaHei" w:eastAsia="Microsoft YaHei"/>
           <w:b/>
-          <w:color w:val="17365D"/>
+          <w:color w:val="000000"/>
           <w:sz w:val="29"/>
         </w:rPr>
-        <w:t>六 差异化核查</w:t>
+        <w:t>六 与 MoonVerity 的差异</w:t>
       </w:r>
     </w:p>
     <w:tbl>
@@ -1629,12 +1621,12 @@
         <w:tblLayout w:type="fixed"/>
         <w:tblLook w:firstColumn="1" w:firstRow="1" w:lastColumn="0" w:lastRow="0" w:noHBand="0" w:noVBand="1" w:val="04A0"/>
         <w:tblBorders>
-          <w:top w:val="single" w:sz="6" w:space="0" w:color="D6DEE6"/>
-          <w:left w:val="single" w:sz="6" w:space="0" w:color="D6DEE6"/>
-          <w:bottom w:val="single" w:sz="6" w:space="0" w:color="D6DEE6"/>
-          <w:right w:val="single" w:sz="6" w:space="0" w:color="D6DEE6"/>
-          <w:insideH w:val="single" w:sz="6" w:space="0" w:color="D6DEE6"/>
-          <w:insideV w:val="single" w:sz="6" w:space="0" w:color="D6DEE6"/>
+          <w:top w:val="single" w:sz="6" w:space="0" w:color="D9D9D9"/>
+          <w:left w:val="single" w:sz="6" w:space="0" w:color="D9D9D9"/>
+          <w:bottom w:val="single" w:sz="6" w:space="0" w:color="D9D9D9"/>
+          <w:right w:val="single" w:sz="6" w:space="0" w:color="D9D9D9"/>
+          <w:insideH w:val="single" w:sz="6" w:space="0" w:color="D9D9D9"/>
+          <w:insideV w:val="single" w:sz="6" w:space="0" w:color="D9D9D9"/>
         </w:tblBorders>
       </w:tblPr>
       <w:tblGrid>
@@ -1649,7 +1641,7 @@
         </w:trPr>
         <w:tc>
           <w:tcPr>
-            <w:tcW w:type="dxa" w:w="2088"/>
+            <w:tcW w:type="dxa" w:w="1728"/>
             <w:shd w:fill="17365D"/>
             <w:vAlign w:val="center"/>
             <w:tcMar>
@@ -1671,13 +1663,13 @@
                 <w:color w:val="FFFFFF"/>
                 <w:sz w:val="19"/>
               </w:rPr>
-              <w:t>对比项目</w:t>
+              <w:t>维度</w:t>
             </w:r>
           </w:p>
         </w:tc>
         <w:tc>
           <w:tcPr>
-            <w:tcW w:type="dxa" w:w="3960"/>
+            <w:tcW w:type="dxa" w:w="4104"/>
             <w:shd w:fill="17365D"/>
             <w:vAlign w:val="center"/>
             <w:tcMar>
@@ -1699,13 +1691,13 @@
                 <w:color w:val="FFFFFF"/>
                 <w:sz w:val="19"/>
               </w:rPr>
-              <w:t>已有职责</w:t>
+              <w:t>MoonVerity</w:t>
             </w:r>
           </w:p>
         </w:tc>
         <w:tc>
           <w:tcPr>
-            <w:tcW w:type="dxa" w:w="3960"/>
+            <w:tcW w:type="dxa" w:w="4104"/>
             <w:shd w:fill="17365D"/>
             <w:vAlign w:val="center"/>
             <w:tcMar>
@@ -1727,7 +1719,7 @@
                 <w:color w:val="FFFFFF"/>
                 <w:sz w:val="19"/>
               </w:rPr>
-              <w:t>MoonSentinel 的职责</w:t>
+              <w:t>MoonSentinel</w:t>
             </w:r>
           </w:p>
         </w:tc>
@@ -1738,7 +1730,7 @@
         </w:trPr>
         <w:tc>
           <w:tcPr>
-            <w:tcW w:type="dxa" w:w="2088"/>
+            <w:tcW w:type="dxa" w:w="1728"/>
             <w:vAlign w:val="center"/>
             <w:tcMar>
               <w:top w:w="90" w:type="dxa"/>
@@ -1759,13 +1751,13 @@
                 <w:color w:val="1F1F1F"/>
                 <w:sz w:val="19"/>
               </w:rPr>
-              <w:t>shunge/arrow</w:t>
+              <w:t>核心问题</w:t>
             </w:r>
           </w:p>
         </w:tc>
         <w:tc>
           <w:tcPr>
-            <w:tcW w:type="dxa" w:w="3960"/>
+            <w:tcW w:type="dxa" w:w="4104"/>
             <w:vAlign w:val="center"/>
             <w:tcMar>
               <w:top w:w="90" w:type="dxa"/>
@@ -1786,13 +1778,13 @@
                 <w:color w:val="1F1F1F"/>
                 <w:sz w:val="19"/>
               </w:rPr>
-              <w:t>Arrow 数据结构、IPC 和互操作</w:t>
+              <w:t>数据是否满足合同和质量规则</w:t>
             </w:r>
           </w:p>
         </w:tc>
         <w:tc>
           <w:tcPr>
-            <w:tcW w:type="dxa" w:w="3960"/>
+            <w:tcW w:type="dxa" w:w="4104"/>
             <w:vAlign w:val="center"/>
             <w:tcMar>
               <w:top w:w="90" w:type="dxa"/>
@@ -1813,7 +1805,7 @@
                 <w:color w:val="1F1F1F"/>
                 <w:sz w:val="19"/>
               </w:rPr>
-              <w:t>使用 RecordBatch；执行判定、隔离、诊断和脱敏</w:t>
+              <w:t>数据能否因指定用途交给指定接收方</w:t>
             </w:r>
           </w:p>
         </w:tc>
@@ -1824,7 +1816,7 @@
         </w:trPr>
         <w:tc>
           <w:tcPr>
-            <w:tcW w:type="dxa" w:w="2088"/>
+            <w:tcW w:type="dxa" w:w="1728"/>
             <w:shd w:fill="F4F7FA"/>
             <w:vAlign w:val="center"/>
             <w:tcMar>
@@ -1846,13 +1838,13 @@
                 <w:color w:val="1F1F1F"/>
                 <w:sz w:val="19"/>
               </w:rPr>
-              <w:t>MoonFrame</w:t>
+              <w:t>输入</w:t>
             </w:r>
           </w:p>
         </w:tc>
         <w:tc>
           <w:tcPr>
-            <w:tcW w:type="dxa" w:w="3960"/>
+            <w:tcW w:type="dxa" w:w="4104"/>
             <w:shd w:fill="F4F7FA"/>
             <w:vAlign w:val="center"/>
             <w:tcMar>
@@ -1874,13 +1866,13 @@
                 <w:color w:val="1F1F1F"/>
                 <w:sz w:val="19"/>
               </w:rPr>
-              <w:t>DataFrame、表达式、过滤、排序、分组、连接和惰性查询</w:t>
+              <w:t>CSV/JSONL 与数据合同</w:t>
             </w:r>
           </w:p>
         </w:tc>
         <w:tc>
           <w:tcPr>
-            <w:tcW w:type="dxa" w:w="3960"/>
+            <w:tcW w:type="dxa" w:w="4104"/>
             <w:shd w:fill="F4F7FA"/>
             <w:vAlign w:val="center"/>
             <w:tcMar>
@@ -1902,7 +1894,7 @@
                 <w:color w:val="1F1F1F"/>
                 <w:sz w:val="19"/>
               </w:rPr>
-              <w:t>不做查询；处理质量和发布处置</w:t>
+              <w:t>Arrow RecordBatch、隐私策略与发布请求</w:t>
             </w:r>
           </w:p>
         </w:tc>
@@ -1913,7 +1905,7 @@
         </w:trPr>
         <w:tc>
           <w:tcPr>
-            <w:tcW w:type="dxa" w:w="2088"/>
+            <w:tcW w:type="dxa" w:w="1728"/>
             <w:vAlign w:val="center"/>
             <w:tcMar>
               <w:top w:w="90" w:type="dxa"/>
@@ -1934,13 +1926,13 @@
                 <w:color w:val="1F1F1F"/>
                 <w:sz w:val="19"/>
               </w:rPr>
-              <w:t>moon-data-contract</w:t>
+              <w:t>主要能力</w:t>
             </w:r>
           </w:p>
         </w:tc>
         <w:tc>
           <w:tcPr>
-            <w:tcW w:type="dxa" w:w="3960"/>
+            <w:tcW w:type="dxa" w:w="4104"/>
             <w:vAlign w:val="center"/>
             <w:tcMar>
               <w:top w:w="90" w:type="dxa"/>
@@ -1961,13 +1953,13 @@
                 <w:color w:val="1F1F1F"/>
                 <w:sz w:val="19"/>
               </w:rPr>
-              <w:t>Schema 治理、版本演进、兼容性和迁移</w:t>
+              <w:t>Required、类型、范围、枚举、唯一、画像、质量评分、合同差异</w:t>
             </w:r>
           </w:p>
         </w:tc>
         <w:tc>
           <w:tcPr>
-            <w:tcW w:type="dxa" w:w="3960"/>
+            <w:tcW w:type="dxa" w:w="4104"/>
             <w:vAlign w:val="center"/>
             <w:tcMar>
               <w:top w:w="90" w:type="dxa"/>
@@ -1988,7 +1980,7 @@
                 <w:color w:val="1F1F1F"/>
                 <w:sz w:val="19"/>
               </w:rPr>
-              <w:t>不管理版本；检查实际行并拆分批次</w:t>
+              <w:t>用途/接收方授权、逐行同意、k 匿名、字段最小化、敏感处理</w:t>
             </w:r>
           </w:p>
         </w:tc>
@@ -1999,7 +1991,7 @@
         </w:trPr>
         <w:tc>
           <w:tcPr>
-            <w:tcW w:type="dxa" w:w="2088"/>
+            <w:tcW w:type="dxa" w:w="1728"/>
             <w:shd w:fill="F4F7FA"/>
             <w:vAlign w:val="center"/>
             <w:tcMar>
@@ -2021,13 +2013,13 @@
                 <w:color w:val="1F1F1F"/>
                 <w:sz w:val="19"/>
               </w:rPr>
-              <w:t>moonbit-jsonschema</w:t>
+              <w:t>处置结果</w:t>
             </w:r>
           </w:p>
         </w:tc>
         <w:tc>
           <w:tcPr>
-            <w:tcW w:type="dxa" w:w="3960"/>
+            <w:tcW w:type="dxa" w:w="4104"/>
             <w:shd w:fill="F4F7FA"/>
             <w:vAlign w:val="center"/>
             <w:tcMar>
@@ -2049,13 +2041,13 @@
                 <w:color w:val="1F1F1F"/>
                 <w:sz w:val="19"/>
               </w:rPr>
-              <w:t>按 JSON Schema 验证 JSON</w:t>
+              <w:t>文本或 JSON 质量报告</w:t>
             </w:r>
           </w:p>
         </w:tc>
         <w:tc>
           <w:tcPr>
-            <w:tcW w:type="dxa" w:w="3960"/>
+            <w:tcW w:type="dxa" w:w="4104"/>
             <w:shd w:fill="F4F7FA"/>
             <w:vAlign w:val="center"/>
             <w:tcMar>
@@ -2077,7 +2069,7 @@
                 <w:color w:val="1F1F1F"/>
                 <w:sz w:val="19"/>
               </w:rPr>
-              <w:t>不处理 JSON Schema；面向 Arrow 列</w:t>
+              <w:t>获准、隔离、隐私发现、发布清单四类 Arrow 批次</w:t>
             </w:r>
           </w:p>
         </w:tc>
@@ -2088,7 +2080,7 @@
         </w:trPr>
         <w:tc>
           <w:tcPr>
-            <w:tcW w:type="dxa" w:w="2088"/>
+            <w:tcW w:type="dxa" w:w="1728"/>
             <w:vAlign w:val="center"/>
             <w:tcMar>
               <w:top w:w="90" w:type="dxa"/>
@@ -2109,13 +2101,13 @@
                 <w:color w:val="1F1F1F"/>
                 <w:sz w:val="19"/>
               </w:rPr>
-              <w:t>MoonJQ</w:t>
+              <w:t>决策粒度</w:t>
             </w:r>
           </w:p>
         </w:tc>
         <w:tc>
           <w:tcPr>
-            <w:tcW w:type="dxa" w:w="3960"/>
+            <w:tcW w:type="dxa" w:w="4104"/>
             <w:vAlign w:val="center"/>
             <w:tcMar>
               <w:top w:w="90" w:type="dxa"/>
@@ -2136,13 +2128,13 @@
                 <w:color w:val="1F1F1F"/>
                 <w:sz w:val="19"/>
               </w:rPr>
-              <w:t>JSON 查询语言和解释执行</w:t>
+              <w:t>字段与行的质量合格性</w:t>
             </w:r>
           </w:p>
         </w:tc>
         <w:tc>
           <w:tcPr>
-            <w:tcW w:type="dxa" w:w="3960"/>
+            <w:tcW w:type="dxa" w:w="4104"/>
             <w:vAlign w:val="center"/>
             <w:tcMar>
               <w:top w:w="90" w:type="dxa"/>
@@ -2163,7 +2155,96 @@
                 <w:color w:val="1F1F1F"/>
                 <w:sz w:val="19"/>
               </w:rPr>
-              <w:t>没有查询语言；输出 Arrow 诊断</w:t>
+              <w:t>请求级授权与记录级隐私资格</w:t>
+            </w:r>
+          </w:p>
+        </w:tc>
+      </w:tr>
+      <w:tr>
+        <w:trPr>
+          <w:cantSplit w:val="true"/>
+        </w:trPr>
+        <w:tc>
+          <w:tcPr>
+            <w:tcW w:type="dxa" w:w="1728"/>
+            <w:shd w:fill="F4F7FA"/>
+            <w:vAlign w:val="center"/>
+            <w:tcMar>
+              <w:top w:w="90" w:type="dxa"/>
+              <w:start w:w="110" w:type="dxa"/>
+              <w:bottom w:w="90" w:type="dxa"/>
+              <w:end w:w="110" w:type="dxa"/>
+            </w:tcMar>
+          </w:tcPr>
+          <w:p>
+            <w:pPr>
+              <w:spacing w:before="0" w:after="0" w:line="269" w:lineRule="auto"/>
+              <w:jc w:val="left"/>
+            </w:pPr>
+            <w:r>
+              <w:rPr>
+                <w:rFonts w:ascii="Microsoft YaHei" w:hAnsi="Microsoft YaHei" w:eastAsia="Microsoft YaHei"/>
+                <w:b w:val="0"/>
+                <w:color w:val="1F1F1F"/>
+                <w:sz w:val="19"/>
+              </w:rPr>
+              <w:t>明确不做</w:t>
+            </w:r>
+          </w:p>
+        </w:tc>
+        <w:tc>
+          <w:tcPr>
+            <w:tcW w:type="dxa" w:w="4104"/>
+            <w:shd w:fill="F4F7FA"/>
+            <w:vAlign w:val="center"/>
+            <w:tcMar>
+              <w:top w:w="90" w:type="dxa"/>
+              <w:start w:w="110" w:type="dxa"/>
+              <w:bottom w:w="90" w:type="dxa"/>
+              <w:end w:w="110" w:type="dxa"/>
+            </w:tcMar>
+          </w:tcPr>
+          <w:p>
+            <w:pPr>
+              <w:spacing w:before="0" w:after="0" w:line="269" w:lineRule="auto"/>
+              <w:jc w:val="left"/>
+            </w:pPr>
+            <w:r>
+              <w:rPr>
+                <w:rFonts w:ascii="Microsoft YaHei" w:hAnsi="Microsoft YaHei" w:eastAsia="Microsoft YaHei"/>
+                <w:b w:val="0"/>
+                <w:color w:val="1F1F1F"/>
+                <w:sz w:val="19"/>
+              </w:rPr>
+              <w:t>—</w:t>
+            </w:r>
+          </w:p>
+        </w:tc>
+        <w:tc>
+          <w:tcPr>
+            <w:tcW w:type="dxa" w:w="4104"/>
+            <w:shd w:fill="F4F7FA"/>
+            <w:vAlign w:val="center"/>
+            <w:tcMar>
+              <w:top w:w="90" w:type="dxa"/>
+              <w:start w:w="110" w:type="dxa"/>
+              <w:bottom w:w="90" w:type="dxa"/>
+              <w:end w:w="110" w:type="dxa"/>
+            </w:tcMar>
+          </w:tcPr>
+          <w:p>
+            <w:pPr>
+              <w:spacing w:before="0" w:after="0" w:line="269" w:lineRule="auto"/>
+              <w:jc w:val="left"/>
+            </w:pPr>
+            <w:r>
+              <w:rPr>
+                <w:rFonts w:ascii="Microsoft YaHei" w:hAnsi="Microsoft YaHei" w:eastAsia="Microsoft YaHei"/>
+                <w:b w:val="0"/>
+                <w:color w:val="1F1F1F"/>
+                <w:sz w:val="19"/>
+              </w:rPr>
+              <w:t>通用质量合同、Profile、Contract Diff、CSV/JSONL CLI</w:t>
             </w:r>
           </w:p>
         </w:tc>
@@ -2186,7 +2267,7 @@
           <w:color w:val="1F1F1F"/>
           <w:sz w:val="21"/>
         </w:rPr>
-        <w:t>初版 MoonQuery 曾实现过滤、排序、分组、连接和逻辑计划。核查 MoonFrame 后确认该方向重合度过高，因此当前代码树已经移除整个查询包，转为运行时发布门禁。Git 历史完整保留这次调整。</w:t>
+        <w:t>本次核查逐项阅读了 Wchwch777/MoonVerity 的 README、申报书、架构文档以及 core/quality.mbt、core/validation.mbt、core/profile.mbt、core/diff.mbt 和 CLI。MoonSentinel 已删除与其重叠的通用质量规则模型，并用新的 PrivacyPolicy、ReleaseRequest、ConsentRequirement、DataClass、Treatment 和 ReleaseBundle 构成公开 API。</w:t>
       </w:r>
     </w:p>
     <w:p>
@@ -2201,7 +2282,7 @@
           <w:color w:val="1F1F1F"/>
           <w:sz w:val="21"/>
         </w:rPr>
-        <w:t>公开核查来源包括 github.com/ihb2032/MoonFrame、mooncakes.io/docs/shunge/arrow@0.1.0、mooncakes.io/docs/lyjttio/moon-data-contract@0.2.1、mooncakes.io/docs/Xu107-hhh/moonbit-jsonschema 和 github.com/moonbit-community/moonbit-jq。</w:t>
+        <w:t>对 GitHub 公开仓库进一步检索 MoonBit privacy gate、anonymization 和 k-anonymity，未发现与当前组合相同的 MoonBit 实现。该结论基于截至 2026 年 9 月 20 日可检索到的公开内容；后续新增项目仍将按同一清单复核。</w:t>
       </w:r>
     </w:p>
     <w:p>
@@ -2214,10 +2295,10 @@
         <w:rPr>
           <w:rFonts w:ascii="Microsoft YaHei" w:hAnsi="Microsoft YaHei" w:eastAsia="Microsoft YaHei"/>
           <w:b/>
-          <w:color w:val="17365D"/>
+          <w:color w:val="000000"/>
           <w:sz w:val="29"/>
         </w:rPr>
-        <w:t>七 创新和应用特点</w:t>
+        <w:t>七 创新点和应用价值</w:t>
       </w:r>
     </w:p>
     <w:p>
@@ -2232,7 +2313,7 @@
           <w:color w:val="1F1F1F"/>
           <w:sz w:val="21"/>
         </w:rPr>
-        <w:t>1. 获准数据、隔离数据和诊断数据使用同一种 Arrow 交换格式。</w:t>
+        <w:t>1. 把用途和接收方作为运行时发布请求的一部分，而非只做静态 Schema 检查。</w:t>
       </w:r>
     </w:p>
     <w:p>
@@ -2247,7 +2328,7 @@
           <w:color w:val="1F1F1F"/>
           <w:sz w:val="21"/>
         </w:rPr>
-        <w:t>2. 质量判定与行处置在一次调用中完成，调用方无需根据错误列表再次筛行。</w:t>
+        <w:t>2. 同意资格先于 k 匿名计算，避免未授权记录虚增等价类并造成错误放行。</w:t>
       </w:r>
     </w:p>
     <w:p>
@@ -2262,7 +2343,7 @@
           <w:color w:val="1F1F1F"/>
           <w:sz w:val="21"/>
         </w:rPr>
-        <w:t>3. 诊断明细有明确上限，但统计和隔离结果不丢失。</w:t>
+        <w:t>3. 数据分类和处理方式在策略校验阶段强绑定，敏感原值不能误配置为直接发布。</w:t>
       </w:r>
     </w:p>
     <w:p>
@@ -2277,7 +2358,7 @@
           <w:color w:val="1F1F1F"/>
           <w:sz w:val="21"/>
         </w:rPr>
-        <w:t>4. 脱敏只作用于获准数据，防止敏感数据进入下游，同时保留隔离数据的排错价值。</w:t>
+        <w:t>4. 默认不发布未声明字段，以数据最小化代替事后依赖人工删列。</w:t>
       </w:r>
     </w:p>
     <w:p>
@@ -2292,7 +2373,7 @@
           <w:color w:val="1F1F1F"/>
           <w:sz w:val="21"/>
         </w:rPr>
-        <w:t>5. 数据集级错误和行级错误使用同一报告模型，可统一存档和展示。</w:t>
+        <w:t>5. 发布数据与审计证据均为 Arrow，便于 Wasm、浏览器和分析管道直接交接。</w:t>
       </w:r>
     </w:p>
     <w:p>
@@ -2305,7 +2386,7 @@
         <w:rPr>
           <w:rFonts w:ascii="Microsoft YaHei" w:hAnsi="Microsoft YaHei" w:eastAsia="Microsoft YaHei"/>
           <w:b/>
-          <w:color w:val="17365D"/>
+          <w:color w:val="000000"/>
           <w:sz w:val="29"/>
         </w:rPr>
         <w:t>八 原创和依赖边界</w:t>
@@ -2323,7 +2404,7 @@
           <w:color w:val="1F1F1F"/>
           <w:sz w:val="21"/>
         </w:rPr>
-        <w:t>本仓库实现合同校验、规则执行、严重度语义、诊断上限、行隔离、脱敏策略、Arrow 诊断输出、测试和演示。Arrow Schema、Column、RecordBatch 及 IPC 编解码来自公开依赖 shunge/arrow，不作为本项目原创成果申报。</w:t>
+        <w:t>本仓库原创实现隐私策略校验、请求授权、逐行同意、候选集内 k 匿名、数据最小化、字段处理、拒绝原因和发布清单。Arrow Schema、Column、RecordBatch 及 IPC 编解码来自公开依赖 shunge/arrow@0.1.0，不作为原创成果申报。</w:t>
       </w:r>
     </w:p>
     <w:p>
@@ -2338,7 +2419,7 @@
           <w:color w:val="1F1F1F"/>
           <w:sz w:val="21"/>
         </w:rPr>
-        <w:t>当前生产代码仅位于 src/gate，没有 DataFrame、查询计划、IPC、FlatBuffers、位图、JSON Schema 或 Schema 迁移实现。旧版探索代码只存在于 Git 历史，不属于当前交付物。</w:t>
+        <w:t>当前生产包只公开 PrivacyPolicy、ReleaseRequest、ConsentRequirement、DataClass、Treatment、PrivacyReport 和 ReleaseBundle 等隐私发布类型，不再公开 Contract、Rule、Severity、ValidationReport 或通用质量评分接口。</w:t>
       </w:r>
     </w:p>
     <w:p>
@@ -2351,10 +2432,10 @@
         <w:rPr>
           <w:rFonts w:ascii="Microsoft YaHei" w:hAnsi="Microsoft YaHei" w:eastAsia="Microsoft YaHei"/>
           <w:b/>
-          <w:color w:val="17365D"/>
+          <w:color w:val="000000"/>
           <w:sz w:val="29"/>
         </w:rPr>
-        <w:t>九 当前限制</w:t>
+        <w:t>九 当前限制和路线</w:t>
       </w:r>
     </w:p>
     <w:p>
@@ -2370,7 +2451,7 @@
           <w:color w:val="1F1F1F"/>
           <w:sz w:val="21"/>
         </w:rPr>
-        <w:t>规则面向单个 RecordBatch，尚未提供跨批次唯一性和时间窗口状态。</w:t>
+        <w:t>当前 k 匿名作用于单个 RecordBatch，尚未支持跨批次累计。</w:t>
       </w:r>
     </w:p>
     <w:p>
@@ -2386,7 +2467,7 @@
           <w:color w:val="1F1F1F"/>
           <w:sz w:val="21"/>
         </w:rPr>
-        <w:t>Utf8Unique 使用确定性双循环，适合 MVP 和中小批次，尚未进行哈希优化。</w:t>
+        <w:t>当前敏感字段处理为固定字符串替换或删除，尚未接入密钥化假名服务。</w:t>
       </w:r>
     </w:p>
     <w:p>
@@ -2402,7 +2483,7 @@
           <w:color w:val="1F1F1F"/>
           <w:sz w:val="21"/>
         </w:rPr>
-        <w:t>字符串规则尚未提供正则表达式和长度范围。</w:t>
+        <w:t>当前等价类实现优先保证确定性与可审计性，超大批次仍需哈希索引和基准优化。</w:t>
       </w:r>
     </w:p>
     <w:p>
@@ -2418,7 +2499,7 @@
           <w:color w:val="1F1F1F"/>
           <w:sz w:val="21"/>
         </w:rPr>
-        <w:t>脱敏目前是固定字符串替换，尚未提供哈希、部分保留或外部密钥服务。</w:t>
+        <w:t>下一阶段计划增加 l-diversity、策略版本签名和可验证发布清单。</w:t>
       </w:r>
     </w:p>
     <w:p>
@@ -2434,7 +2515,7 @@
           <w:color w:val="1F1F1F"/>
           <w:sz w:val="21"/>
         </w:rPr>
-        <w:t>输入输出格式由 shunge/arrow@0.1.0 的类型和 IPC 支持范围决定。</w:t>
+        <w:t>项目不是法律合规意见；实际部署仍需由数据责任人结合地区法规配置策略。</w:t>
       </w:r>
     </w:p>
     <w:p>
@@ -2447,101 +2528,10 @@
         <w:rPr>
           <w:rFonts w:ascii="Microsoft YaHei" w:hAnsi="Microsoft YaHei" w:eastAsia="Microsoft YaHei"/>
           <w:b/>
-          <w:color w:val="17365D"/>
+          <w:color w:val="000000"/>
           <w:sz w:val="29"/>
         </w:rPr>
-        <w:t>十 后续路线</w:t>
-      </w:r>
-    </w:p>
-    <w:p>
-      <w:pPr>
-        <w:spacing w:after="80" w:line="298" w:lineRule="auto"/>
-        <w:ind w:left="432" w:hanging="288"/>
-      </w:pPr>
-      <w:r>
-        <w:rPr>
-          <w:rFonts w:ascii="Microsoft YaHei" w:hAnsi="Microsoft YaHei" w:eastAsia="Microsoft YaHei"/>
-          <w:b w:val="0"/>
-          <w:color w:val="1F1F1F"/>
-          <w:sz w:val="21"/>
-        </w:rPr>
-        <w:t>1. 增加字符串长度、模式、数值集合和条件规则。</w:t>
-      </w:r>
-    </w:p>
-    <w:p>
-      <w:pPr>
-        <w:spacing w:after="80" w:line="298" w:lineRule="auto"/>
-        <w:ind w:left="432" w:hanging="288"/>
-      </w:pPr>
-      <w:r>
-        <w:rPr>
-          <w:rFonts w:ascii="Microsoft YaHei" w:hAnsi="Microsoft YaHei" w:eastAsia="Microsoft YaHei"/>
-          <w:b w:val="0"/>
-          <w:color w:val="1F1F1F"/>
-          <w:sz w:val="21"/>
-        </w:rPr>
-        <w:t>2. 为唯一性规则增加确定性哈希索引，并建立不同批次规模的基准。</w:t>
-      </w:r>
-    </w:p>
-    <w:p>
-      <w:pPr>
-        <w:spacing w:after="80" w:line="298" w:lineRule="auto"/>
-        <w:ind w:left="432" w:hanging="288"/>
-      </w:pPr>
-      <w:r>
-        <w:rPr>
-          <w:rFonts w:ascii="Microsoft YaHei" w:hAnsi="Microsoft YaHei" w:eastAsia="Microsoft YaHei"/>
-          <w:b w:val="0"/>
-          <w:color w:val="1F1F1F"/>
-          <w:sz w:val="21"/>
-        </w:rPr>
-        <w:t>3. 增加电子邮件和手机号等可组合脱敏策略，同时避免在诊断文本中泄露原值。</w:t>
-      </w:r>
-    </w:p>
-    <w:p>
-      <w:pPr>
-        <w:spacing w:after="80" w:line="298" w:lineRule="auto"/>
-        <w:ind w:left="432" w:hanging="288"/>
-      </w:pPr>
-      <w:r>
-        <w:rPr>
-          <w:rFonts w:ascii="Microsoft YaHei" w:hAnsi="Microsoft YaHei" w:eastAsia="Microsoft YaHei"/>
-          <w:b w:val="0"/>
-          <w:color w:val="1F1F1F"/>
-          <w:sz w:val="21"/>
-        </w:rPr>
-        <w:t>4. 支持多批次审计汇总和可配置的失败阈值。</w:t>
-      </w:r>
-    </w:p>
-    <w:p>
-      <w:pPr>
-        <w:spacing w:after="80" w:line="298" w:lineRule="auto"/>
-        <w:ind w:left="432" w:hanging="288"/>
-      </w:pPr>
-      <w:r>
-        <w:rPr>
-          <w:rFonts w:ascii="Microsoft YaHei" w:hAnsi="Microsoft YaHei" w:eastAsia="Microsoft YaHei"/>
-          <w:b w:val="0"/>
-          <w:color w:val="1F1F1F"/>
-          <w:sz w:val="21"/>
-        </w:rPr>
-        <w:t>5. 构建浏览器演示界面，展示获准、隔离和诊断三个 Arrow 输出。</w:t>
-      </w:r>
-    </w:p>
-    <w:p>
-      <w:pPr>
-        <w:pStyle w:val="Heading1"/>
-        <w:keepNext/>
-        <w:spacing w:before="240" w:after="100"/>
-      </w:pPr>
-      <w:r>
-        <w:rPr>
-          <w:rFonts w:ascii="Microsoft YaHei" w:hAnsi="Microsoft YaHei" w:eastAsia="Microsoft YaHei"/>
-          <w:b/>
-          <w:color w:val="17365D"/>
-          <w:sz w:val="29"/>
-        </w:rPr>
-        <w:t>十一 验收标准</w:t>
+        <w:t>十 验收标准</w:t>
       </w:r>
     </w:p>
     <w:tbl>
@@ -2551,12 +2541,12 @@
         <w:tblLayout w:type="fixed"/>
         <w:tblLook w:firstColumn="1" w:firstRow="1" w:lastColumn="0" w:lastRow="0" w:noHBand="0" w:noVBand="1" w:val="04A0"/>
         <w:tblBorders>
-          <w:top w:val="single" w:sz="6" w:space="0" w:color="D6DEE6"/>
-          <w:left w:val="single" w:sz="6" w:space="0" w:color="D6DEE6"/>
-          <w:bottom w:val="single" w:sz="6" w:space="0" w:color="D6DEE6"/>
-          <w:right w:val="single" w:sz="6" w:space="0" w:color="D6DEE6"/>
-          <w:insideH w:val="single" w:sz="6" w:space="0" w:color="D6DEE6"/>
-          <w:insideV w:val="single" w:sz="6" w:space="0" w:color="D6DEE6"/>
+          <w:top w:val="single" w:sz="6" w:space="0" w:color="D9D9D9"/>
+          <w:left w:val="single" w:sz="6" w:space="0" w:color="D9D9D9"/>
+          <w:bottom w:val="single" w:sz="6" w:space="0" w:color="D9D9D9"/>
+          <w:right w:val="single" w:sz="6" w:space="0" w:color="D9D9D9"/>
+          <w:insideH w:val="single" w:sz="6" w:space="0" w:color="D9D9D9"/>
+          <w:insideV w:val="single" w:sz="6" w:space="0" w:color="D9D9D9"/>
         </w:tblBorders>
       </w:tblPr>
       <w:tblGrid>
@@ -2708,7 +2698,7 @@
                 <w:color w:val="1F1F1F"/>
                 <w:sz w:val="19"/>
               </w:rPr>
-              <w:t>工具链检查</w:t>
+              <w:t>差异化接口</w:t>
             </w:r>
           </w:p>
         </w:tc>
@@ -2735,7 +2725,7 @@
                 <w:color w:val="1F1F1F"/>
                 <w:sz w:val="19"/>
               </w:rPr>
-              <w:t>moon fmt --check 和严格编译均通过</w:t>
+              <w:t>公开 API 不含通用质量合同、质量评分、画像或合同差异</w:t>
             </w:r>
           </w:p>
         </w:tc>
@@ -2796,7 +2786,7 @@
                 <w:color w:val="1F1F1F"/>
                 <w:sz w:val="19"/>
               </w:rPr>
-              <w:t>全目标测试</w:t>
+              <w:t>完整授权链</w:t>
             </w:r>
           </w:p>
         </w:tc>
@@ -2824,7 +2814,7 @@
                 <w:color w:val="1F1F1F"/>
                 <w:sz w:val="19"/>
               </w:rPr>
-              <w:t>7 项测试在四后端全部通过</w:t>
+              <w:t>用途、接收方、同意、k 匿名和最小化均参与结果</w:t>
             </w:r>
           </w:p>
         </w:tc>
@@ -2883,7 +2873,7 @@
                 <w:color w:val="1F1F1F"/>
                 <w:sz w:val="19"/>
               </w:rPr>
-              <w:t>发布结果</w:t>
+              <w:t>隐私失败关闭</w:t>
             </w:r>
           </w:p>
         </w:tc>
@@ -2910,7 +2900,7 @@
                 <w:color w:val="1F1F1F"/>
                 <w:sz w:val="19"/>
               </w:rPr>
-              <w:t>生成 approved、quarantine 和 findings，计数准确</w:t>
+              <w:t>策略或关键列无效时不产生可发布记录</w:t>
             </w:r>
           </w:p>
         </w:tc>
@@ -2971,7 +2961,7 @@
                 <w:color w:val="1F1F1F"/>
                 <w:sz w:val="19"/>
               </w:rPr>
-              <w:t>隐私处理</w:t>
+              <w:t>全目标测试</w:t>
             </w:r>
           </w:p>
         </w:tc>
@@ -2999,7 +2989,7 @@
                 <w:color w:val="1F1F1F"/>
                 <w:sz w:val="19"/>
               </w:rPr>
-              <w:t>approved 已替换敏感字段，quarantine 保持原值</w:t>
+              <w:t>8 项测试在 Native、JavaScript、Wasm、Wasm-GC 全部通过</w:t>
             </w:r>
           </w:p>
         </w:tc>
@@ -3058,7 +3048,7 @@
                 <w:color w:val="1F1F1F"/>
                 <w:sz w:val="19"/>
               </w:rPr>
-              <w:t>IPC 交接</w:t>
+              <w:t>Arrow 交接</w:t>
             </w:r>
           </w:p>
         </w:tc>
@@ -3085,7 +3075,7 @@
                 <w:color w:val="1F1F1F"/>
                 <w:sz w:val="19"/>
               </w:rPr>
-              <w:t>findings 可写入并重新读取</w:t>
+              <w:t>隐私发现和发布清单可完成 IPC 写入与读取</w:t>
             </w:r>
           </w:p>
         </w:tc>
@@ -3146,7 +3136,7 @@
                 <w:color w:val="1F1F1F"/>
                 <w:sz w:val="19"/>
               </w:rPr>
-              <w:t>差异与材料</w:t>
+              <w:t>材料一致</w:t>
             </w:r>
           </w:p>
         </w:tc>
@@ -3174,7 +3164,7 @@
                 <w:color w:val="1F1F1F"/>
                 <w:sz w:val="19"/>
               </w:rPr>
-              <w:t>无查询或 IPC 重复实现；README、申报书和代码一致</w:t>
+              <w:t>README、申报书、差异说明、演示输出和当前代码一致</w:t>
             </w:r>
           </w:p>
         </w:tc>

</xml_diff>

<commit_message>
feat: enforce sensitive-value l-diversity
</commit_message>
<xml_diff>
--- a/docs/MoonSentinel项目申报书.docx
+++ b/docs/MoonSentinel项目申报书.docx
@@ -13,14 +13,14 @@
           <w:rFonts w:ascii="Microsoft YaHei" w:hAnsi="Microsoft YaHei" w:eastAsia="Microsoft YaHei"/>
           <w:b/>
           <w:color w:val="000000"/>
-          <w:sz w:val="44"/>
+          <w:sz w:val="41"/>
         </w:rPr>
         <w:t>MoonSentinel 项目申报书</w:t>
       </w:r>
     </w:p>
     <w:p>
       <w:pPr>
-        <w:spacing w:after="300"/>
+        <w:spacing w:after="200"/>
         <w:jc w:val="center"/>
       </w:pPr>
       <w:r>
@@ -28,7 +28,7 @@
           <w:rFonts w:ascii="Microsoft YaHei" w:hAnsi="Microsoft YaHei" w:eastAsia="Microsoft YaHei"/>
           <w:b/>
           <w:color w:val="1F1F1F"/>
-          <w:sz w:val="25"/>
+          <w:sz w:val="24"/>
         </w:rPr>
         <w:t>用途绑定的 Arrow 隐私发布门禁</w:t>
       </w:r>
@@ -59,15 +59,15 @@
             <w:shd w:fill="E8EEF5"/>
             <w:vAlign w:val="center"/>
             <w:tcMar>
-              <w:top w:w="90" w:type="dxa"/>
-              <w:start w:w="110" w:type="dxa"/>
-              <w:bottom w:w="90" w:type="dxa"/>
-              <w:end w:w="110" w:type="dxa"/>
+              <w:top w:w="42" w:type="dxa"/>
+              <w:start w:w="105" w:type="dxa"/>
+              <w:bottom w:w="42" w:type="dxa"/>
+              <w:end w:w="105" w:type="dxa"/>
             </w:tcMar>
           </w:tcPr>
           <w:p>
             <w:pPr>
-              <w:spacing w:before="0" w:after="0" w:line="269" w:lineRule="auto"/>
+              <w:spacing w:before="0" w:after="0" w:line="254" w:lineRule="auto"/>
               <w:jc w:val="center"/>
             </w:pPr>
             <w:r>
@@ -75,7 +75,7 @@
                 <w:rFonts w:ascii="Microsoft YaHei" w:hAnsi="Microsoft YaHei" w:eastAsia="Microsoft YaHei"/>
                 <w:b/>
                 <w:color w:val="1F1F1F"/>
-                <w:sz w:val="19"/>
+                <w:sz w:val="18"/>
               </w:rPr>
               <w:t>项目名称</w:t>
             </w:r>
@@ -86,15 +86,15 @@
             <w:tcW w:type="dxa" w:w="7992"/>
             <w:vAlign w:val="center"/>
             <w:tcMar>
-              <w:top w:w="90" w:type="dxa"/>
-              <w:start w:w="110" w:type="dxa"/>
-              <w:bottom w:w="90" w:type="dxa"/>
-              <w:end w:w="110" w:type="dxa"/>
+              <w:top w:w="42" w:type="dxa"/>
+              <w:start w:w="105" w:type="dxa"/>
+              <w:bottom w:w="42" w:type="dxa"/>
+              <w:end w:w="105" w:type="dxa"/>
             </w:tcMar>
           </w:tcPr>
           <w:p>
             <w:pPr>
-              <w:spacing w:before="0" w:after="0" w:line="269" w:lineRule="auto"/>
+              <w:spacing w:before="0" w:after="0" w:line="254" w:lineRule="auto"/>
               <w:jc w:val="left"/>
             </w:pPr>
             <w:r>
@@ -102,7 +102,7 @@
                 <w:rFonts w:ascii="Microsoft YaHei" w:hAnsi="Microsoft YaHei" w:eastAsia="Microsoft YaHei"/>
                 <w:b w:val="0"/>
                 <w:color w:val="1F1F1F"/>
-                <w:sz w:val="19"/>
+                <w:sz w:val="18"/>
               </w:rPr>
               <w:t>MoonSentinel</w:t>
             </w:r>
@@ -116,15 +116,15 @@
             <w:shd w:fill="E8EEF5"/>
             <w:vAlign w:val="center"/>
             <w:tcMar>
-              <w:top w:w="90" w:type="dxa"/>
-              <w:start w:w="110" w:type="dxa"/>
-              <w:bottom w:w="90" w:type="dxa"/>
-              <w:end w:w="110" w:type="dxa"/>
+              <w:top w:w="42" w:type="dxa"/>
+              <w:start w:w="105" w:type="dxa"/>
+              <w:bottom w:w="42" w:type="dxa"/>
+              <w:end w:w="105" w:type="dxa"/>
             </w:tcMar>
           </w:tcPr>
           <w:p>
             <w:pPr>
-              <w:spacing w:before="0" w:after="0" w:line="269" w:lineRule="auto"/>
+              <w:spacing w:before="0" w:after="0" w:line="254" w:lineRule="auto"/>
               <w:jc w:val="center"/>
             </w:pPr>
             <w:r>
@@ -132,7 +132,7 @@
                 <w:rFonts w:ascii="Microsoft YaHei" w:hAnsi="Microsoft YaHei" w:eastAsia="Microsoft YaHei"/>
                 <w:b/>
                 <w:color w:val="1F1F1F"/>
-                <w:sz w:val="19"/>
+                <w:sz w:val="18"/>
               </w:rPr>
               <w:t>项目负责人</w:t>
             </w:r>
@@ -143,15 +143,15 @@
             <w:tcW w:type="dxa" w:w="7992"/>
             <w:vAlign w:val="center"/>
             <w:tcMar>
-              <w:top w:w="90" w:type="dxa"/>
-              <w:start w:w="110" w:type="dxa"/>
-              <w:bottom w:w="90" w:type="dxa"/>
-              <w:end w:w="110" w:type="dxa"/>
+              <w:top w:w="42" w:type="dxa"/>
+              <w:start w:w="105" w:type="dxa"/>
+              <w:bottom w:w="42" w:type="dxa"/>
+              <w:end w:w="105" w:type="dxa"/>
             </w:tcMar>
           </w:tcPr>
           <w:p>
             <w:pPr>
-              <w:spacing w:before="0" w:after="0" w:line="269" w:lineRule="auto"/>
+              <w:spacing w:before="0" w:after="0" w:line="254" w:lineRule="auto"/>
               <w:jc w:val="left"/>
             </w:pPr>
             <w:r>
@@ -159,7 +159,7 @@
                 <w:rFonts w:ascii="Microsoft YaHei" w:hAnsi="Microsoft YaHei" w:eastAsia="Microsoft YaHei"/>
                 <w:b w:val="0"/>
                 <w:color w:val="1F1F1F"/>
-                <w:sz w:val="19"/>
+                <w:sz w:val="18"/>
               </w:rPr>
               <w:t>苏天纬</w:t>
             </w:r>
@@ -173,15 +173,15 @@
             <w:shd w:fill="E8EEF5"/>
             <w:vAlign w:val="center"/>
             <w:tcMar>
-              <w:top w:w="90" w:type="dxa"/>
-              <w:start w:w="110" w:type="dxa"/>
-              <w:bottom w:w="90" w:type="dxa"/>
-              <w:end w:w="110" w:type="dxa"/>
+              <w:top w:w="42" w:type="dxa"/>
+              <w:start w:w="105" w:type="dxa"/>
+              <w:bottom w:w="42" w:type="dxa"/>
+              <w:end w:w="105" w:type="dxa"/>
             </w:tcMar>
           </w:tcPr>
           <w:p>
             <w:pPr>
-              <w:spacing w:before="0" w:after="0" w:line="269" w:lineRule="auto"/>
+              <w:spacing w:before="0" w:after="0" w:line="254" w:lineRule="auto"/>
               <w:jc w:val="center"/>
             </w:pPr>
             <w:r>
@@ -189,7 +189,7 @@
                 <w:rFonts w:ascii="Microsoft YaHei" w:hAnsi="Microsoft YaHei" w:eastAsia="Microsoft YaHei"/>
                 <w:b/>
                 <w:color w:val="1F1F1F"/>
-                <w:sz w:val="19"/>
+                <w:sz w:val="18"/>
               </w:rPr>
               <w:t>代码仓库</w:t>
             </w:r>
@@ -200,15 +200,15 @@
             <w:tcW w:type="dxa" w:w="7992"/>
             <w:vAlign w:val="center"/>
             <w:tcMar>
-              <w:top w:w="90" w:type="dxa"/>
-              <w:start w:w="110" w:type="dxa"/>
-              <w:bottom w:w="90" w:type="dxa"/>
-              <w:end w:w="110" w:type="dxa"/>
+              <w:top w:w="42" w:type="dxa"/>
+              <w:start w:w="105" w:type="dxa"/>
+              <w:bottom w:w="42" w:type="dxa"/>
+              <w:end w:w="105" w:type="dxa"/>
             </w:tcMar>
           </w:tcPr>
           <w:p>
             <w:pPr>
-              <w:spacing w:before="0" w:after="0" w:line="269" w:lineRule="auto"/>
+              <w:spacing w:before="0" w:after="0" w:line="254" w:lineRule="auto"/>
               <w:jc w:val="left"/>
             </w:pPr>
             <w:r>
@@ -216,7 +216,7 @@
                 <w:rFonts w:ascii="Microsoft YaHei" w:hAnsi="Microsoft YaHei" w:eastAsia="Microsoft YaHei"/>
                 <w:b w:val="0"/>
                 <w:color w:val="1F1F1F"/>
-                <w:sz w:val="19"/>
+                <w:sz w:val="18"/>
               </w:rPr>
               <w:t>https://github.com/STW135-2026/moonsentinel</w:t>
             </w:r>
@@ -230,15 +230,15 @@
             <w:shd w:fill="E8EEF5"/>
             <w:vAlign w:val="center"/>
             <w:tcMar>
-              <w:top w:w="90" w:type="dxa"/>
-              <w:start w:w="110" w:type="dxa"/>
-              <w:bottom w:w="90" w:type="dxa"/>
-              <w:end w:w="110" w:type="dxa"/>
+              <w:top w:w="42" w:type="dxa"/>
+              <w:start w:w="105" w:type="dxa"/>
+              <w:bottom w:w="42" w:type="dxa"/>
+              <w:end w:w="105" w:type="dxa"/>
             </w:tcMar>
           </w:tcPr>
           <w:p>
             <w:pPr>
-              <w:spacing w:before="0" w:after="0" w:line="269" w:lineRule="auto"/>
+              <w:spacing w:before="0" w:after="0" w:line="254" w:lineRule="auto"/>
               <w:jc w:val="center"/>
             </w:pPr>
             <w:r>
@@ -246,7 +246,7 @@
                 <w:rFonts w:ascii="Microsoft YaHei" w:hAnsi="Microsoft YaHei" w:eastAsia="Microsoft YaHei"/>
                 <w:b/>
                 <w:color w:val="1F1F1F"/>
-                <w:sz w:val="19"/>
+                <w:sz w:val="18"/>
               </w:rPr>
               <w:t>开源许可证</w:t>
             </w:r>
@@ -257,15 +257,15 @@
             <w:tcW w:type="dxa" w:w="7992"/>
             <w:vAlign w:val="center"/>
             <w:tcMar>
-              <w:top w:w="90" w:type="dxa"/>
-              <w:start w:w="110" w:type="dxa"/>
-              <w:bottom w:w="90" w:type="dxa"/>
-              <w:end w:w="110" w:type="dxa"/>
+              <w:top w:w="42" w:type="dxa"/>
+              <w:start w:w="105" w:type="dxa"/>
+              <w:bottom w:w="42" w:type="dxa"/>
+              <w:end w:w="105" w:type="dxa"/>
             </w:tcMar>
           </w:tcPr>
           <w:p>
             <w:pPr>
-              <w:spacing w:before="0" w:after="0" w:line="269" w:lineRule="auto"/>
+              <w:spacing w:before="0" w:after="0" w:line="254" w:lineRule="auto"/>
               <w:jc w:val="left"/>
             </w:pPr>
             <w:r>
@@ -273,7 +273,7 @@
                 <w:rFonts w:ascii="Microsoft YaHei" w:hAnsi="Microsoft YaHei" w:eastAsia="Microsoft YaHei"/>
                 <w:b w:val="0"/>
                 <w:color w:val="1F1F1F"/>
-                <w:sz w:val="19"/>
+                <w:sz w:val="18"/>
               </w:rPr>
               <w:t>Apache-2.0</w:t>
             </w:r>
@@ -287,15 +287,15 @@
             <w:shd w:fill="E8EEF5"/>
             <w:vAlign w:val="center"/>
             <w:tcMar>
-              <w:top w:w="90" w:type="dxa"/>
-              <w:start w:w="110" w:type="dxa"/>
-              <w:bottom w:w="90" w:type="dxa"/>
-              <w:end w:w="110" w:type="dxa"/>
+              <w:top w:w="42" w:type="dxa"/>
+              <w:start w:w="105" w:type="dxa"/>
+              <w:bottom w:w="42" w:type="dxa"/>
+              <w:end w:w="105" w:type="dxa"/>
             </w:tcMar>
           </w:tcPr>
           <w:p>
             <w:pPr>
-              <w:spacing w:before="0" w:after="0" w:line="269" w:lineRule="auto"/>
+              <w:spacing w:before="0" w:after="0" w:line="254" w:lineRule="auto"/>
               <w:jc w:val="center"/>
             </w:pPr>
             <w:r>
@@ -303,7 +303,7 @@
                 <w:rFonts w:ascii="Microsoft YaHei" w:hAnsi="Microsoft YaHei" w:eastAsia="Microsoft YaHei"/>
                 <w:b/>
                 <w:color w:val="1F1F1F"/>
-                <w:sz w:val="19"/>
+                <w:sz w:val="18"/>
               </w:rPr>
               <w:t>底层依赖</w:t>
             </w:r>
@@ -314,15 +314,15 @@
             <w:tcW w:type="dxa" w:w="7992"/>
             <w:vAlign w:val="center"/>
             <w:tcMar>
-              <w:top w:w="90" w:type="dxa"/>
-              <w:start w:w="110" w:type="dxa"/>
-              <w:bottom w:w="90" w:type="dxa"/>
-              <w:end w:w="110" w:type="dxa"/>
+              <w:top w:w="42" w:type="dxa"/>
+              <w:start w:w="105" w:type="dxa"/>
+              <w:bottom w:w="42" w:type="dxa"/>
+              <w:end w:w="105" w:type="dxa"/>
             </w:tcMar>
           </w:tcPr>
           <w:p>
             <w:pPr>
-              <w:spacing w:before="0" w:after="0" w:line="269" w:lineRule="auto"/>
+              <w:spacing w:before="0" w:after="0" w:line="254" w:lineRule="auto"/>
               <w:jc w:val="left"/>
             </w:pPr>
             <w:r>
@@ -330,7 +330,7 @@
                 <w:rFonts w:ascii="Microsoft YaHei" w:hAnsi="Microsoft YaHei" w:eastAsia="Microsoft YaHei"/>
                 <w:b w:val="0"/>
                 <w:color w:val="1F1F1F"/>
-                <w:sz w:val="19"/>
+                <w:sz w:val="18"/>
               </w:rPr>
               <w:t>shunge/arrow@0.1.0  MIT</w:t>
             </w:r>
@@ -340,7 +340,7 @@
     </w:tbl>
     <w:p>
       <w:pPr>
-        <w:spacing w:before="240" w:after="140" w:line="317" w:lineRule="auto"/>
+        <w:spacing w:before="160" w:after="140" w:line="288" w:lineRule="auto"/>
       </w:pPr>
       <w:r>
         <w:rPr>
@@ -358,28 +358,28 @@
           <w:color w:val="1F1F1F"/>
           <w:sz w:val="21"/>
         </w:rPr>
-        <w:t>MoonSentinel 已从通用数据质量规则项目重构为用途绑定的隐私发布授权器。当前生产接口不再提供 Required、Unique、Range、Enum、Profile、Contract Diff 等 MoonVerity 已覆盖的能力，而是围绕用途、接收方、逐行同意、最小化发布和 k 匿名完成可执行决策。</w:t>
+        <w:t>MoonSentinel 已从通用数据质量规则项目重构为用途绑定的隐私发布授权器。当前生产接口不再提供 Required、Unique、Range、Enum、Profile、Contract Diff 等数据质量能力，而是围绕用途、接收方、逐行同意、k 匿名、l-diversity 和最小化发布完成可执行决策。</w:t>
       </w:r>
     </w:p>
     <w:p>
       <w:pPr>
         <w:pStyle w:val="Heading1"/>
         <w:keepNext/>
-        <w:spacing w:before="240" w:after="100"/>
+        <w:spacing w:before="180" w:after="80"/>
       </w:pPr>
       <w:r>
         <w:rPr>
           <w:rFonts w:ascii="Microsoft YaHei" w:hAnsi="Microsoft YaHei" w:eastAsia="Microsoft YaHei"/>
           <w:b/>
           <w:color w:val="000000"/>
-          <w:sz w:val="29"/>
+          <w:sz w:val="28"/>
         </w:rPr>
         <w:t>一 项目定位</w:t>
       </w:r>
     </w:p>
     <w:p>
       <w:pPr>
-        <w:spacing w:after="100" w:line="317" w:lineRule="auto"/>
+        <w:spacing w:after="80" w:line="288" w:lineRule="auto"/>
         <w:ind w:firstLine="420"/>
       </w:pPr>
       <w:r>
@@ -394,7 +394,7 @@
     </w:p>
     <w:p>
       <w:pPr>
-        <w:spacing w:after="100" w:line="317" w:lineRule="auto"/>
+        <w:spacing w:after="80" w:line="288" w:lineRule="auto"/>
         <w:ind w:firstLine="420"/>
       </w:pPr>
       <w:r>
@@ -411,21 +411,21 @@
       <w:pPr>
         <w:pStyle w:val="Heading1"/>
         <w:keepNext/>
-        <w:spacing w:before="240" w:after="100"/>
+        <w:spacing w:before="180" w:after="80"/>
       </w:pPr>
       <w:r>
         <w:rPr>
           <w:rFonts w:ascii="Microsoft YaHei" w:hAnsi="Microsoft YaHei" w:eastAsia="Microsoft YaHei"/>
           <w:b/>
           <w:color w:val="000000"/>
-          <w:sz w:val="29"/>
+          <w:sz w:val="28"/>
         </w:rPr>
         <w:t>二 实际问题和目标用户</w:t>
       </w:r>
     </w:p>
     <w:p>
       <w:pPr>
-        <w:spacing w:after="100" w:line="317" w:lineRule="auto"/>
+        <w:spacing w:after="80" w:line="288" w:lineRule="auto"/>
         <w:ind w:firstLine="420"/>
       </w:pPr>
       <w:r>
@@ -435,12 +435,12 @@
           <w:color w:val="1F1F1F"/>
           <w:sz w:val="21"/>
         </w:rPr>
-        <w:t>研究数据、风控样本、合作方数据集和 AI 训练数据经常已经满足格式要求，却仍可能因为用途越界、接收方未获授权、用户未同意、准标识符群体过小或多余字段外泄而不能发布。MoonSentinel 把这些隐私条件变成可测试、可审计的代码路径。</w:t>
+        <w:t>研究数据、风控样本、合作方数据集和 AI 训练数据经常已经满足格式要求，却仍可能因为用途越界、接收方未获授权、用户未同意、准标识符群体过小、敏感属性过于集中或多余字段外泄而不能发布。MoonSentinel 把这些隐私条件变成可测试、可审计的代码路径。</w:t>
       </w:r>
     </w:p>
     <w:p>
       <w:pPr>
-        <w:spacing w:after="80" w:line="298" w:lineRule="auto"/>
+        <w:spacing w:after="60" w:line="274" w:lineRule="auto"/>
         <w:ind w:left="432" w:hanging="288"/>
       </w:pPr>
       <w:r>
@@ -455,7 +455,7 @@
     </w:p>
     <w:p>
       <w:pPr>
-        <w:spacing w:after="80" w:line="298" w:lineRule="auto"/>
+        <w:spacing w:after="60" w:line="274" w:lineRule="auto"/>
         <w:ind w:left="432" w:hanging="288"/>
       </w:pPr>
       <w:r>
@@ -470,7 +470,7 @@
     </w:p>
     <w:p>
       <w:pPr>
-        <w:spacing w:after="80" w:line="298" w:lineRule="auto"/>
+        <w:spacing w:after="60" w:line="274" w:lineRule="auto"/>
         <w:ind w:left="432" w:hanging="288"/>
       </w:pPr>
       <w:r>
@@ -485,7 +485,7 @@
     </w:p>
     <w:p>
       <w:pPr>
-        <w:spacing w:after="80" w:line="298" w:lineRule="auto"/>
+        <w:spacing w:after="60" w:line="274" w:lineRule="auto"/>
         <w:ind w:left="432" w:hanging="288"/>
       </w:pPr>
       <w:r>
@@ -502,14 +502,14 @@
       <w:pPr>
         <w:pStyle w:val="Heading1"/>
         <w:keepNext/>
-        <w:spacing w:before="240" w:after="100"/>
+        <w:spacing w:before="180" w:after="80"/>
       </w:pPr>
       <w:r>
         <w:rPr>
           <w:rFonts w:ascii="Microsoft YaHei" w:hAnsi="Microsoft YaHei" w:eastAsia="Microsoft YaHei"/>
           <w:b/>
           <w:color w:val="000000"/>
-          <w:sz w:val="29"/>
+          <w:sz w:val="28"/>
         </w:rPr>
         <w:t>三 已完成的 MVP</w:t>
       </w:r>
@@ -545,15 +545,15 @@
             <w:shd w:fill="17365D"/>
             <w:vAlign w:val="center"/>
             <w:tcMar>
-              <w:top w:w="90" w:type="dxa"/>
-              <w:start w:w="110" w:type="dxa"/>
-              <w:bottom w:w="90" w:type="dxa"/>
-              <w:end w:w="110" w:type="dxa"/>
+              <w:top w:w="65" w:type="dxa"/>
+              <w:start w:w="105" w:type="dxa"/>
+              <w:bottom w:w="65" w:type="dxa"/>
+              <w:end w:w="105" w:type="dxa"/>
             </w:tcMar>
           </w:tcPr>
           <w:p>
             <w:pPr>
-              <w:spacing w:before="0" w:after="0" w:line="269" w:lineRule="auto"/>
+              <w:spacing w:before="0" w:after="0" w:line="254" w:lineRule="auto"/>
               <w:jc w:val="center"/>
             </w:pPr>
             <w:r>
@@ -561,7 +561,7 @@
                 <w:rFonts w:ascii="Microsoft YaHei" w:hAnsi="Microsoft YaHei" w:eastAsia="Microsoft YaHei"/>
                 <w:b/>
                 <w:color w:val="FFFFFF"/>
-                <w:sz w:val="19"/>
+                <w:sz w:val="18"/>
               </w:rPr>
               <w:t>能力</w:t>
             </w:r>
@@ -573,15 +573,15 @@
             <w:shd w:fill="17365D"/>
             <w:vAlign w:val="center"/>
             <w:tcMar>
-              <w:top w:w="90" w:type="dxa"/>
-              <w:start w:w="110" w:type="dxa"/>
-              <w:bottom w:w="90" w:type="dxa"/>
-              <w:end w:w="110" w:type="dxa"/>
+              <w:top w:w="65" w:type="dxa"/>
+              <w:start w:w="105" w:type="dxa"/>
+              <w:bottom w:w="65" w:type="dxa"/>
+              <w:end w:w="105" w:type="dxa"/>
             </w:tcMar>
           </w:tcPr>
           <w:p>
             <w:pPr>
-              <w:spacing w:before="0" w:after="0" w:line="269" w:lineRule="auto"/>
+              <w:spacing w:before="0" w:after="0" w:line="254" w:lineRule="auto"/>
               <w:jc w:val="center"/>
             </w:pPr>
             <w:r>
@@ -589,7 +589,7 @@
                 <w:rFonts w:ascii="Microsoft YaHei" w:hAnsi="Microsoft YaHei" w:eastAsia="Microsoft YaHei"/>
                 <w:b/>
                 <w:color w:val="FFFFFF"/>
-                <w:sz w:val="19"/>
+                <w:sz w:val="18"/>
               </w:rPr>
               <w:t>当前实现</w:t>
             </w:r>
@@ -601,15 +601,15 @@
             <w:shd w:fill="17365D"/>
             <w:vAlign w:val="center"/>
             <w:tcMar>
-              <w:top w:w="90" w:type="dxa"/>
-              <w:start w:w="110" w:type="dxa"/>
-              <w:bottom w:w="90" w:type="dxa"/>
-              <w:end w:w="110" w:type="dxa"/>
+              <w:top w:w="65" w:type="dxa"/>
+              <w:start w:w="105" w:type="dxa"/>
+              <w:bottom w:w="65" w:type="dxa"/>
+              <w:end w:w="105" w:type="dxa"/>
             </w:tcMar>
           </w:tcPr>
           <w:p>
             <w:pPr>
-              <w:spacing w:before="0" w:after="0" w:line="269" w:lineRule="auto"/>
+              <w:spacing w:before="0" w:after="0" w:line="254" w:lineRule="auto"/>
               <w:jc w:val="center"/>
             </w:pPr>
             <w:r>
@@ -617,7 +617,7 @@
                 <w:rFonts w:ascii="Microsoft YaHei" w:hAnsi="Microsoft YaHei" w:eastAsia="Microsoft YaHei"/>
                 <w:b/>
                 <w:color w:val="FFFFFF"/>
-                <w:sz w:val="19"/>
+                <w:sz w:val="18"/>
               </w:rPr>
               <w:t>验证</w:t>
             </w:r>
@@ -633,15 +633,15 @@
             <w:tcW w:type="dxa" w:w="1656"/>
             <w:vAlign w:val="center"/>
             <w:tcMar>
-              <w:top w:w="90" w:type="dxa"/>
-              <w:start w:w="110" w:type="dxa"/>
-              <w:bottom w:w="90" w:type="dxa"/>
-              <w:end w:w="110" w:type="dxa"/>
+              <w:top w:w="65" w:type="dxa"/>
+              <w:start w:w="105" w:type="dxa"/>
+              <w:bottom w:w="65" w:type="dxa"/>
+              <w:end w:w="105" w:type="dxa"/>
             </w:tcMar>
           </w:tcPr>
           <w:p>
             <w:pPr>
-              <w:spacing w:before="0" w:after="0" w:line="269" w:lineRule="auto"/>
+              <w:spacing w:before="0" w:after="0" w:line="254" w:lineRule="auto"/>
               <w:jc w:val="center"/>
             </w:pPr>
             <w:r>
@@ -649,7 +649,7 @@
                 <w:rFonts w:ascii="Microsoft YaHei" w:hAnsi="Microsoft YaHei" w:eastAsia="Microsoft YaHei"/>
                 <w:b w:val="0"/>
                 <w:color w:val="1F1F1F"/>
-                <w:sz w:val="19"/>
+                <w:sz w:val="18"/>
               </w:rPr>
               <w:t>用途约束</w:t>
             </w:r>
@@ -660,15 +660,15 @@
             <w:tcW w:type="dxa" w:w="6408"/>
             <w:vAlign w:val="center"/>
             <w:tcMar>
-              <w:top w:w="90" w:type="dxa"/>
-              <w:start w:w="110" w:type="dxa"/>
-              <w:bottom w:w="90" w:type="dxa"/>
-              <w:end w:w="110" w:type="dxa"/>
+              <w:top w:w="65" w:type="dxa"/>
+              <w:start w:w="105" w:type="dxa"/>
+              <w:bottom w:w="65" w:type="dxa"/>
+              <w:end w:w="105" w:type="dxa"/>
             </w:tcMar>
           </w:tcPr>
           <w:p>
             <w:pPr>
-              <w:spacing w:before="0" w:after="0" w:line="269" w:lineRule="auto"/>
+              <w:spacing w:before="0" w:after="0" w:line="254" w:lineRule="auto"/>
               <w:jc w:val="left"/>
             </w:pPr>
             <w:r>
@@ -676,7 +676,7 @@
                 <w:rFonts w:ascii="Microsoft YaHei" w:hAnsi="Microsoft YaHei" w:eastAsia="Microsoft YaHei"/>
                 <w:b w:val="0"/>
                 <w:color w:val="1F1F1F"/>
-                <w:sz w:val="19"/>
+                <w:sz w:val="18"/>
               </w:rPr>
               <w:t>策略列出允许用途，越界用途整批拒绝</w:t>
             </w:r>
@@ -687,15 +687,15 @@
             <w:tcW w:type="dxa" w:w="1944"/>
             <w:vAlign w:val="center"/>
             <w:tcMar>
-              <w:top w:w="90" w:type="dxa"/>
-              <w:start w:w="110" w:type="dxa"/>
-              <w:bottom w:w="90" w:type="dxa"/>
-              <w:end w:w="110" w:type="dxa"/>
+              <w:top w:w="65" w:type="dxa"/>
+              <w:start w:w="105" w:type="dxa"/>
+              <w:bottom w:w="65" w:type="dxa"/>
+              <w:end w:w="105" w:type="dxa"/>
             </w:tcMar>
           </w:tcPr>
           <w:p>
             <w:pPr>
-              <w:spacing w:before="0" w:after="0" w:line="269" w:lineRule="auto"/>
+              <w:spacing w:before="0" w:after="0" w:line="254" w:lineRule="auto"/>
               <w:jc w:val="center"/>
             </w:pPr>
             <w:r>
@@ -703,7 +703,7 @@
                 <w:rFonts w:ascii="Microsoft YaHei" w:hAnsi="Microsoft YaHei" w:eastAsia="Microsoft YaHei"/>
                 <w:b w:val="0"/>
                 <w:color w:val="1F1F1F"/>
-                <w:sz w:val="19"/>
+                <w:sz w:val="18"/>
               </w:rPr>
               <w:t>自动化测试</w:t>
             </w:r>
@@ -720,15 +720,15 @@
             <w:shd w:fill="F4F7FA"/>
             <w:vAlign w:val="center"/>
             <w:tcMar>
-              <w:top w:w="90" w:type="dxa"/>
-              <w:start w:w="110" w:type="dxa"/>
-              <w:bottom w:w="90" w:type="dxa"/>
-              <w:end w:w="110" w:type="dxa"/>
+              <w:top w:w="65" w:type="dxa"/>
+              <w:start w:w="105" w:type="dxa"/>
+              <w:bottom w:w="65" w:type="dxa"/>
+              <w:end w:w="105" w:type="dxa"/>
             </w:tcMar>
           </w:tcPr>
           <w:p>
             <w:pPr>
-              <w:spacing w:before="0" w:after="0" w:line="269" w:lineRule="auto"/>
+              <w:spacing w:before="0" w:after="0" w:line="254" w:lineRule="auto"/>
               <w:jc w:val="center"/>
             </w:pPr>
             <w:r>
@@ -736,7 +736,7 @@
                 <w:rFonts w:ascii="Microsoft YaHei" w:hAnsi="Microsoft YaHei" w:eastAsia="Microsoft YaHei"/>
                 <w:b w:val="0"/>
                 <w:color w:val="1F1F1F"/>
-                <w:sz w:val="19"/>
+                <w:sz w:val="18"/>
               </w:rPr>
               <w:t>接收方约束</w:t>
             </w:r>
@@ -748,15 +748,15 @@
             <w:shd w:fill="F4F7FA"/>
             <w:vAlign w:val="center"/>
             <w:tcMar>
-              <w:top w:w="90" w:type="dxa"/>
-              <w:start w:w="110" w:type="dxa"/>
-              <w:bottom w:w="90" w:type="dxa"/>
-              <w:end w:w="110" w:type="dxa"/>
+              <w:top w:w="65" w:type="dxa"/>
+              <w:start w:w="105" w:type="dxa"/>
+              <w:bottom w:w="65" w:type="dxa"/>
+              <w:end w:w="105" w:type="dxa"/>
             </w:tcMar>
           </w:tcPr>
           <w:p>
             <w:pPr>
-              <w:spacing w:before="0" w:after="0" w:line="269" w:lineRule="auto"/>
+              <w:spacing w:before="0" w:after="0" w:line="254" w:lineRule="auto"/>
               <w:jc w:val="left"/>
             </w:pPr>
             <w:r>
@@ -764,7 +764,7 @@
                 <w:rFonts w:ascii="Microsoft YaHei" w:hAnsi="Microsoft YaHei" w:eastAsia="Microsoft YaHei"/>
                 <w:b w:val="0"/>
                 <w:color w:val="1F1F1F"/>
-                <w:sz w:val="19"/>
+                <w:sz w:val="18"/>
               </w:rPr>
               <w:t>Internal、Partner、Public 分级授权</w:t>
             </w:r>
@@ -776,15 +776,15 @@
             <w:shd w:fill="F4F7FA"/>
             <w:vAlign w:val="center"/>
             <w:tcMar>
-              <w:top w:w="90" w:type="dxa"/>
-              <w:start w:w="110" w:type="dxa"/>
-              <w:bottom w:w="90" w:type="dxa"/>
-              <w:end w:w="110" w:type="dxa"/>
+              <w:top w:w="65" w:type="dxa"/>
+              <w:start w:w="105" w:type="dxa"/>
+              <w:bottom w:w="65" w:type="dxa"/>
+              <w:end w:w="105" w:type="dxa"/>
             </w:tcMar>
           </w:tcPr>
           <w:p>
             <w:pPr>
-              <w:spacing w:before="0" w:after="0" w:line="269" w:lineRule="auto"/>
+              <w:spacing w:before="0" w:after="0" w:line="254" w:lineRule="auto"/>
               <w:jc w:val="center"/>
             </w:pPr>
             <w:r>
@@ -792,7 +792,7 @@
                 <w:rFonts w:ascii="Microsoft YaHei" w:hAnsi="Microsoft YaHei" w:eastAsia="Microsoft YaHei"/>
                 <w:b w:val="0"/>
                 <w:color w:val="1F1F1F"/>
-                <w:sz w:val="19"/>
+                <w:sz w:val="18"/>
               </w:rPr>
               <w:t>自动化测试</w:t>
             </w:r>
@@ -808,15 +808,15 @@
             <w:tcW w:type="dxa" w:w="1656"/>
             <w:vAlign w:val="center"/>
             <w:tcMar>
-              <w:top w:w="90" w:type="dxa"/>
-              <w:start w:w="110" w:type="dxa"/>
-              <w:bottom w:w="90" w:type="dxa"/>
-              <w:end w:w="110" w:type="dxa"/>
+              <w:top w:w="65" w:type="dxa"/>
+              <w:start w:w="105" w:type="dxa"/>
+              <w:bottom w:w="65" w:type="dxa"/>
+              <w:end w:w="105" w:type="dxa"/>
             </w:tcMar>
           </w:tcPr>
           <w:p>
             <w:pPr>
-              <w:spacing w:before="0" w:after="0" w:line="269" w:lineRule="auto"/>
+              <w:spacing w:before="0" w:after="0" w:line="254" w:lineRule="auto"/>
               <w:jc w:val="center"/>
             </w:pPr>
             <w:r>
@@ -824,7 +824,7 @@
                 <w:rFonts w:ascii="Microsoft YaHei" w:hAnsi="Microsoft YaHei" w:eastAsia="Microsoft YaHei"/>
                 <w:b w:val="0"/>
                 <w:color w:val="1F1F1F"/>
-                <w:sz w:val="19"/>
+                <w:sz w:val="18"/>
               </w:rPr>
               <w:t>逐行同意</w:t>
             </w:r>
@@ -835,15 +835,15 @@
             <w:tcW w:type="dxa" w:w="6408"/>
             <w:vAlign w:val="center"/>
             <w:tcMar>
-              <w:top w:w="90" w:type="dxa"/>
-              <w:start w:w="110" w:type="dxa"/>
-              <w:bottom w:w="90" w:type="dxa"/>
-              <w:end w:w="110" w:type="dxa"/>
+              <w:top w:w="65" w:type="dxa"/>
+              <w:start w:w="105" w:type="dxa"/>
+              <w:bottom w:w="65" w:type="dxa"/>
+              <w:end w:w="105" w:type="dxa"/>
             </w:tcMar>
           </w:tcPr>
           <w:p>
             <w:pPr>
-              <w:spacing w:before="0" w:after="0" w:line="269" w:lineRule="auto"/>
+              <w:spacing w:before="0" w:after="0" w:line="254" w:lineRule="auto"/>
               <w:jc w:val="left"/>
             </w:pPr>
             <w:r>
@@ -851,7 +851,7 @@
                 <w:rFonts w:ascii="Microsoft YaHei" w:hAnsi="Microsoft YaHei" w:eastAsia="Microsoft YaHei"/>
                 <w:b w:val="0"/>
                 <w:color w:val="1F1F1F"/>
-                <w:sz w:val="19"/>
+                <w:sz w:val="18"/>
               </w:rPr>
               <w:t>按同意列筛选候选记录，未同意行进入隔离</w:t>
             </w:r>
@@ -862,15 +862,15 @@
             <w:tcW w:type="dxa" w:w="1944"/>
             <w:vAlign w:val="center"/>
             <w:tcMar>
-              <w:top w:w="90" w:type="dxa"/>
-              <w:start w:w="110" w:type="dxa"/>
-              <w:bottom w:w="90" w:type="dxa"/>
-              <w:end w:w="110" w:type="dxa"/>
+              <w:top w:w="65" w:type="dxa"/>
+              <w:start w:w="105" w:type="dxa"/>
+              <w:bottom w:w="65" w:type="dxa"/>
+              <w:end w:w="105" w:type="dxa"/>
             </w:tcMar>
           </w:tcPr>
           <w:p>
             <w:pPr>
-              <w:spacing w:before="0" w:after="0" w:line="269" w:lineRule="auto"/>
+              <w:spacing w:before="0" w:after="0" w:line="254" w:lineRule="auto"/>
               <w:jc w:val="center"/>
             </w:pPr>
             <w:r>
@@ -878,7 +878,7 @@
                 <w:rFonts w:ascii="Microsoft YaHei" w:hAnsi="Microsoft YaHei" w:eastAsia="Microsoft YaHei"/>
                 <w:b w:val="0"/>
                 <w:color w:val="1F1F1F"/>
-                <w:sz w:val="19"/>
+                <w:sz w:val="18"/>
               </w:rPr>
               <w:t>自动化测试</w:t>
             </w:r>
@@ -895,15 +895,15 @@
             <w:shd w:fill="F4F7FA"/>
             <w:vAlign w:val="center"/>
             <w:tcMar>
-              <w:top w:w="90" w:type="dxa"/>
-              <w:start w:w="110" w:type="dxa"/>
-              <w:bottom w:w="90" w:type="dxa"/>
-              <w:end w:w="110" w:type="dxa"/>
+              <w:top w:w="65" w:type="dxa"/>
+              <w:start w:w="105" w:type="dxa"/>
+              <w:bottom w:w="65" w:type="dxa"/>
+              <w:end w:w="105" w:type="dxa"/>
             </w:tcMar>
           </w:tcPr>
           <w:p>
             <w:pPr>
-              <w:spacing w:before="0" w:after="0" w:line="269" w:lineRule="auto"/>
+              <w:spacing w:before="0" w:after="0" w:line="254" w:lineRule="auto"/>
               <w:jc w:val="center"/>
             </w:pPr>
             <w:r>
@@ -911,7 +911,7 @@
                 <w:rFonts w:ascii="Microsoft YaHei" w:hAnsi="Microsoft YaHei" w:eastAsia="Microsoft YaHei"/>
                 <w:b w:val="0"/>
                 <w:color w:val="1F1F1F"/>
-                <w:sz w:val="19"/>
+                <w:sz w:val="18"/>
               </w:rPr>
               <w:t>k 匿名</w:t>
             </w:r>
@@ -923,15 +923,15 @@
             <w:shd w:fill="F4F7FA"/>
             <w:vAlign w:val="center"/>
             <w:tcMar>
-              <w:top w:w="90" w:type="dxa"/>
-              <w:start w:w="110" w:type="dxa"/>
-              <w:bottom w:w="90" w:type="dxa"/>
-              <w:end w:w="110" w:type="dxa"/>
+              <w:top w:w="65" w:type="dxa"/>
+              <w:start w:w="105" w:type="dxa"/>
+              <w:bottom w:w="65" w:type="dxa"/>
+              <w:end w:w="105" w:type="dxa"/>
             </w:tcMar>
           </w:tcPr>
           <w:p>
             <w:pPr>
-              <w:spacing w:before="0" w:after="0" w:line="269" w:lineRule="auto"/>
+              <w:spacing w:before="0" w:after="0" w:line="254" w:lineRule="auto"/>
               <w:jc w:val="left"/>
             </w:pPr>
             <w:r>
@@ -939,7 +939,7 @@
                 <w:rFonts w:ascii="Microsoft YaHei" w:hAnsi="Microsoft YaHei" w:eastAsia="Microsoft YaHei"/>
                 <w:b w:val="0"/>
                 <w:color w:val="1F1F1F"/>
-                <w:sz w:val="19"/>
+                <w:sz w:val="18"/>
               </w:rPr>
               <w:t>只在已同意候选行中按准标识符组合计算等价类</w:t>
             </w:r>
@@ -951,15 +951,15 @@
             <w:shd w:fill="F4F7FA"/>
             <w:vAlign w:val="center"/>
             <w:tcMar>
-              <w:top w:w="90" w:type="dxa"/>
-              <w:start w:w="110" w:type="dxa"/>
-              <w:bottom w:w="90" w:type="dxa"/>
-              <w:end w:w="110" w:type="dxa"/>
+              <w:top w:w="65" w:type="dxa"/>
+              <w:start w:w="105" w:type="dxa"/>
+              <w:bottom w:w="65" w:type="dxa"/>
+              <w:end w:w="105" w:type="dxa"/>
             </w:tcMar>
           </w:tcPr>
           <w:p>
             <w:pPr>
-              <w:spacing w:before="0" w:after="0" w:line="269" w:lineRule="auto"/>
+              <w:spacing w:before="0" w:after="0" w:line="254" w:lineRule="auto"/>
               <w:jc w:val="center"/>
             </w:pPr>
             <w:r>
@@ -967,7 +967,7 @@
                 <w:rFonts w:ascii="Microsoft YaHei" w:hAnsi="Microsoft YaHei" w:eastAsia="Microsoft YaHei"/>
                 <w:b w:val="0"/>
                 <w:color w:val="1F1F1F"/>
-                <w:sz w:val="19"/>
+                <w:sz w:val="18"/>
               </w:rPr>
               <w:t>自动化测试</w:t>
             </w:r>
@@ -983,15 +983,15 @@
             <w:tcW w:type="dxa" w:w="1656"/>
             <w:vAlign w:val="center"/>
             <w:tcMar>
-              <w:top w:w="90" w:type="dxa"/>
-              <w:start w:w="110" w:type="dxa"/>
-              <w:bottom w:w="90" w:type="dxa"/>
-              <w:end w:w="110" w:type="dxa"/>
+              <w:top w:w="65" w:type="dxa"/>
+              <w:start w:w="105" w:type="dxa"/>
+              <w:bottom w:w="65" w:type="dxa"/>
+              <w:end w:w="105" w:type="dxa"/>
             </w:tcMar>
           </w:tcPr>
           <w:p>
             <w:pPr>
-              <w:spacing w:before="0" w:after="0" w:line="269" w:lineRule="auto"/>
+              <w:spacing w:before="0" w:after="0" w:line="254" w:lineRule="auto"/>
               <w:jc w:val="center"/>
             </w:pPr>
             <w:r>
@@ -999,9 +999,9 @@
                 <w:rFonts w:ascii="Microsoft YaHei" w:hAnsi="Microsoft YaHei" w:eastAsia="Microsoft YaHei"/>
                 <w:b w:val="0"/>
                 <w:color w:val="1F1F1F"/>
-                <w:sz w:val="19"/>
+                <w:sz w:val="18"/>
               </w:rPr>
-              <w:t>最小化发布</w:t>
+              <w:t>l-diversity</w:t>
             </w:r>
           </w:p>
         </w:tc>
@@ -1010,15 +1010,15 @@
             <w:tcW w:type="dxa" w:w="6408"/>
             <w:vAlign w:val="center"/>
             <w:tcMar>
-              <w:top w:w="90" w:type="dxa"/>
-              <w:start w:w="110" w:type="dxa"/>
-              <w:bottom w:w="90" w:type="dxa"/>
-              <w:end w:w="110" w:type="dxa"/>
+              <w:top w:w="65" w:type="dxa"/>
+              <w:start w:w="105" w:type="dxa"/>
+              <w:bottom w:w="65" w:type="dxa"/>
+              <w:end w:w="105" w:type="dxa"/>
             </w:tcMar>
           </w:tcPr>
           <w:p>
             <w:pPr>
-              <w:spacing w:before="0" w:after="0" w:line="269" w:lineRule="auto"/>
+              <w:spacing w:before="0" w:after="0" w:line="254" w:lineRule="auto"/>
               <w:jc w:val="left"/>
             </w:pPr>
             <w:r>
@@ -1026,9 +1026,9 @@
                 <w:rFonts w:ascii="Microsoft YaHei" w:hAnsi="Microsoft YaHei" w:eastAsia="Microsoft YaHei"/>
                 <w:b w:val="0"/>
                 <w:color w:val="1F1F1F"/>
-                <w:sz w:val="19"/>
+                <w:sz w:val="18"/>
               </w:rPr>
-              <w:t>仅发布策略列明字段，未列字段默认不输出</w:t>
+              <w:t>只在通过 k 匿名的固定候选集中检查敏感属性不同值</w:t>
             </w:r>
           </w:p>
         </w:tc>
@@ -1037,15 +1037,15 @@
             <w:tcW w:type="dxa" w:w="1944"/>
             <w:vAlign w:val="center"/>
             <w:tcMar>
-              <w:top w:w="90" w:type="dxa"/>
-              <w:start w:w="110" w:type="dxa"/>
-              <w:bottom w:w="90" w:type="dxa"/>
-              <w:end w:w="110" w:type="dxa"/>
+              <w:top w:w="65" w:type="dxa"/>
+              <w:start w:w="105" w:type="dxa"/>
+              <w:bottom w:w="65" w:type="dxa"/>
+              <w:end w:w="105" w:type="dxa"/>
             </w:tcMar>
           </w:tcPr>
           <w:p>
             <w:pPr>
-              <w:spacing w:before="0" w:after="0" w:line="269" w:lineRule="auto"/>
+              <w:spacing w:before="0" w:after="0" w:line="254" w:lineRule="auto"/>
               <w:jc w:val="center"/>
             </w:pPr>
             <w:r>
@@ -1053,7 +1053,7 @@
                 <w:rFonts w:ascii="Microsoft YaHei" w:hAnsi="Microsoft YaHei" w:eastAsia="Microsoft YaHei"/>
                 <w:b w:val="0"/>
                 <w:color w:val="1F1F1F"/>
-                <w:sz w:val="19"/>
+                <w:sz w:val="18"/>
               </w:rPr>
               <w:t>自动化测试</w:t>
             </w:r>
@@ -1070,15 +1070,15 @@
             <w:shd w:fill="F4F7FA"/>
             <w:vAlign w:val="center"/>
             <w:tcMar>
-              <w:top w:w="90" w:type="dxa"/>
-              <w:start w:w="110" w:type="dxa"/>
-              <w:bottom w:w="90" w:type="dxa"/>
-              <w:end w:w="110" w:type="dxa"/>
+              <w:top w:w="65" w:type="dxa"/>
+              <w:start w:w="105" w:type="dxa"/>
+              <w:bottom w:w="65" w:type="dxa"/>
+              <w:end w:w="105" w:type="dxa"/>
             </w:tcMar>
           </w:tcPr>
           <w:p>
             <w:pPr>
-              <w:spacing w:before="0" w:after="0" w:line="269" w:lineRule="auto"/>
+              <w:spacing w:before="0" w:after="0" w:line="254" w:lineRule="auto"/>
               <w:jc w:val="center"/>
             </w:pPr>
             <w:r>
@@ -1086,9 +1086,9 @@
                 <w:rFonts w:ascii="Microsoft YaHei" w:hAnsi="Microsoft YaHei" w:eastAsia="Microsoft YaHei"/>
                 <w:b w:val="0"/>
                 <w:color w:val="1F1F1F"/>
-                <w:sz w:val="19"/>
+                <w:sz w:val="18"/>
               </w:rPr>
-              <w:t>敏感处理</w:t>
+              <w:t>最小化发布</w:t>
             </w:r>
           </w:p>
         </w:tc>
@@ -1098,15 +1098,15 @@
             <w:shd w:fill="F4F7FA"/>
             <w:vAlign w:val="center"/>
             <w:tcMar>
-              <w:top w:w="90" w:type="dxa"/>
-              <w:start w:w="110" w:type="dxa"/>
-              <w:bottom w:w="90" w:type="dxa"/>
-              <w:end w:w="110" w:type="dxa"/>
+              <w:top w:w="65" w:type="dxa"/>
+              <w:start w:w="105" w:type="dxa"/>
+              <w:bottom w:w="65" w:type="dxa"/>
+              <w:end w:w="105" w:type="dxa"/>
             </w:tcMar>
           </w:tcPr>
           <w:p>
             <w:pPr>
-              <w:spacing w:before="0" w:after="0" w:line="269" w:lineRule="auto"/>
+              <w:spacing w:before="0" w:after="0" w:line="254" w:lineRule="auto"/>
               <w:jc w:val="left"/>
             </w:pPr>
             <w:r>
@@ -1114,9 +1114,9 @@
                 <w:rFonts w:ascii="Microsoft YaHei" w:hAnsi="Microsoft YaHei" w:eastAsia="Microsoft YaHei"/>
                 <w:b w:val="0"/>
                 <w:color w:val="1F1F1F"/>
-                <w:sz w:val="19"/>
+                <w:sz w:val="18"/>
               </w:rPr>
-              <w:t>直接标识符和敏感字段必须替换或删除，禁止原值 Keep</w:t>
+              <w:t>仅发布策略列明字段，未列字段默认不输出</w:t>
             </w:r>
           </w:p>
         </w:tc>
@@ -1126,15 +1126,15 @@
             <w:shd w:fill="F4F7FA"/>
             <w:vAlign w:val="center"/>
             <w:tcMar>
-              <w:top w:w="90" w:type="dxa"/>
-              <w:start w:w="110" w:type="dxa"/>
-              <w:bottom w:w="90" w:type="dxa"/>
-              <w:end w:w="110" w:type="dxa"/>
+              <w:top w:w="65" w:type="dxa"/>
+              <w:start w:w="105" w:type="dxa"/>
+              <w:bottom w:w="65" w:type="dxa"/>
+              <w:end w:w="105" w:type="dxa"/>
             </w:tcMar>
           </w:tcPr>
           <w:p>
             <w:pPr>
-              <w:spacing w:before="0" w:after="0" w:line="269" w:lineRule="auto"/>
+              <w:spacing w:before="0" w:after="0" w:line="254" w:lineRule="auto"/>
               <w:jc w:val="center"/>
             </w:pPr>
             <w:r>
@@ -1142,9 +1142,9 @@
                 <w:rFonts w:ascii="Microsoft YaHei" w:hAnsi="Microsoft YaHei" w:eastAsia="Microsoft YaHei"/>
                 <w:b w:val="0"/>
                 <w:color w:val="1F1F1F"/>
-                <w:sz w:val="19"/>
+                <w:sz w:val="18"/>
               </w:rPr>
-              <w:t>策略校验</w:t>
+              <w:t>自动化测试</w:t>
             </w:r>
           </w:p>
         </w:tc>
@@ -1158,15 +1158,15 @@
             <w:tcW w:type="dxa" w:w="1656"/>
             <w:vAlign w:val="center"/>
             <w:tcMar>
-              <w:top w:w="90" w:type="dxa"/>
-              <w:start w:w="110" w:type="dxa"/>
-              <w:bottom w:w="90" w:type="dxa"/>
-              <w:end w:w="110" w:type="dxa"/>
+              <w:top w:w="65" w:type="dxa"/>
+              <w:start w:w="105" w:type="dxa"/>
+              <w:bottom w:w="65" w:type="dxa"/>
+              <w:end w:w="105" w:type="dxa"/>
             </w:tcMar>
           </w:tcPr>
           <w:p>
             <w:pPr>
-              <w:spacing w:before="0" w:after="0" w:line="269" w:lineRule="auto"/>
+              <w:spacing w:before="0" w:after="0" w:line="254" w:lineRule="auto"/>
               <w:jc w:val="center"/>
             </w:pPr>
             <w:r>
@@ -1174,9 +1174,9 @@
                 <w:rFonts w:ascii="Microsoft YaHei" w:hAnsi="Microsoft YaHei" w:eastAsia="Microsoft YaHei"/>
                 <w:b w:val="0"/>
                 <w:color w:val="1F1F1F"/>
-                <w:sz w:val="19"/>
+                <w:sz w:val="18"/>
               </w:rPr>
-              <w:t>Arrow 结果</w:t>
+              <w:t>敏感处理</w:t>
             </w:r>
           </w:p>
         </w:tc>
@@ -1185,15 +1185,15 @@
             <w:tcW w:type="dxa" w:w="6408"/>
             <w:vAlign w:val="center"/>
             <w:tcMar>
-              <w:top w:w="90" w:type="dxa"/>
-              <w:start w:w="110" w:type="dxa"/>
-              <w:bottom w:w="90" w:type="dxa"/>
-              <w:end w:w="110" w:type="dxa"/>
+              <w:top w:w="65" w:type="dxa"/>
+              <w:start w:w="105" w:type="dxa"/>
+              <w:bottom w:w="65" w:type="dxa"/>
+              <w:end w:w="105" w:type="dxa"/>
             </w:tcMar>
           </w:tcPr>
           <w:p>
             <w:pPr>
-              <w:spacing w:before="0" w:after="0" w:line="269" w:lineRule="auto"/>
+              <w:spacing w:before="0" w:after="0" w:line="254" w:lineRule="auto"/>
               <w:jc w:val="left"/>
             </w:pPr>
             <w:r>
@@ -1201,9 +1201,9 @@
                 <w:rFonts w:ascii="Microsoft YaHei" w:hAnsi="Microsoft YaHei" w:eastAsia="Microsoft YaHei"/>
                 <w:b w:val="0"/>
                 <w:color w:val="1F1F1F"/>
-                <w:sz w:val="19"/>
+                <w:sz w:val="18"/>
               </w:rPr>
-              <w:t>approved、quarantine、findings、manifest 四类 RecordBatch</w:t>
+              <w:t>直接标识符和敏感字段必须替换或删除，禁止原值 Keep</w:t>
             </w:r>
           </w:p>
         </w:tc>
@@ -1212,15 +1212,15 @@
             <w:tcW w:type="dxa" w:w="1944"/>
             <w:vAlign w:val="center"/>
             <w:tcMar>
-              <w:top w:w="90" w:type="dxa"/>
-              <w:start w:w="110" w:type="dxa"/>
-              <w:bottom w:w="90" w:type="dxa"/>
-              <w:end w:w="110" w:type="dxa"/>
+              <w:top w:w="65" w:type="dxa"/>
+              <w:start w:w="105" w:type="dxa"/>
+              <w:bottom w:w="65" w:type="dxa"/>
+              <w:end w:w="105" w:type="dxa"/>
             </w:tcMar>
           </w:tcPr>
           <w:p>
             <w:pPr>
-              <w:spacing w:before="0" w:after="0" w:line="269" w:lineRule="auto"/>
+              <w:spacing w:before="0" w:after="0" w:line="254" w:lineRule="auto"/>
               <w:jc w:val="center"/>
             </w:pPr>
             <w:r>
@@ -1228,9 +1228,9 @@
                 <w:rFonts w:ascii="Microsoft YaHei" w:hAnsi="Microsoft YaHei" w:eastAsia="Microsoft YaHei"/>
                 <w:b w:val="0"/>
                 <w:color w:val="1F1F1F"/>
-                <w:sz w:val="19"/>
+                <w:sz w:val="18"/>
               </w:rPr>
-              <w:t>IPC 回环</w:t>
+              <w:t>策略校验</w:t>
             </w:r>
           </w:p>
         </w:tc>
@@ -1245,15 +1245,15 @@
             <w:shd w:fill="F4F7FA"/>
             <w:vAlign w:val="center"/>
             <w:tcMar>
-              <w:top w:w="90" w:type="dxa"/>
-              <w:start w:w="110" w:type="dxa"/>
-              <w:bottom w:w="90" w:type="dxa"/>
-              <w:end w:w="110" w:type="dxa"/>
+              <w:top w:w="65" w:type="dxa"/>
+              <w:start w:w="105" w:type="dxa"/>
+              <w:bottom w:w="65" w:type="dxa"/>
+              <w:end w:w="105" w:type="dxa"/>
             </w:tcMar>
           </w:tcPr>
           <w:p>
             <w:pPr>
-              <w:spacing w:before="0" w:after="0" w:line="269" w:lineRule="auto"/>
+              <w:spacing w:before="0" w:after="0" w:line="254" w:lineRule="auto"/>
               <w:jc w:val="center"/>
             </w:pPr>
             <w:r>
@@ -1261,9 +1261,9 @@
                 <w:rFonts w:ascii="Microsoft YaHei" w:hAnsi="Microsoft YaHei" w:eastAsia="Microsoft YaHei"/>
                 <w:b w:val="0"/>
                 <w:color w:val="1F1F1F"/>
-                <w:sz w:val="19"/>
+                <w:sz w:val="18"/>
               </w:rPr>
-              <w:t>跨目标</w:t>
+              <w:t>Arrow 结果</w:t>
             </w:r>
           </w:p>
         </w:tc>
@@ -1273,15 +1273,15 @@
             <w:shd w:fill="F4F7FA"/>
             <w:vAlign w:val="center"/>
             <w:tcMar>
-              <w:top w:w="90" w:type="dxa"/>
-              <w:start w:w="110" w:type="dxa"/>
-              <w:bottom w:w="90" w:type="dxa"/>
-              <w:end w:w="110" w:type="dxa"/>
+              <w:top w:w="65" w:type="dxa"/>
+              <w:start w:w="105" w:type="dxa"/>
+              <w:bottom w:w="65" w:type="dxa"/>
+              <w:end w:w="105" w:type="dxa"/>
             </w:tcMar>
           </w:tcPr>
           <w:p>
             <w:pPr>
-              <w:spacing w:before="0" w:after="0" w:line="269" w:lineRule="auto"/>
+              <w:spacing w:before="0" w:after="0" w:line="254" w:lineRule="auto"/>
               <w:jc w:val="left"/>
             </w:pPr>
             <w:r>
@@ -1289,9 +1289,9 @@
                 <w:rFonts w:ascii="Microsoft YaHei" w:hAnsi="Microsoft YaHei" w:eastAsia="Microsoft YaHei"/>
                 <w:b w:val="0"/>
                 <w:color w:val="1F1F1F"/>
-                <w:sz w:val="19"/>
+                <w:sz w:val="18"/>
               </w:rPr>
-              <w:t>Native、JavaScript、Wasm、Wasm-GC</w:t>
+              <w:t>approved、quarantine、findings、manifest 四类 RecordBatch</w:t>
             </w:r>
           </w:p>
         </w:tc>
@@ -1301,15 +1301,15 @@
             <w:shd w:fill="F4F7FA"/>
             <w:vAlign w:val="center"/>
             <w:tcMar>
-              <w:top w:w="90" w:type="dxa"/>
-              <w:start w:w="110" w:type="dxa"/>
-              <w:bottom w:w="90" w:type="dxa"/>
-              <w:end w:w="110" w:type="dxa"/>
+              <w:top w:w="65" w:type="dxa"/>
+              <w:start w:w="105" w:type="dxa"/>
+              <w:bottom w:w="65" w:type="dxa"/>
+              <w:end w:w="105" w:type="dxa"/>
             </w:tcMar>
           </w:tcPr>
           <w:p>
             <w:pPr>
-              <w:spacing w:before="0" w:after="0" w:line="269" w:lineRule="auto"/>
+              <w:spacing w:before="0" w:after="0" w:line="254" w:lineRule="auto"/>
               <w:jc w:val="center"/>
             </w:pPr>
             <w:r>
@@ -1317,9 +1317,95 @@
                 <w:rFonts w:ascii="Microsoft YaHei" w:hAnsi="Microsoft YaHei" w:eastAsia="Microsoft YaHei"/>
                 <w:b w:val="0"/>
                 <w:color w:val="1F1F1F"/>
-                <w:sz w:val="19"/>
+                <w:sz w:val="18"/>
               </w:rPr>
-              <w:t>8 项测试全通过</w:t>
+              <w:t>IPC 回环</w:t>
+            </w:r>
+          </w:p>
+        </w:tc>
+      </w:tr>
+      <w:tr>
+        <w:trPr>
+          <w:cantSplit w:val="true"/>
+        </w:trPr>
+        <w:tc>
+          <w:tcPr>
+            <w:tcW w:type="dxa" w:w="1656"/>
+            <w:vAlign w:val="center"/>
+            <w:tcMar>
+              <w:top w:w="65" w:type="dxa"/>
+              <w:start w:w="105" w:type="dxa"/>
+              <w:bottom w:w="65" w:type="dxa"/>
+              <w:end w:w="105" w:type="dxa"/>
+            </w:tcMar>
+          </w:tcPr>
+          <w:p>
+            <w:pPr>
+              <w:spacing w:before="0" w:after="0" w:line="254" w:lineRule="auto"/>
+              <w:jc w:val="center"/>
+            </w:pPr>
+            <w:r>
+              <w:rPr>
+                <w:rFonts w:ascii="Microsoft YaHei" w:hAnsi="Microsoft YaHei" w:eastAsia="Microsoft YaHei"/>
+                <w:b w:val="0"/>
+                <w:color w:val="1F1F1F"/>
+                <w:sz w:val="18"/>
+              </w:rPr>
+              <w:t>跨目标</w:t>
+            </w:r>
+          </w:p>
+        </w:tc>
+        <w:tc>
+          <w:tcPr>
+            <w:tcW w:type="dxa" w:w="6408"/>
+            <w:vAlign w:val="center"/>
+            <w:tcMar>
+              <w:top w:w="65" w:type="dxa"/>
+              <w:start w:w="105" w:type="dxa"/>
+              <w:bottom w:w="65" w:type="dxa"/>
+              <w:end w:w="105" w:type="dxa"/>
+            </w:tcMar>
+          </w:tcPr>
+          <w:p>
+            <w:pPr>
+              <w:spacing w:before="0" w:after="0" w:line="254" w:lineRule="auto"/>
+              <w:jc w:val="left"/>
+            </w:pPr>
+            <w:r>
+              <w:rPr>
+                <w:rFonts w:ascii="Microsoft YaHei" w:hAnsi="Microsoft YaHei" w:eastAsia="Microsoft YaHei"/>
+                <w:b w:val="0"/>
+                <w:color w:val="1F1F1F"/>
+                <w:sz w:val="18"/>
+              </w:rPr>
+              <w:t>Native、JavaScript、Wasm、Wasm-GC</w:t>
+            </w:r>
+          </w:p>
+        </w:tc>
+        <w:tc>
+          <w:tcPr>
+            <w:tcW w:type="dxa" w:w="1944"/>
+            <w:vAlign w:val="center"/>
+            <w:tcMar>
+              <w:top w:w="65" w:type="dxa"/>
+              <w:start w:w="105" w:type="dxa"/>
+              <w:bottom w:w="65" w:type="dxa"/>
+              <w:end w:w="105" w:type="dxa"/>
+            </w:tcMar>
+          </w:tcPr>
+          <w:p>
+            <w:pPr>
+              <w:spacing w:before="0" w:after="0" w:line="254" w:lineRule="auto"/>
+              <w:jc w:val="center"/>
+            </w:pPr>
+            <w:r>
+              <w:rPr>
+                <w:rFonts w:ascii="Microsoft YaHei" w:hAnsi="Microsoft YaHei" w:eastAsia="Microsoft YaHei"/>
+                <w:b w:val="0"/>
+                <w:color w:val="1F1F1F"/>
+                <w:sz w:val="18"/>
+              </w:rPr>
+              <w:t>9 项测试全通过</w:t>
             </w:r>
           </w:p>
         </w:tc>
@@ -1334,21 +1420,21 @@
       <w:pPr>
         <w:pStyle w:val="Heading1"/>
         <w:keepNext/>
-        <w:spacing w:before="240" w:after="100"/>
+        <w:spacing w:before="180" w:after="80"/>
       </w:pPr>
       <w:r>
         <w:rPr>
           <w:rFonts w:ascii="Microsoft YaHei" w:hAnsi="Microsoft YaHei" w:eastAsia="Microsoft YaHei"/>
           <w:b/>
           <w:color w:val="000000"/>
-          <w:sz w:val="29"/>
+          <w:sz w:val="28"/>
         </w:rPr>
         <w:t>四 发布决策流程</w:t>
       </w:r>
     </w:p>
     <w:p>
       <w:pPr>
-        <w:spacing w:after="80" w:line="298" w:lineRule="auto"/>
+        <w:spacing w:after="60" w:line="274" w:lineRule="auto"/>
         <w:ind w:left="432" w:hanging="288"/>
       </w:pPr>
       <w:r>
@@ -1363,7 +1449,7 @@
     </w:p>
     <w:p>
       <w:pPr>
-        <w:spacing w:after="80" w:line="298" w:lineRule="auto"/>
+        <w:spacing w:after="60" w:line="274" w:lineRule="auto"/>
         <w:ind w:left="432" w:hanging="288"/>
       </w:pPr>
       <w:r>
@@ -1378,7 +1464,7 @@
     </w:p>
     <w:p>
       <w:pPr>
-        <w:spacing w:after="80" w:line="298" w:lineRule="auto"/>
+        <w:spacing w:after="60" w:line="274" w:lineRule="auto"/>
         <w:ind w:left="432" w:hanging="288"/>
       </w:pPr>
       <w:r>
@@ -1393,7 +1479,7 @@
     </w:p>
     <w:p>
       <w:pPr>
-        <w:spacing w:after="80" w:line="298" w:lineRule="auto"/>
+        <w:spacing w:after="60" w:line="274" w:lineRule="auto"/>
         <w:ind w:left="432" w:hanging="288"/>
       </w:pPr>
       <w:r>
@@ -1408,7 +1494,7 @@
     </w:p>
     <w:p>
       <w:pPr>
-        <w:spacing w:after="80" w:line="298" w:lineRule="auto"/>
+        <w:spacing w:after="60" w:line="274" w:lineRule="auto"/>
         <w:ind w:left="432" w:hanging="288"/>
       </w:pPr>
       <w:r>
@@ -1418,12 +1504,12 @@
           <w:color w:val="1F1F1F"/>
           <w:sz w:val="21"/>
         </w:rPr>
-        <w:t>5. 对获准行执行 Keep、ReplaceUtf8 或 Drop，并默认删除未声明字段。</w:t>
+        <w:t>5. 在通过 k 匿名的固定候选集内检查指定敏感属性，不同非空值低于 l 的记录不得发布。</w:t>
       </w:r>
     </w:p>
     <w:p>
       <w:pPr>
-        <w:spacing w:after="80" w:line="298" w:lineRule="auto"/>
+        <w:spacing w:after="60" w:line="274" w:lineRule="auto"/>
         <w:ind w:left="432" w:hanging="288"/>
       </w:pPr>
       <w:r>
@@ -1433,12 +1519,27 @@
           <w:color w:val="1F1F1F"/>
           <w:sz w:val="21"/>
         </w:rPr>
-        <w:t>6. 输出获准、隔离、隐私发现和单行发布清单，供下游与审计共同使用。</w:t>
+        <w:t>6. 对获准行执行 Keep、ReplaceUtf8 或 Drop，并默认删除未声明字段。</w:t>
       </w:r>
     </w:p>
     <w:p>
       <w:pPr>
-        <w:spacing w:after="100" w:line="317" w:lineRule="auto"/>
+        <w:spacing w:after="60" w:line="274" w:lineRule="auto"/>
+        <w:ind w:left="432" w:hanging="288"/>
+      </w:pPr>
+      <w:r>
+        <w:rPr>
+          <w:rFonts w:ascii="Microsoft YaHei" w:hAnsi="Microsoft YaHei" w:eastAsia="Microsoft YaHei"/>
+          <w:b w:val="0"/>
+          <w:color w:val="1F1F1F"/>
+          <w:sz w:val="21"/>
+        </w:rPr>
+        <w:t>7. 输出获准、隔离、隐私发现和单行发布清单，供下游与审计共同使用。</w:t>
+      </w:r>
+    </w:p>
+    <w:p>
+      <w:pPr>
+        <w:spacing w:after="80" w:line="288" w:lineRule="auto"/>
         <w:ind w:firstLine="420"/>
       </w:pPr>
       <w:r>
@@ -1448,28 +1549,28 @@
           <w:color w:val="1F1F1F"/>
           <w:sz w:val="21"/>
         </w:rPr>
-        <w:t>策略采用 fail-closed 设计：直接标识符或敏感字段不能以 Keep 发布；准标识符必须保留并参与 k 匿名；缺失关键列、字段类型错误或请求与策略不匹配均阻断发布。发现明细可以截断，但拒绝计数保持准确。</w:t>
+        <w:t>策略采用 fail-closed 设计：直接标识符或敏感字段不能以 Keep 发布；准标识符必须保留并参与 k 匿名；l-diversity 列必须是 Sensitive UTF-8；缺失关键列、字段类型错误或请求与策略不匹配均阻断发布。发现明细可以截断，但拒绝计数保持准确。</w:t>
       </w:r>
     </w:p>
     <w:p>
       <w:pPr>
         <w:pStyle w:val="Heading1"/>
         <w:keepNext/>
-        <w:spacing w:before="240" w:after="100"/>
+        <w:spacing w:before="180" w:after="80"/>
       </w:pPr>
       <w:r>
         <w:rPr>
           <w:rFonts w:ascii="Microsoft YaHei" w:hAnsi="Microsoft YaHei" w:eastAsia="Microsoft YaHei"/>
           <w:b/>
           <w:color w:val="000000"/>
-          <w:sz w:val="29"/>
+          <w:sz w:val="28"/>
         </w:rPr>
         <w:t>五 可运行演示</w:t>
       </w:r>
     </w:p>
     <w:p>
       <w:pPr>
-        <w:spacing w:after="100" w:line="317" w:lineRule="auto"/>
+        <w:spacing w:after="80" w:line="288" w:lineRule="auto"/>
         <w:ind w:firstLine="420"/>
       </w:pPr>
       <w:r>
@@ -1479,7 +1580,7 @@
           <w:color w:val="1F1F1F"/>
           <w:sz w:val="21"/>
         </w:rPr>
-        <w:t>仓库演示申请把客户风控样本交给合作方，用途为 fraud_research。六行输入中四行满足同意与 k=2，两个不满足的记录被隔离，邮件字段替换为 [EMAIL]，未申报字段不会进入获准批次。</w:t>
+        <w:t>仓库演示申请把客户风控样本交给合作方，用途为 fraud_research。六行输入中四行满足同意、k=2 与 l=2，两个不满足的记录被隔离，邮件字段替换为 [EMAIL]，敏感结果列和未申报字段不会进入获准批次。</w:t>
       </w:r>
     </w:p>
     <w:p>
@@ -1506,7 +1607,17 @@
           <w:color w:val="202124"/>
           <w:sz w:val="17"/>
         </w:rPr>
-        <w:t>recipient=partner; rows=6; released=4; quarantined=2; denials=2; k=2</w:t>
+        <w:t>recipient=partner; rows=6; released=4; quarantined=2; denials=2;</w:t>
+        <w:br/>
+      </w:r>
+      <w:r>
+        <w:rPr>
+          <w:rFonts w:ascii="Consolas" w:hAnsi="Consolas" w:eastAsia="Consolas"/>
+          <w:b w:val="0"/>
+          <w:color w:val="202124"/>
+          <w:sz w:val="17"/>
+        </w:rPr>
+        <w:t>k=2; l=2; diversity=case_outcome; findings_shown=2; truncated=false</w:t>
         <w:br/>
       </w:r>
       <w:r>
@@ -1547,7 +1658,6 @@
           <w:sz w:val="17"/>
         </w:rPr>
         <w:t>Arrow IPC handoff: 1136 bytes, 4 released rows</w:t>
-        <w:br/>
       </w:r>
     </w:p>
     <w:p>
@@ -1564,7 +1674,7 @@
           <w:color w:val="202124"/>
           <w:sz w:val="17"/>
         </w:rPr>
-        <w:t>moon fmt --check</w:t>
+        <w:t>moon fmt --check &amp;&amp; moon check --target all --deny-warn</w:t>
         <w:br/>
       </w:r>
       <w:r>
@@ -1574,42 +1684,21 @@
           <w:color w:val="202124"/>
           <w:sz w:val="17"/>
         </w:rPr>
-        <w:t>moon check --target all --deny-warn</w:t>
-        <w:br/>
-      </w:r>
-      <w:r>
-        <w:rPr>
-          <w:rFonts w:ascii="Consolas" w:hAnsi="Consolas" w:eastAsia="Consolas"/>
-          <w:b w:val="0"/>
-          <w:color w:val="202124"/>
-          <w:sz w:val="17"/>
-        </w:rPr>
-        <w:t>moon test --target all --deny-warn</w:t>
-        <w:br/>
-      </w:r>
-      <w:r>
-        <w:rPr>
-          <w:rFonts w:ascii="Consolas" w:hAnsi="Consolas" w:eastAsia="Consolas"/>
-          <w:b w:val="0"/>
-          <w:color w:val="202124"/>
-          <w:sz w:val="17"/>
-        </w:rPr>
-        <w:t>moon run cmd/main --target native --deny-warn</w:t>
-        <w:br/>
+        <w:t>moon test --target all --deny-warn &amp;&amp; moon run cmd/main --target native --deny-warn</w:t>
       </w:r>
     </w:p>
     <w:p>
       <w:pPr>
         <w:pStyle w:val="Heading1"/>
         <w:keepNext/>
-        <w:spacing w:before="240" w:after="100"/>
+        <w:spacing w:before="180" w:after="80"/>
       </w:pPr>
       <w:r>
         <w:rPr>
           <w:rFonts w:ascii="Microsoft YaHei" w:hAnsi="Microsoft YaHei" w:eastAsia="Microsoft YaHei"/>
           <w:b/>
           <w:color w:val="000000"/>
-          <w:sz w:val="29"/>
+          <w:sz w:val="28"/>
         </w:rPr>
         <w:t>六 与 MoonVerity 的差异</w:t>
       </w:r>
@@ -1645,15 +1734,15 @@
             <w:shd w:fill="17365D"/>
             <w:vAlign w:val="center"/>
             <w:tcMar>
-              <w:top w:w="90" w:type="dxa"/>
-              <w:start w:w="110" w:type="dxa"/>
-              <w:bottom w:w="90" w:type="dxa"/>
-              <w:end w:w="110" w:type="dxa"/>
+              <w:top w:w="65" w:type="dxa"/>
+              <w:start w:w="105" w:type="dxa"/>
+              <w:bottom w:w="65" w:type="dxa"/>
+              <w:end w:w="105" w:type="dxa"/>
             </w:tcMar>
           </w:tcPr>
           <w:p>
             <w:pPr>
-              <w:spacing w:before="0" w:after="0" w:line="269" w:lineRule="auto"/>
+              <w:spacing w:before="0" w:after="0" w:line="254" w:lineRule="auto"/>
               <w:jc w:val="center"/>
             </w:pPr>
             <w:r>
@@ -1661,7 +1750,7 @@
                 <w:rFonts w:ascii="Microsoft YaHei" w:hAnsi="Microsoft YaHei" w:eastAsia="Microsoft YaHei"/>
                 <w:b/>
                 <w:color w:val="FFFFFF"/>
-                <w:sz w:val="19"/>
+                <w:sz w:val="18"/>
               </w:rPr>
               <w:t>维度</w:t>
             </w:r>
@@ -1673,15 +1762,15 @@
             <w:shd w:fill="17365D"/>
             <w:vAlign w:val="center"/>
             <w:tcMar>
-              <w:top w:w="90" w:type="dxa"/>
-              <w:start w:w="110" w:type="dxa"/>
-              <w:bottom w:w="90" w:type="dxa"/>
-              <w:end w:w="110" w:type="dxa"/>
+              <w:top w:w="65" w:type="dxa"/>
+              <w:start w:w="105" w:type="dxa"/>
+              <w:bottom w:w="65" w:type="dxa"/>
+              <w:end w:w="105" w:type="dxa"/>
             </w:tcMar>
           </w:tcPr>
           <w:p>
             <w:pPr>
-              <w:spacing w:before="0" w:after="0" w:line="269" w:lineRule="auto"/>
+              <w:spacing w:before="0" w:after="0" w:line="254" w:lineRule="auto"/>
               <w:jc w:val="center"/>
             </w:pPr>
             <w:r>
@@ -1689,7 +1778,7 @@
                 <w:rFonts w:ascii="Microsoft YaHei" w:hAnsi="Microsoft YaHei" w:eastAsia="Microsoft YaHei"/>
                 <w:b/>
                 <w:color w:val="FFFFFF"/>
-                <w:sz w:val="19"/>
+                <w:sz w:val="18"/>
               </w:rPr>
               <w:t>MoonVerity</w:t>
             </w:r>
@@ -1701,15 +1790,15 @@
             <w:shd w:fill="17365D"/>
             <w:vAlign w:val="center"/>
             <w:tcMar>
-              <w:top w:w="90" w:type="dxa"/>
-              <w:start w:w="110" w:type="dxa"/>
-              <w:bottom w:w="90" w:type="dxa"/>
-              <w:end w:w="110" w:type="dxa"/>
+              <w:top w:w="65" w:type="dxa"/>
+              <w:start w:w="105" w:type="dxa"/>
+              <w:bottom w:w="65" w:type="dxa"/>
+              <w:end w:w="105" w:type="dxa"/>
             </w:tcMar>
           </w:tcPr>
           <w:p>
             <w:pPr>
-              <w:spacing w:before="0" w:after="0" w:line="269" w:lineRule="auto"/>
+              <w:spacing w:before="0" w:after="0" w:line="254" w:lineRule="auto"/>
               <w:jc w:val="center"/>
             </w:pPr>
             <w:r>
@@ -1717,7 +1806,7 @@
                 <w:rFonts w:ascii="Microsoft YaHei" w:hAnsi="Microsoft YaHei" w:eastAsia="Microsoft YaHei"/>
                 <w:b/>
                 <w:color w:val="FFFFFF"/>
-                <w:sz w:val="19"/>
+                <w:sz w:val="18"/>
               </w:rPr>
               <w:t>MoonSentinel</w:t>
             </w:r>
@@ -1733,15 +1822,15 @@
             <w:tcW w:type="dxa" w:w="1728"/>
             <w:vAlign w:val="center"/>
             <w:tcMar>
-              <w:top w:w="90" w:type="dxa"/>
-              <w:start w:w="110" w:type="dxa"/>
-              <w:bottom w:w="90" w:type="dxa"/>
-              <w:end w:w="110" w:type="dxa"/>
+              <w:top w:w="65" w:type="dxa"/>
+              <w:start w:w="105" w:type="dxa"/>
+              <w:bottom w:w="65" w:type="dxa"/>
+              <w:end w:w="105" w:type="dxa"/>
             </w:tcMar>
           </w:tcPr>
           <w:p>
             <w:pPr>
-              <w:spacing w:before="0" w:after="0" w:line="269" w:lineRule="auto"/>
+              <w:spacing w:before="0" w:after="0" w:line="254" w:lineRule="auto"/>
               <w:jc w:val="left"/>
             </w:pPr>
             <w:r>
@@ -1749,7 +1838,7 @@
                 <w:rFonts w:ascii="Microsoft YaHei" w:hAnsi="Microsoft YaHei" w:eastAsia="Microsoft YaHei"/>
                 <w:b w:val="0"/>
                 <w:color w:val="1F1F1F"/>
-                <w:sz w:val="19"/>
+                <w:sz w:val="18"/>
               </w:rPr>
               <w:t>核心问题</w:t>
             </w:r>
@@ -1760,15 +1849,15 @@
             <w:tcW w:type="dxa" w:w="4104"/>
             <w:vAlign w:val="center"/>
             <w:tcMar>
-              <w:top w:w="90" w:type="dxa"/>
-              <w:start w:w="110" w:type="dxa"/>
-              <w:bottom w:w="90" w:type="dxa"/>
-              <w:end w:w="110" w:type="dxa"/>
+              <w:top w:w="65" w:type="dxa"/>
+              <w:start w:w="105" w:type="dxa"/>
+              <w:bottom w:w="65" w:type="dxa"/>
+              <w:end w:w="105" w:type="dxa"/>
             </w:tcMar>
           </w:tcPr>
           <w:p>
             <w:pPr>
-              <w:spacing w:before="0" w:after="0" w:line="269" w:lineRule="auto"/>
+              <w:spacing w:before="0" w:after="0" w:line="254" w:lineRule="auto"/>
               <w:jc w:val="left"/>
             </w:pPr>
             <w:r>
@@ -1776,7 +1865,7 @@
                 <w:rFonts w:ascii="Microsoft YaHei" w:hAnsi="Microsoft YaHei" w:eastAsia="Microsoft YaHei"/>
                 <w:b w:val="0"/>
                 <w:color w:val="1F1F1F"/>
-                <w:sz w:val="19"/>
+                <w:sz w:val="18"/>
               </w:rPr>
               <w:t>数据是否满足合同和质量规则</w:t>
             </w:r>
@@ -1787,15 +1876,15 @@
             <w:tcW w:type="dxa" w:w="4104"/>
             <w:vAlign w:val="center"/>
             <w:tcMar>
-              <w:top w:w="90" w:type="dxa"/>
-              <w:start w:w="110" w:type="dxa"/>
-              <w:bottom w:w="90" w:type="dxa"/>
-              <w:end w:w="110" w:type="dxa"/>
+              <w:top w:w="65" w:type="dxa"/>
+              <w:start w:w="105" w:type="dxa"/>
+              <w:bottom w:w="65" w:type="dxa"/>
+              <w:end w:w="105" w:type="dxa"/>
             </w:tcMar>
           </w:tcPr>
           <w:p>
             <w:pPr>
-              <w:spacing w:before="0" w:after="0" w:line="269" w:lineRule="auto"/>
+              <w:spacing w:before="0" w:after="0" w:line="254" w:lineRule="auto"/>
               <w:jc w:val="left"/>
             </w:pPr>
             <w:r>
@@ -1803,7 +1892,7 @@
                 <w:rFonts w:ascii="Microsoft YaHei" w:hAnsi="Microsoft YaHei" w:eastAsia="Microsoft YaHei"/>
                 <w:b w:val="0"/>
                 <w:color w:val="1F1F1F"/>
-                <w:sz w:val="19"/>
+                <w:sz w:val="18"/>
               </w:rPr>
               <w:t>数据能否因指定用途交给指定接收方</w:t>
             </w:r>
@@ -1820,15 +1909,15 @@
             <w:shd w:fill="F4F7FA"/>
             <w:vAlign w:val="center"/>
             <w:tcMar>
-              <w:top w:w="90" w:type="dxa"/>
-              <w:start w:w="110" w:type="dxa"/>
-              <w:bottom w:w="90" w:type="dxa"/>
-              <w:end w:w="110" w:type="dxa"/>
+              <w:top w:w="65" w:type="dxa"/>
+              <w:start w:w="105" w:type="dxa"/>
+              <w:bottom w:w="65" w:type="dxa"/>
+              <w:end w:w="105" w:type="dxa"/>
             </w:tcMar>
           </w:tcPr>
           <w:p>
             <w:pPr>
-              <w:spacing w:before="0" w:after="0" w:line="269" w:lineRule="auto"/>
+              <w:spacing w:before="0" w:after="0" w:line="254" w:lineRule="auto"/>
               <w:jc w:val="left"/>
             </w:pPr>
             <w:r>
@@ -1836,7 +1925,7 @@
                 <w:rFonts w:ascii="Microsoft YaHei" w:hAnsi="Microsoft YaHei" w:eastAsia="Microsoft YaHei"/>
                 <w:b w:val="0"/>
                 <w:color w:val="1F1F1F"/>
-                <w:sz w:val="19"/>
+                <w:sz w:val="18"/>
               </w:rPr>
               <w:t>输入</w:t>
             </w:r>
@@ -1848,15 +1937,15 @@
             <w:shd w:fill="F4F7FA"/>
             <w:vAlign w:val="center"/>
             <w:tcMar>
-              <w:top w:w="90" w:type="dxa"/>
-              <w:start w:w="110" w:type="dxa"/>
-              <w:bottom w:w="90" w:type="dxa"/>
-              <w:end w:w="110" w:type="dxa"/>
+              <w:top w:w="65" w:type="dxa"/>
+              <w:start w:w="105" w:type="dxa"/>
+              <w:bottom w:w="65" w:type="dxa"/>
+              <w:end w:w="105" w:type="dxa"/>
             </w:tcMar>
           </w:tcPr>
           <w:p>
             <w:pPr>
-              <w:spacing w:before="0" w:after="0" w:line="269" w:lineRule="auto"/>
+              <w:spacing w:before="0" w:after="0" w:line="254" w:lineRule="auto"/>
               <w:jc w:val="left"/>
             </w:pPr>
             <w:r>
@@ -1864,7 +1953,7 @@
                 <w:rFonts w:ascii="Microsoft YaHei" w:hAnsi="Microsoft YaHei" w:eastAsia="Microsoft YaHei"/>
                 <w:b w:val="0"/>
                 <w:color w:val="1F1F1F"/>
-                <w:sz w:val="19"/>
+                <w:sz w:val="18"/>
               </w:rPr>
               <w:t>CSV/JSONL 与数据合同</w:t>
             </w:r>
@@ -1876,15 +1965,15 @@
             <w:shd w:fill="F4F7FA"/>
             <w:vAlign w:val="center"/>
             <w:tcMar>
-              <w:top w:w="90" w:type="dxa"/>
-              <w:start w:w="110" w:type="dxa"/>
-              <w:bottom w:w="90" w:type="dxa"/>
-              <w:end w:w="110" w:type="dxa"/>
+              <w:top w:w="65" w:type="dxa"/>
+              <w:start w:w="105" w:type="dxa"/>
+              <w:bottom w:w="65" w:type="dxa"/>
+              <w:end w:w="105" w:type="dxa"/>
             </w:tcMar>
           </w:tcPr>
           <w:p>
             <w:pPr>
-              <w:spacing w:before="0" w:after="0" w:line="269" w:lineRule="auto"/>
+              <w:spacing w:before="0" w:after="0" w:line="254" w:lineRule="auto"/>
               <w:jc w:val="left"/>
             </w:pPr>
             <w:r>
@@ -1892,7 +1981,7 @@
                 <w:rFonts w:ascii="Microsoft YaHei" w:hAnsi="Microsoft YaHei" w:eastAsia="Microsoft YaHei"/>
                 <w:b w:val="0"/>
                 <w:color w:val="1F1F1F"/>
-                <w:sz w:val="19"/>
+                <w:sz w:val="18"/>
               </w:rPr>
               <w:t>Arrow RecordBatch、隐私策略与发布请求</w:t>
             </w:r>
@@ -1908,15 +1997,15 @@
             <w:tcW w:type="dxa" w:w="1728"/>
             <w:vAlign w:val="center"/>
             <w:tcMar>
-              <w:top w:w="90" w:type="dxa"/>
-              <w:start w:w="110" w:type="dxa"/>
-              <w:bottom w:w="90" w:type="dxa"/>
-              <w:end w:w="110" w:type="dxa"/>
+              <w:top w:w="65" w:type="dxa"/>
+              <w:start w:w="105" w:type="dxa"/>
+              <w:bottom w:w="65" w:type="dxa"/>
+              <w:end w:w="105" w:type="dxa"/>
             </w:tcMar>
           </w:tcPr>
           <w:p>
             <w:pPr>
-              <w:spacing w:before="0" w:after="0" w:line="269" w:lineRule="auto"/>
+              <w:spacing w:before="0" w:after="0" w:line="254" w:lineRule="auto"/>
               <w:jc w:val="left"/>
             </w:pPr>
             <w:r>
@@ -1924,7 +2013,7 @@
                 <w:rFonts w:ascii="Microsoft YaHei" w:hAnsi="Microsoft YaHei" w:eastAsia="Microsoft YaHei"/>
                 <w:b w:val="0"/>
                 <w:color w:val="1F1F1F"/>
-                <w:sz w:val="19"/>
+                <w:sz w:val="18"/>
               </w:rPr>
               <w:t>主要能力</w:t>
             </w:r>
@@ -1935,15 +2024,15 @@
             <w:tcW w:type="dxa" w:w="4104"/>
             <w:vAlign w:val="center"/>
             <w:tcMar>
-              <w:top w:w="90" w:type="dxa"/>
-              <w:start w:w="110" w:type="dxa"/>
-              <w:bottom w:w="90" w:type="dxa"/>
-              <w:end w:w="110" w:type="dxa"/>
+              <w:top w:w="65" w:type="dxa"/>
+              <w:start w:w="105" w:type="dxa"/>
+              <w:bottom w:w="65" w:type="dxa"/>
+              <w:end w:w="105" w:type="dxa"/>
             </w:tcMar>
           </w:tcPr>
           <w:p>
             <w:pPr>
-              <w:spacing w:before="0" w:after="0" w:line="269" w:lineRule="auto"/>
+              <w:spacing w:before="0" w:after="0" w:line="254" w:lineRule="auto"/>
               <w:jc w:val="left"/>
             </w:pPr>
             <w:r>
@@ -1951,7 +2040,7 @@
                 <w:rFonts w:ascii="Microsoft YaHei" w:hAnsi="Microsoft YaHei" w:eastAsia="Microsoft YaHei"/>
                 <w:b w:val="0"/>
                 <w:color w:val="1F1F1F"/>
-                <w:sz w:val="19"/>
+                <w:sz w:val="18"/>
               </w:rPr>
               <w:t>Required、类型、范围、枚举、唯一、画像、质量评分、合同差异</w:t>
             </w:r>
@@ -1962,15 +2051,15 @@
             <w:tcW w:type="dxa" w:w="4104"/>
             <w:vAlign w:val="center"/>
             <w:tcMar>
-              <w:top w:w="90" w:type="dxa"/>
-              <w:start w:w="110" w:type="dxa"/>
-              <w:bottom w:w="90" w:type="dxa"/>
-              <w:end w:w="110" w:type="dxa"/>
+              <w:top w:w="65" w:type="dxa"/>
+              <w:start w:w="105" w:type="dxa"/>
+              <w:bottom w:w="65" w:type="dxa"/>
+              <w:end w:w="105" w:type="dxa"/>
             </w:tcMar>
           </w:tcPr>
           <w:p>
             <w:pPr>
-              <w:spacing w:before="0" w:after="0" w:line="269" w:lineRule="auto"/>
+              <w:spacing w:before="0" w:after="0" w:line="254" w:lineRule="auto"/>
               <w:jc w:val="left"/>
             </w:pPr>
             <w:r>
@@ -1978,9 +2067,9 @@
                 <w:rFonts w:ascii="Microsoft YaHei" w:hAnsi="Microsoft YaHei" w:eastAsia="Microsoft YaHei"/>
                 <w:b w:val="0"/>
                 <w:color w:val="1F1F1F"/>
-                <w:sz w:val="19"/>
+                <w:sz w:val="18"/>
               </w:rPr>
-              <w:t>用途/接收方授权、逐行同意、k 匿名、字段最小化、敏感处理</w:t>
+              <w:t>用途/接收方授权、逐行同意、k 匿名、l-diversity、字段最小化</w:t>
             </w:r>
           </w:p>
         </w:tc>
@@ -1995,15 +2084,15 @@
             <w:shd w:fill="F4F7FA"/>
             <w:vAlign w:val="center"/>
             <w:tcMar>
-              <w:top w:w="90" w:type="dxa"/>
-              <w:start w:w="110" w:type="dxa"/>
-              <w:bottom w:w="90" w:type="dxa"/>
-              <w:end w:w="110" w:type="dxa"/>
+              <w:top w:w="65" w:type="dxa"/>
+              <w:start w:w="105" w:type="dxa"/>
+              <w:bottom w:w="65" w:type="dxa"/>
+              <w:end w:w="105" w:type="dxa"/>
             </w:tcMar>
           </w:tcPr>
           <w:p>
             <w:pPr>
-              <w:spacing w:before="0" w:after="0" w:line="269" w:lineRule="auto"/>
+              <w:spacing w:before="0" w:after="0" w:line="254" w:lineRule="auto"/>
               <w:jc w:val="left"/>
             </w:pPr>
             <w:r>
@@ -2011,7 +2100,7 @@
                 <w:rFonts w:ascii="Microsoft YaHei" w:hAnsi="Microsoft YaHei" w:eastAsia="Microsoft YaHei"/>
                 <w:b w:val="0"/>
                 <w:color w:val="1F1F1F"/>
-                <w:sz w:val="19"/>
+                <w:sz w:val="18"/>
               </w:rPr>
               <w:t>处置结果</w:t>
             </w:r>
@@ -2023,15 +2112,15 @@
             <w:shd w:fill="F4F7FA"/>
             <w:vAlign w:val="center"/>
             <w:tcMar>
-              <w:top w:w="90" w:type="dxa"/>
-              <w:start w:w="110" w:type="dxa"/>
-              <w:bottom w:w="90" w:type="dxa"/>
-              <w:end w:w="110" w:type="dxa"/>
+              <w:top w:w="65" w:type="dxa"/>
+              <w:start w:w="105" w:type="dxa"/>
+              <w:bottom w:w="65" w:type="dxa"/>
+              <w:end w:w="105" w:type="dxa"/>
             </w:tcMar>
           </w:tcPr>
           <w:p>
             <w:pPr>
-              <w:spacing w:before="0" w:after="0" w:line="269" w:lineRule="auto"/>
+              <w:spacing w:before="0" w:after="0" w:line="254" w:lineRule="auto"/>
               <w:jc w:val="left"/>
             </w:pPr>
             <w:r>
@@ -2039,7 +2128,7 @@
                 <w:rFonts w:ascii="Microsoft YaHei" w:hAnsi="Microsoft YaHei" w:eastAsia="Microsoft YaHei"/>
                 <w:b w:val="0"/>
                 <w:color w:val="1F1F1F"/>
-                <w:sz w:val="19"/>
+                <w:sz w:val="18"/>
               </w:rPr>
               <w:t>文本或 JSON 质量报告</w:t>
             </w:r>
@@ -2051,15 +2140,15 @@
             <w:shd w:fill="F4F7FA"/>
             <w:vAlign w:val="center"/>
             <w:tcMar>
-              <w:top w:w="90" w:type="dxa"/>
-              <w:start w:w="110" w:type="dxa"/>
-              <w:bottom w:w="90" w:type="dxa"/>
-              <w:end w:w="110" w:type="dxa"/>
+              <w:top w:w="65" w:type="dxa"/>
+              <w:start w:w="105" w:type="dxa"/>
+              <w:bottom w:w="65" w:type="dxa"/>
+              <w:end w:w="105" w:type="dxa"/>
             </w:tcMar>
           </w:tcPr>
           <w:p>
             <w:pPr>
-              <w:spacing w:before="0" w:after="0" w:line="269" w:lineRule="auto"/>
+              <w:spacing w:before="0" w:after="0" w:line="254" w:lineRule="auto"/>
               <w:jc w:val="left"/>
             </w:pPr>
             <w:r>
@@ -2067,7 +2156,7 @@
                 <w:rFonts w:ascii="Microsoft YaHei" w:hAnsi="Microsoft YaHei" w:eastAsia="Microsoft YaHei"/>
                 <w:b w:val="0"/>
                 <w:color w:val="1F1F1F"/>
-                <w:sz w:val="19"/>
+                <w:sz w:val="18"/>
               </w:rPr>
               <w:t>获准、隔离、隐私发现、发布清单四类 Arrow 批次</w:t>
             </w:r>
@@ -2083,15 +2172,15 @@
             <w:tcW w:type="dxa" w:w="1728"/>
             <w:vAlign w:val="center"/>
             <w:tcMar>
-              <w:top w:w="90" w:type="dxa"/>
-              <w:start w:w="110" w:type="dxa"/>
-              <w:bottom w:w="90" w:type="dxa"/>
-              <w:end w:w="110" w:type="dxa"/>
+              <w:top w:w="65" w:type="dxa"/>
+              <w:start w:w="105" w:type="dxa"/>
+              <w:bottom w:w="65" w:type="dxa"/>
+              <w:end w:w="105" w:type="dxa"/>
             </w:tcMar>
           </w:tcPr>
           <w:p>
             <w:pPr>
-              <w:spacing w:before="0" w:after="0" w:line="269" w:lineRule="auto"/>
+              <w:spacing w:before="0" w:after="0" w:line="254" w:lineRule="auto"/>
               <w:jc w:val="left"/>
             </w:pPr>
             <w:r>
@@ -2099,7 +2188,7 @@
                 <w:rFonts w:ascii="Microsoft YaHei" w:hAnsi="Microsoft YaHei" w:eastAsia="Microsoft YaHei"/>
                 <w:b w:val="0"/>
                 <w:color w:val="1F1F1F"/>
-                <w:sz w:val="19"/>
+                <w:sz w:val="18"/>
               </w:rPr>
               <w:t>决策粒度</w:t>
             </w:r>
@@ -2110,15 +2199,15 @@
             <w:tcW w:type="dxa" w:w="4104"/>
             <w:vAlign w:val="center"/>
             <w:tcMar>
-              <w:top w:w="90" w:type="dxa"/>
-              <w:start w:w="110" w:type="dxa"/>
-              <w:bottom w:w="90" w:type="dxa"/>
-              <w:end w:w="110" w:type="dxa"/>
+              <w:top w:w="65" w:type="dxa"/>
+              <w:start w:w="105" w:type="dxa"/>
+              <w:bottom w:w="65" w:type="dxa"/>
+              <w:end w:w="105" w:type="dxa"/>
             </w:tcMar>
           </w:tcPr>
           <w:p>
             <w:pPr>
-              <w:spacing w:before="0" w:after="0" w:line="269" w:lineRule="auto"/>
+              <w:spacing w:before="0" w:after="0" w:line="254" w:lineRule="auto"/>
               <w:jc w:val="left"/>
             </w:pPr>
             <w:r>
@@ -2126,7 +2215,7 @@
                 <w:rFonts w:ascii="Microsoft YaHei" w:hAnsi="Microsoft YaHei" w:eastAsia="Microsoft YaHei"/>
                 <w:b w:val="0"/>
                 <w:color w:val="1F1F1F"/>
-                <w:sz w:val="19"/>
+                <w:sz w:val="18"/>
               </w:rPr>
               <w:t>字段与行的质量合格性</w:t>
             </w:r>
@@ -2137,15 +2226,15 @@
             <w:tcW w:type="dxa" w:w="4104"/>
             <w:vAlign w:val="center"/>
             <w:tcMar>
-              <w:top w:w="90" w:type="dxa"/>
-              <w:start w:w="110" w:type="dxa"/>
-              <w:bottom w:w="90" w:type="dxa"/>
-              <w:end w:w="110" w:type="dxa"/>
+              <w:top w:w="65" w:type="dxa"/>
+              <w:start w:w="105" w:type="dxa"/>
+              <w:bottom w:w="65" w:type="dxa"/>
+              <w:end w:w="105" w:type="dxa"/>
             </w:tcMar>
           </w:tcPr>
           <w:p>
             <w:pPr>
-              <w:spacing w:before="0" w:after="0" w:line="269" w:lineRule="auto"/>
+              <w:spacing w:before="0" w:after="0" w:line="254" w:lineRule="auto"/>
               <w:jc w:val="left"/>
             </w:pPr>
             <w:r>
@@ -2153,7 +2242,7 @@
                 <w:rFonts w:ascii="Microsoft YaHei" w:hAnsi="Microsoft YaHei" w:eastAsia="Microsoft YaHei"/>
                 <w:b w:val="0"/>
                 <w:color w:val="1F1F1F"/>
-                <w:sz w:val="19"/>
+                <w:sz w:val="18"/>
               </w:rPr>
               <w:t>请求级授权与记录级隐私资格</w:t>
             </w:r>
@@ -2170,15 +2259,15 @@
             <w:shd w:fill="F4F7FA"/>
             <w:vAlign w:val="center"/>
             <w:tcMar>
-              <w:top w:w="90" w:type="dxa"/>
-              <w:start w:w="110" w:type="dxa"/>
-              <w:bottom w:w="90" w:type="dxa"/>
-              <w:end w:w="110" w:type="dxa"/>
+              <w:top w:w="65" w:type="dxa"/>
+              <w:start w:w="105" w:type="dxa"/>
+              <w:bottom w:w="65" w:type="dxa"/>
+              <w:end w:w="105" w:type="dxa"/>
             </w:tcMar>
           </w:tcPr>
           <w:p>
             <w:pPr>
-              <w:spacing w:before="0" w:after="0" w:line="269" w:lineRule="auto"/>
+              <w:spacing w:before="0" w:after="0" w:line="254" w:lineRule="auto"/>
               <w:jc w:val="left"/>
             </w:pPr>
             <w:r>
@@ -2186,7 +2275,7 @@
                 <w:rFonts w:ascii="Microsoft YaHei" w:hAnsi="Microsoft YaHei" w:eastAsia="Microsoft YaHei"/>
                 <w:b w:val="0"/>
                 <w:color w:val="1F1F1F"/>
-                <w:sz w:val="19"/>
+                <w:sz w:val="18"/>
               </w:rPr>
               <w:t>明确不做</w:t>
             </w:r>
@@ -2198,15 +2287,15 @@
             <w:shd w:fill="F4F7FA"/>
             <w:vAlign w:val="center"/>
             <w:tcMar>
-              <w:top w:w="90" w:type="dxa"/>
-              <w:start w:w="110" w:type="dxa"/>
-              <w:bottom w:w="90" w:type="dxa"/>
-              <w:end w:w="110" w:type="dxa"/>
+              <w:top w:w="65" w:type="dxa"/>
+              <w:start w:w="105" w:type="dxa"/>
+              <w:bottom w:w="65" w:type="dxa"/>
+              <w:end w:w="105" w:type="dxa"/>
             </w:tcMar>
           </w:tcPr>
           <w:p>
             <w:pPr>
-              <w:spacing w:before="0" w:after="0" w:line="269" w:lineRule="auto"/>
+              <w:spacing w:before="0" w:after="0" w:line="254" w:lineRule="auto"/>
               <w:jc w:val="left"/>
             </w:pPr>
             <w:r>
@@ -2214,7 +2303,7 @@
                 <w:rFonts w:ascii="Microsoft YaHei" w:hAnsi="Microsoft YaHei" w:eastAsia="Microsoft YaHei"/>
                 <w:b w:val="0"/>
                 <w:color w:val="1F1F1F"/>
-                <w:sz w:val="19"/>
+                <w:sz w:val="18"/>
               </w:rPr>
               <w:t>—</w:t>
             </w:r>
@@ -2226,15 +2315,15 @@
             <w:shd w:fill="F4F7FA"/>
             <w:vAlign w:val="center"/>
             <w:tcMar>
-              <w:top w:w="90" w:type="dxa"/>
-              <w:start w:w="110" w:type="dxa"/>
-              <w:bottom w:w="90" w:type="dxa"/>
-              <w:end w:w="110" w:type="dxa"/>
+              <w:top w:w="65" w:type="dxa"/>
+              <w:start w:w="105" w:type="dxa"/>
+              <w:bottom w:w="65" w:type="dxa"/>
+              <w:end w:w="105" w:type="dxa"/>
             </w:tcMar>
           </w:tcPr>
           <w:p>
             <w:pPr>
-              <w:spacing w:before="0" w:after="0" w:line="269" w:lineRule="auto"/>
+              <w:spacing w:before="0" w:after="0" w:line="254" w:lineRule="auto"/>
               <w:jc w:val="left"/>
             </w:pPr>
             <w:r>
@@ -2242,7 +2331,7 @@
                 <w:rFonts w:ascii="Microsoft YaHei" w:hAnsi="Microsoft YaHei" w:eastAsia="Microsoft YaHei"/>
                 <w:b w:val="0"/>
                 <w:color w:val="1F1F1F"/>
-                <w:sz w:val="19"/>
+                <w:sz w:val="18"/>
               </w:rPr>
               <w:t>通用质量合同、Profile、Contract Diff、CSV/JSONL CLI</w:t>
             </w:r>
@@ -2257,7 +2346,7 @@
     </w:p>
     <w:p>
       <w:pPr>
-        <w:spacing w:after="100" w:line="317" w:lineRule="auto"/>
+        <w:spacing w:after="80" w:line="288" w:lineRule="auto"/>
         <w:ind w:firstLine="420"/>
       </w:pPr>
       <w:r>
@@ -2272,7 +2361,7 @@
     </w:p>
     <w:p>
       <w:pPr>
-        <w:spacing w:after="100" w:line="317" w:lineRule="auto"/>
+        <w:spacing w:after="80" w:line="288" w:lineRule="auto"/>
         <w:ind w:firstLine="420"/>
       </w:pPr>
       <w:r>
@@ -2282,28 +2371,28 @@
           <w:color w:val="1F1F1F"/>
           <w:sz w:val="21"/>
         </w:rPr>
-        <w:t>对 GitHub 公开仓库进一步检索 MoonBit privacy gate、anonymization 和 k-anonymity，未发现与当前组合相同的 MoonBit 实现。该结论基于截至 2026 年 9 月 20 日可检索到的公开内容；后续新增项目仍将按同一清单复核。</w:t>
+        <w:t>2026 年 9 月 21 日扩展检索 GitHub，并核查 MoonRedact、moonbit-fhir、moon-privacy-budget、MoonTrustFlow、MoonLogfmt Lens 与 PhotoPrivacy；未发现同时实现 Arrow 发布请求、逐行同意、k 匿名、l-diversity 和四类 Arrow 输出的 MoonBit 项目。</w:t>
       </w:r>
     </w:p>
     <w:p>
       <w:pPr>
         <w:pStyle w:val="Heading1"/>
         <w:keepNext/>
-        <w:spacing w:before="240" w:after="100"/>
+        <w:spacing w:before="180" w:after="80"/>
       </w:pPr>
       <w:r>
         <w:rPr>
           <w:rFonts w:ascii="Microsoft YaHei" w:hAnsi="Microsoft YaHei" w:eastAsia="Microsoft YaHei"/>
           <w:b/>
           <w:color w:val="000000"/>
-          <w:sz w:val="29"/>
+          <w:sz w:val="28"/>
         </w:rPr>
         <w:t>七 创新点和应用价值</w:t>
       </w:r>
     </w:p>
     <w:p>
       <w:pPr>
-        <w:spacing w:after="80" w:line="298" w:lineRule="auto"/>
+        <w:spacing w:after="60" w:line="274" w:lineRule="auto"/>
         <w:ind w:left="432" w:hanging="288"/>
       </w:pPr>
       <w:r>
@@ -2318,7 +2407,7 @@
     </w:p>
     <w:p>
       <w:pPr>
-        <w:spacing w:after="80" w:line="298" w:lineRule="auto"/>
+        <w:spacing w:after="60" w:line="274" w:lineRule="auto"/>
         <w:ind w:left="432" w:hanging="288"/>
       </w:pPr>
       <w:r>
@@ -2333,7 +2422,7 @@
     </w:p>
     <w:p>
       <w:pPr>
-        <w:spacing w:after="80" w:line="298" w:lineRule="auto"/>
+        <w:spacing w:after="60" w:line="274" w:lineRule="auto"/>
         <w:ind w:left="432" w:hanging="288"/>
       </w:pPr>
       <w:r>
@@ -2343,12 +2432,12 @@
           <w:color w:val="1F1F1F"/>
           <w:sz w:val="21"/>
         </w:rPr>
-        <w:t>3. 数据分类和处理方式在策略校验阶段强绑定，敏感原值不能误配置为直接发布。</w:t>
+        <w:t>3. l-diversity 在通过 k 匿名的固定候选集上运行，避免匿名组泄露过于单一的敏感属性。</w:t>
       </w:r>
     </w:p>
     <w:p>
       <w:pPr>
-        <w:spacing w:after="80" w:line="298" w:lineRule="auto"/>
+        <w:spacing w:after="60" w:line="274" w:lineRule="auto"/>
         <w:ind w:left="432" w:hanging="288"/>
       </w:pPr>
       <w:r>
@@ -2358,12 +2447,12 @@
           <w:color w:val="1F1F1F"/>
           <w:sz w:val="21"/>
         </w:rPr>
-        <w:t>4. 默认不发布未声明字段，以数据最小化代替事后依赖人工删列。</w:t>
+        <w:t>4. 数据分类和处理方式在策略校验阶段强绑定，敏感原值不能误配置为直接发布。</w:t>
       </w:r>
     </w:p>
     <w:p>
       <w:pPr>
-        <w:spacing w:after="80" w:line="298" w:lineRule="auto"/>
+        <w:spacing w:after="60" w:line="274" w:lineRule="auto"/>
         <w:ind w:left="432" w:hanging="288"/>
       </w:pPr>
       <w:r>
@@ -2373,28 +2462,43 @@
           <w:color w:val="1F1F1F"/>
           <w:sz w:val="21"/>
         </w:rPr>
-        <w:t>5. 发布数据与审计证据均为 Arrow，便于 Wasm、浏览器和分析管道直接交接。</w:t>
+        <w:t>5. 默认不发布未声明字段，以数据最小化代替事后依赖人工删列。</w:t>
+      </w:r>
+    </w:p>
+    <w:p>
+      <w:pPr>
+        <w:spacing w:after="60" w:line="274" w:lineRule="auto"/>
+        <w:ind w:left="432" w:hanging="288"/>
+      </w:pPr>
+      <w:r>
+        <w:rPr>
+          <w:rFonts w:ascii="Microsoft YaHei" w:hAnsi="Microsoft YaHei" w:eastAsia="Microsoft YaHei"/>
+          <w:b w:val="0"/>
+          <w:color w:val="1F1F1F"/>
+          <w:sz w:val="21"/>
+        </w:rPr>
+        <w:t>6. 发布数据与审计证据均为 Arrow，便于 Wasm、浏览器和分析管道直接交接。</w:t>
       </w:r>
     </w:p>
     <w:p>
       <w:pPr>
         <w:pStyle w:val="Heading1"/>
         <w:keepNext/>
-        <w:spacing w:before="240" w:after="100"/>
+        <w:spacing w:before="180" w:after="80"/>
       </w:pPr>
       <w:r>
         <w:rPr>
           <w:rFonts w:ascii="Microsoft YaHei" w:hAnsi="Microsoft YaHei" w:eastAsia="Microsoft YaHei"/>
           <w:b/>
           <w:color w:val="000000"/>
-          <w:sz w:val="29"/>
+          <w:sz w:val="28"/>
         </w:rPr>
         <w:t>八 原创和依赖边界</w:t>
       </w:r>
     </w:p>
     <w:p>
       <w:pPr>
-        <w:spacing w:after="100" w:line="317" w:lineRule="auto"/>
+        <w:spacing w:after="80" w:line="288" w:lineRule="auto"/>
         <w:ind w:firstLine="420"/>
       </w:pPr>
       <w:r>
@@ -2404,12 +2508,12 @@
           <w:color w:val="1F1F1F"/>
           <w:sz w:val="21"/>
         </w:rPr>
-        <w:t>本仓库原创实现隐私策略校验、请求授权、逐行同意、候选集内 k 匿名、数据最小化、字段处理、拒绝原因和发布清单。Arrow Schema、Column、RecordBatch 及 IPC 编解码来自公开依赖 shunge/arrow@0.1.0，不作为原创成果申报。</w:t>
+        <w:t>本仓库原创实现隐私策略校验、请求授权、逐行同意、候选集内 k 匿名、敏感属性 l-diversity、数据最小化、字段处理、拒绝原因和发布清单。Arrow Schema、Column、RecordBatch 及 IPC 编解码来自公开依赖 shunge/arrow@0.1.0，不作为原创成果申报。</w:t>
       </w:r>
     </w:p>
     <w:p>
       <w:pPr>
-        <w:spacing w:after="100" w:line="317" w:lineRule="auto"/>
+        <w:spacing w:after="80" w:line="288" w:lineRule="auto"/>
         <w:ind w:firstLine="420"/>
       </w:pPr>
       <w:r>
@@ -2426,14 +2530,14 @@
       <w:pPr>
         <w:pStyle w:val="Heading1"/>
         <w:keepNext/>
-        <w:spacing w:before="240" w:after="100"/>
+        <w:spacing w:before="180" w:after="80"/>
       </w:pPr>
       <w:r>
         <w:rPr>
           <w:rFonts w:ascii="Microsoft YaHei" w:hAnsi="Microsoft YaHei" w:eastAsia="Microsoft YaHei"/>
           <w:b/>
           <w:color w:val="000000"/>
-          <w:sz w:val="29"/>
+          <w:sz w:val="28"/>
         </w:rPr>
         <w:t>九 当前限制和路线</w:t>
       </w:r>
@@ -2441,7 +2545,7 @@
     <w:p>
       <w:pPr>
         <w:pStyle w:val="ListBullet"/>
-        <w:spacing w:after="60" w:line="293" w:lineRule="auto"/>
+        <w:spacing w:after="40" w:line="278" w:lineRule="auto"/>
         <w:ind w:left="389" w:hanging="216"/>
       </w:pPr>
       <w:r>
@@ -2451,13 +2555,13 @@
           <w:color w:val="1F1F1F"/>
           <w:sz w:val="21"/>
         </w:rPr>
-        <w:t>当前 k 匿名作用于单个 RecordBatch，尚未支持跨批次累计。</w:t>
+        <w:t>当前 k 匿名和 l-diversity 作用于单个 RecordBatch；l-diversity 只支持 UTF-8 敏感属性，空值不计入不同值数量。</w:t>
       </w:r>
     </w:p>
     <w:p>
       <w:pPr>
         <w:pStyle w:val="ListBullet"/>
-        <w:spacing w:after="60" w:line="293" w:lineRule="auto"/>
+        <w:spacing w:after="40" w:line="278" w:lineRule="auto"/>
         <w:ind w:left="389" w:hanging="216"/>
       </w:pPr>
       <w:r>
@@ -2473,7 +2577,7 @@
     <w:p>
       <w:pPr>
         <w:pStyle w:val="ListBullet"/>
-        <w:spacing w:after="60" w:line="293" w:lineRule="auto"/>
+        <w:spacing w:after="40" w:line="278" w:lineRule="auto"/>
         <w:ind w:left="389" w:hanging="216"/>
       </w:pPr>
       <w:r>
@@ -2483,29 +2587,13 @@
           <w:color w:val="1F1F1F"/>
           <w:sz w:val="21"/>
         </w:rPr>
-        <w:t>当前等价类实现优先保证确定性与可审计性，超大批次仍需哈希索引和基准优化。</w:t>
+        <w:t>下一阶段计划增加 t-closeness、策略版本签名和可验证发布清单。</w:t>
       </w:r>
     </w:p>
     <w:p>
       <w:pPr>
         <w:pStyle w:val="ListBullet"/>
-        <w:spacing w:after="60" w:line="293" w:lineRule="auto"/>
-        <w:ind w:left="389" w:hanging="216"/>
-      </w:pPr>
-      <w:r>
-        <w:rPr>
-          <w:rFonts w:ascii="Microsoft YaHei" w:hAnsi="Microsoft YaHei" w:eastAsia="Microsoft YaHei"/>
-          <w:b w:val="0"/>
-          <w:color w:val="1F1F1F"/>
-          <w:sz w:val="21"/>
-        </w:rPr>
-        <w:t>下一阶段计划增加 l-diversity、策略版本签名和可验证发布清单。</w:t>
-      </w:r>
-    </w:p>
-    <w:p>
-      <w:pPr>
-        <w:pStyle w:val="ListBullet"/>
-        <w:spacing w:after="60" w:line="293" w:lineRule="auto"/>
+        <w:spacing w:after="40" w:line="278" w:lineRule="auto"/>
         <w:ind w:left="389" w:hanging="216"/>
       </w:pPr>
       <w:r>
@@ -2522,14 +2610,14 @@
       <w:pPr>
         <w:pStyle w:val="Heading1"/>
         <w:keepNext/>
-        <w:spacing w:before="240" w:after="100"/>
+        <w:spacing w:before="180" w:after="80"/>
       </w:pPr>
       <w:r>
         <w:rPr>
           <w:rFonts w:ascii="Microsoft YaHei" w:hAnsi="Microsoft YaHei" w:eastAsia="Microsoft YaHei"/>
           <w:b/>
           <w:color w:val="000000"/>
-          <w:sz w:val="29"/>
+          <w:sz w:val="28"/>
         </w:rPr>
         <w:t>十 验收标准</w:t>
       </w:r>
@@ -2565,15 +2653,15 @@
             <w:shd w:fill="17365D"/>
             <w:vAlign w:val="center"/>
             <w:tcMar>
-              <w:top w:w="90" w:type="dxa"/>
-              <w:start w:w="110" w:type="dxa"/>
-              <w:bottom w:w="90" w:type="dxa"/>
-              <w:end w:w="110" w:type="dxa"/>
+              <w:top w:w="65" w:type="dxa"/>
+              <w:start w:w="105" w:type="dxa"/>
+              <w:bottom w:w="65" w:type="dxa"/>
+              <w:end w:w="105" w:type="dxa"/>
             </w:tcMar>
           </w:tcPr>
           <w:p>
             <w:pPr>
-              <w:spacing w:before="0" w:after="0" w:line="269" w:lineRule="auto"/>
+              <w:spacing w:before="0" w:after="0" w:line="254" w:lineRule="auto"/>
               <w:jc w:val="center"/>
             </w:pPr>
             <w:r>
@@ -2581,7 +2669,7 @@
                 <w:rFonts w:ascii="Microsoft YaHei" w:hAnsi="Microsoft YaHei" w:eastAsia="Microsoft YaHei"/>
                 <w:b/>
                 <w:color w:val="FFFFFF"/>
-                <w:sz w:val="19"/>
+                <w:sz w:val="18"/>
               </w:rPr>
               <w:t>编号</w:t>
             </w:r>
@@ -2593,15 +2681,15 @@
             <w:shd w:fill="17365D"/>
             <w:vAlign w:val="center"/>
             <w:tcMar>
-              <w:top w:w="90" w:type="dxa"/>
-              <w:start w:w="110" w:type="dxa"/>
-              <w:bottom w:w="90" w:type="dxa"/>
-              <w:end w:w="110" w:type="dxa"/>
+              <w:top w:w="65" w:type="dxa"/>
+              <w:start w:w="105" w:type="dxa"/>
+              <w:bottom w:w="65" w:type="dxa"/>
+              <w:end w:w="105" w:type="dxa"/>
             </w:tcMar>
           </w:tcPr>
           <w:p>
             <w:pPr>
-              <w:spacing w:before="0" w:after="0" w:line="269" w:lineRule="auto"/>
+              <w:spacing w:before="0" w:after="0" w:line="254" w:lineRule="auto"/>
               <w:jc w:val="center"/>
             </w:pPr>
             <w:r>
@@ -2609,7 +2697,7 @@
                 <w:rFonts w:ascii="Microsoft YaHei" w:hAnsi="Microsoft YaHei" w:eastAsia="Microsoft YaHei"/>
                 <w:b/>
                 <w:color w:val="FFFFFF"/>
-                <w:sz w:val="19"/>
+                <w:sz w:val="18"/>
               </w:rPr>
               <w:t>验收项</w:t>
             </w:r>
@@ -2621,15 +2709,15 @@
             <w:shd w:fill="17365D"/>
             <w:vAlign w:val="center"/>
             <w:tcMar>
-              <w:top w:w="90" w:type="dxa"/>
-              <w:start w:w="110" w:type="dxa"/>
-              <w:bottom w:w="90" w:type="dxa"/>
-              <w:end w:w="110" w:type="dxa"/>
+              <w:top w:w="65" w:type="dxa"/>
+              <w:start w:w="105" w:type="dxa"/>
+              <w:bottom w:w="65" w:type="dxa"/>
+              <w:end w:w="105" w:type="dxa"/>
             </w:tcMar>
           </w:tcPr>
           <w:p>
             <w:pPr>
-              <w:spacing w:before="0" w:after="0" w:line="269" w:lineRule="auto"/>
+              <w:spacing w:before="0" w:after="0" w:line="254" w:lineRule="auto"/>
               <w:jc w:val="center"/>
             </w:pPr>
             <w:r>
@@ -2637,7 +2725,7 @@
                 <w:rFonts w:ascii="Microsoft YaHei" w:hAnsi="Microsoft YaHei" w:eastAsia="Microsoft YaHei"/>
                 <w:b/>
                 <w:color w:val="FFFFFF"/>
-                <w:sz w:val="19"/>
+                <w:sz w:val="18"/>
               </w:rPr>
               <w:t>通过条件</w:t>
             </w:r>
@@ -2653,15 +2741,15 @@
             <w:tcW w:type="dxa" w:w="792"/>
             <w:vAlign w:val="center"/>
             <w:tcMar>
-              <w:top w:w="90" w:type="dxa"/>
-              <w:start w:w="110" w:type="dxa"/>
-              <w:bottom w:w="90" w:type="dxa"/>
-              <w:end w:w="110" w:type="dxa"/>
+              <w:top w:w="65" w:type="dxa"/>
+              <w:start w:w="105" w:type="dxa"/>
+              <w:bottom w:w="65" w:type="dxa"/>
+              <w:end w:w="105" w:type="dxa"/>
             </w:tcMar>
           </w:tcPr>
           <w:p>
             <w:pPr>
-              <w:spacing w:before="0" w:after="0" w:line="269" w:lineRule="auto"/>
+              <w:spacing w:before="0" w:after="0" w:line="254" w:lineRule="auto"/>
               <w:jc w:val="center"/>
             </w:pPr>
             <w:r>
@@ -2669,7 +2757,7 @@
                 <w:rFonts w:ascii="Microsoft YaHei" w:hAnsi="Microsoft YaHei" w:eastAsia="Microsoft YaHei"/>
                 <w:b w:val="0"/>
                 <w:color w:val="1F1F1F"/>
-                <w:sz w:val="19"/>
+                <w:sz w:val="18"/>
               </w:rPr>
               <w:t>1</w:t>
             </w:r>
@@ -2680,15 +2768,15 @@
             <w:tcW w:type="dxa" w:w="2520"/>
             <w:vAlign w:val="center"/>
             <w:tcMar>
-              <w:top w:w="90" w:type="dxa"/>
-              <w:start w:w="110" w:type="dxa"/>
-              <w:bottom w:w="90" w:type="dxa"/>
-              <w:end w:w="110" w:type="dxa"/>
+              <w:top w:w="65" w:type="dxa"/>
+              <w:start w:w="105" w:type="dxa"/>
+              <w:bottom w:w="65" w:type="dxa"/>
+              <w:end w:w="105" w:type="dxa"/>
             </w:tcMar>
           </w:tcPr>
           <w:p>
             <w:pPr>
-              <w:spacing w:before="0" w:after="0" w:line="269" w:lineRule="auto"/>
+              <w:spacing w:before="0" w:after="0" w:line="254" w:lineRule="auto"/>
               <w:jc w:val="left"/>
             </w:pPr>
             <w:r>
@@ -2696,7 +2784,7 @@
                 <w:rFonts w:ascii="Microsoft YaHei" w:hAnsi="Microsoft YaHei" w:eastAsia="Microsoft YaHei"/>
                 <w:b w:val="0"/>
                 <w:color w:val="1F1F1F"/>
-                <w:sz w:val="19"/>
+                <w:sz w:val="18"/>
               </w:rPr>
               <w:t>差异化接口</w:t>
             </w:r>
@@ -2707,15 +2795,15 @@
             <w:tcW w:type="dxa" w:w="6696"/>
             <w:vAlign w:val="center"/>
             <w:tcMar>
-              <w:top w:w="90" w:type="dxa"/>
-              <w:start w:w="110" w:type="dxa"/>
-              <w:bottom w:w="90" w:type="dxa"/>
-              <w:end w:w="110" w:type="dxa"/>
+              <w:top w:w="65" w:type="dxa"/>
+              <w:start w:w="105" w:type="dxa"/>
+              <w:bottom w:w="65" w:type="dxa"/>
+              <w:end w:w="105" w:type="dxa"/>
             </w:tcMar>
           </w:tcPr>
           <w:p>
             <w:pPr>
-              <w:spacing w:before="0" w:after="0" w:line="269" w:lineRule="auto"/>
+              <w:spacing w:before="0" w:after="0" w:line="254" w:lineRule="auto"/>
               <w:jc w:val="left"/>
             </w:pPr>
             <w:r>
@@ -2723,7 +2811,7 @@
                 <w:rFonts w:ascii="Microsoft YaHei" w:hAnsi="Microsoft YaHei" w:eastAsia="Microsoft YaHei"/>
                 <w:b w:val="0"/>
                 <w:color w:val="1F1F1F"/>
-                <w:sz w:val="19"/>
+                <w:sz w:val="18"/>
               </w:rPr>
               <w:t>公开 API 不含通用质量合同、质量评分、画像或合同差异</w:t>
             </w:r>
@@ -2740,15 +2828,15 @@
             <w:shd w:fill="F4F7FA"/>
             <w:vAlign w:val="center"/>
             <w:tcMar>
-              <w:top w:w="90" w:type="dxa"/>
-              <w:start w:w="110" w:type="dxa"/>
-              <w:bottom w:w="90" w:type="dxa"/>
-              <w:end w:w="110" w:type="dxa"/>
+              <w:top w:w="65" w:type="dxa"/>
+              <w:start w:w="105" w:type="dxa"/>
+              <w:bottom w:w="65" w:type="dxa"/>
+              <w:end w:w="105" w:type="dxa"/>
             </w:tcMar>
           </w:tcPr>
           <w:p>
             <w:pPr>
-              <w:spacing w:before="0" w:after="0" w:line="269" w:lineRule="auto"/>
+              <w:spacing w:before="0" w:after="0" w:line="254" w:lineRule="auto"/>
               <w:jc w:val="center"/>
             </w:pPr>
             <w:r>
@@ -2756,7 +2844,7 @@
                 <w:rFonts w:ascii="Microsoft YaHei" w:hAnsi="Microsoft YaHei" w:eastAsia="Microsoft YaHei"/>
                 <w:b w:val="0"/>
                 <w:color w:val="1F1F1F"/>
-                <w:sz w:val="19"/>
+                <w:sz w:val="18"/>
               </w:rPr>
               <w:t>2</w:t>
             </w:r>
@@ -2768,15 +2856,15 @@
             <w:shd w:fill="F4F7FA"/>
             <w:vAlign w:val="center"/>
             <w:tcMar>
-              <w:top w:w="90" w:type="dxa"/>
-              <w:start w:w="110" w:type="dxa"/>
-              <w:bottom w:w="90" w:type="dxa"/>
-              <w:end w:w="110" w:type="dxa"/>
+              <w:top w:w="65" w:type="dxa"/>
+              <w:start w:w="105" w:type="dxa"/>
+              <w:bottom w:w="65" w:type="dxa"/>
+              <w:end w:w="105" w:type="dxa"/>
             </w:tcMar>
           </w:tcPr>
           <w:p>
             <w:pPr>
-              <w:spacing w:before="0" w:after="0" w:line="269" w:lineRule="auto"/>
+              <w:spacing w:before="0" w:after="0" w:line="254" w:lineRule="auto"/>
               <w:jc w:val="left"/>
             </w:pPr>
             <w:r>
@@ -2784,7 +2872,7 @@
                 <w:rFonts w:ascii="Microsoft YaHei" w:hAnsi="Microsoft YaHei" w:eastAsia="Microsoft YaHei"/>
                 <w:b w:val="0"/>
                 <w:color w:val="1F1F1F"/>
-                <w:sz w:val="19"/>
+                <w:sz w:val="18"/>
               </w:rPr>
               <w:t>完整授权链</w:t>
             </w:r>
@@ -2796,15 +2884,15 @@
             <w:shd w:fill="F4F7FA"/>
             <w:vAlign w:val="center"/>
             <w:tcMar>
-              <w:top w:w="90" w:type="dxa"/>
-              <w:start w:w="110" w:type="dxa"/>
-              <w:bottom w:w="90" w:type="dxa"/>
-              <w:end w:w="110" w:type="dxa"/>
+              <w:top w:w="65" w:type="dxa"/>
+              <w:start w:w="105" w:type="dxa"/>
+              <w:bottom w:w="65" w:type="dxa"/>
+              <w:end w:w="105" w:type="dxa"/>
             </w:tcMar>
           </w:tcPr>
           <w:p>
             <w:pPr>
-              <w:spacing w:before="0" w:after="0" w:line="269" w:lineRule="auto"/>
+              <w:spacing w:before="0" w:after="0" w:line="254" w:lineRule="auto"/>
               <w:jc w:val="left"/>
             </w:pPr>
             <w:r>
@@ -2812,9 +2900,9 @@
                 <w:rFonts w:ascii="Microsoft YaHei" w:hAnsi="Microsoft YaHei" w:eastAsia="Microsoft YaHei"/>
                 <w:b w:val="0"/>
                 <w:color w:val="1F1F1F"/>
-                <w:sz w:val="19"/>
+                <w:sz w:val="18"/>
               </w:rPr>
-              <w:t>用途、接收方、同意、k 匿名和最小化均参与结果</w:t>
+              <w:t>用途、接收方、同意、k 匿名、l-diversity 和最小化均参与结果</w:t>
             </w:r>
           </w:p>
         </w:tc>
@@ -2828,15 +2916,15 @@
             <w:tcW w:type="dxa" w:w="792"/>
             <w:vAlign w:val="center"/>
             <w:tcMar>
-              <w:top w:w="90" w:type="dxa"/>
-              <w:start w:w="110" w:type="dxa"/>
-              <w:bottom w:w="90" w:type="dxa"/>
-              <w:end w:w="110" w:type="dxa"/>
+              <w:top w:w="65" w:type="dxa"/>
+              <w:start w:w="105" w:type="dxa"/>
+              <w:bottom w:w="65" w:type="dxa"/>
+              <w:end w:w="105" w:type="dxa"/>
             </w:tcMar>
           </w:tcPr>
           <w:p>
             <w:pPr>
-              <w:spacing w:before="0" w:after="0" w:line="269" w:lineRule="auto"/>
+              <w:spacing w:before="0" w:after="0" w:line="254" w:lineRule="auto"/>
               <w:jc w:val="center"/>
             </w:pPr>
             <w:r>
@@ -2844,7 +2932,7 @@
                 <w:rFonts w:ascii="Microsoft YaHei" w:hAnsi="Microsoft YaHei" w:eastAsia="Microsoft YaHei"/>
                 <w:b w:val="0"/>
                 <w:color w:val="1F1F1F"/>
-                <w:sz w:val="19"/>
+                <w:sz w:val="18"/>
               </w:rPr>
               <w:t>3</w:t>
             </w:r>
@@ -2855,15 +2943,15 @@
             <w:tcW w:type="dxa" w:w="2520"/>
             <w:vAlign w:val="center"/>
             <w:tcMar>
-              <w:top w:w="90" w:type="dxa"/>
-              <w:start w:w="110" w:type="dxa"/>
-              <w:bottom w:w="90" w:type="dxa"/>
-              <w:end w:w="110" w:type="dxa"/>
+              <w:top w:w="65" w:type="dxa"/>
+              <w:start w:w="105" w:type="dxa"/>
+              <w:bottom w:w="65" w:type="dxa"/>
+              <w:end w:w="105" w:type="dxa"/>
             </w:tcMar>
           </w:tcPr>
           <w:p>
             <w:pPr>
-              <w:spacing w:before="0" w:after="0" w:line="269" w:lineRule="auto"/>
+              <w:spacing w:before="0" w:after="0" w:line="254" w:lineRule="auto"/>
               <w:jc w:val="left"/>
             </w:pPr>
             <w:r>
@@ -2871,7 +2959,7 @@
                 <w:rFonts w:ascii="Microsoft YaHei" w:hAnsi="Microsoft YaHei" w:eastAsia="Microsoft YaHei"/>
                 <w:b w:val="0"/>
                 <w:color w:val="1F1F1F"/>
-                <w:sz w:val="19"/>
+                <w:sz w:val="18"/>
               </w:rPr>
               <w:t>隐私失败关闭</w:t>
             </w:r>
@@ -2882,15 +2970,15 @@
             <w:tcW w:type="dxa" w:w="6696"/>
             <w:vAlign w:val="center"/>
             <w:tcMar>
-              <w:top w:w="90" w:type="dxa"/>
-              <w:start w:w="110" w:type="dxa"/>
-              <w:bottom w:w="90" w:type="dxa"/>
-              <w:end w:w="110" w:type="dxa"/>
+              <w:top w:w="65" w:type="dxa"/>
+              <w:start w:w="105" w:type="dxa"/>
+              <w:bottom w:w="65" w:type="dxa"/>
+              <w:end w:w="105" w:type="dxa"/>
             </w:tcMar>
           </w:tcPr>
           <w:p>
             <w:pPr>
-              <w:spacing w:before="0" w:after="0" w:line="269" w:lineRule="auto"/>
+              <w:spacing w:before="0" w:after="0" w:line="254" w:lineRule="auto"/>
               <w:jc w:val="left"/>
             </w:pPr>
             <w:r>
@@ -2898,7 +2986,7 @@
                 <w:rFonts w:ascii="Microsoft YaHei" w:hAnsi="Microsoft YaHei" w:eastAsia="Microsoft YaHei"/>
                 <w:b w:val="0"/>
                 <w:color w:val="1F1F1F"/>
-                <w:sz w:val="19"/>
+                <w:sz w:val="18"/>
               </w:rPr>
               <w:t>策略或关键列无效时不产生可发布记录</w:t>
             </w:r>
@@ -2915,15 +3003,15 @@
             <w:shd w:fill="F4F7FA"/>
             <w:vAlign w:val="center"/>
             <w:tcMar>
-              <w:top w:w="90" w:type="dxa"/>
-              <w:start w:w="110" w:type="dxa"/>
-              <w:bottom w:w="90" w:type="dxa"/>
-              <w:end w:w="110" w:type="dxa"/>
+              <w:top w:w="65" w:type="dxa"/>
+              <w:start w:w="105" w:type="dxa"/>
+              <w:bottom w:w="65" w:type="dxa"/>
+              <w:end w:w="105" w:type="dxa"/>
             </w:tcMar>
           </w:tcPr>
           <w:p>
             <w:pPr>
-              <w:spacing w:before="0" w:after="0" w:line="269" w:lineRule="auto"/>
+              <w:spacing w:before="0" w:after="0" w:line="254" w:lineRule="auto"/>
               <w:jc w:val="center"/>
             </w:pPr>
             <w:r>
@@ -2931,7 +3019,7 @@
                 <w:rFonts w:ascii="Microsoft YaHei" w:hAnsi="Microsoft YaHei" w:eastAsia="Microsoft YaHei"/>
                 <w:b w:val="0"/>
                 <w:color w:val="1F1F1F"/>
-                <w:sz w:val="19"/>
+                <w:sz w:val="18"/>
               </w:rPr>
               <w:t>4</w:t>
             </w:r>
@@ -2943,15 +3031,15 @@
             <w:shd w:fill="F4F7FA"/>
             <w:vAlign w:val="center"/>
             <w:tcMar>
-              <w:top w:w="90" w:type="dxa"/>
-              <w:start w:w="110" w:type="dxa"/>
-              <w:bottom w:w="90" w:type="dxa"/>
-              <w:end w:w="110" w:type="dxa"/>
+              <w:top w:w="65" w:type="dxa"/>
+              <w:start w:w="105" w:type="dxa"/>
+              <w:bottom w:w="65" w:type="dxa"/>
+              <w:end w:w="105" w:type="dxa"/>
             </w:tcMar>
           </w:tcPr>
           <w:p>
             <w:pPr>
-              <w:spacing w:before="0" w:after="0" w:line="269" w:lineRule="auto"/>
+              <w:spacing w:before="0" w:after="0" w:line="254" w:lineRule="auto"/>
               <w:jc w:val="left"/>
             </w:pPr>
             <w:r>
@@ -2959,7 +3047,7 @@
                 <w:rFonts w:ascii="Microsoft YaHei" w:hAnsi="Microsoft YaHei" w:eastAsia="Microsoft YaHei"/>
                 <w:b w:val="0"/>
                 <w:color w:val="1F1F1F"/>
-                <w:sz w:val="19"/>
+                <w:sz w:val="18"/>
               </w:rPr>
               <w:t>全目标测试</w:t>
             </w:r>
@@ -2971,15 +3059,15 @@
             <w:shd w:fill="F4F7FA"/>
             <w:vAlign w:val="center"/>
             <w:tcMar>
-              <w:top w:w="90" w:type="dxa"/>
-              <w:start w:w="110" w:type="dxa"/>
-              <w:bottom w:w="90" w:type="dxa"/>
-              <w:end w:w="110" w:type="dxa"/>
+              <w:top w:w="65" w:type="dxa"/>
+              <w:start w:w="105" w:type="dxa"/>
+              <w:bottom w:w="65" w:type="dxa"/>
+              <w:end w:w="105" w:type="dxa"/>
             </w:tcMar>
           </w:tcPr>
           <w:p>
             <w:pPr>
-              <w:spacing w:before="0" w:after="0" w:line="269" w:lineRule="auto"/>
+              <w:spacing w:before="0" w:after="0" w:line="254" w:lineRule="auto"/>
               <w:jc w:val="left"/>
             </w:pPr>
             <w:r>
@@ -2987,9 +3075,9 @@
                 <w:rFonts w:ascii="Microsoft YaHei" w:hAnsi="Microsoft YaHei" w:eastAsia="Microsoft YaHei"/>
                 <w:b w:val="0"/>
                 <w:color w:val="1F1F1F"/>
-                <w:sz w:val="19"/>
+                <w:sz w:val="18"/>
               </w:rPr>
-              <w:t>8 项测试在 Native、JavaScript、Wasm、Wasm-GC 全部通过</w:t>
+              <w:t>9 项测试在 Native、JavaScript、Wasm、Wasm-GC 全部通过</w:t>
             </w:r>
           </w:p>
         </w:tc>
@@ -3003,15 +3091,15 @@
             <w:tcW w:type="dxa" w:w="792"/>
             <w:vAlign w:val="center"/>
             <w:tcMar>
-              <w:top w:w="90" w:type="dxa"/>
-              <w:start w:w="110" w:type="dxa"/>
-              <w:bottom w:w="90" w:type="dxa"/>
-              <w:end w:w="110" w:type="dxa"/>
+              <w:top w:w="65" w:type="dxa"/>
+              <w:start w:w="105" w:type="dxa"/>
+              <w:bottom w:w="65" w:type="dxa"/>
+              <w:end w:w="105" w:type="dxa"/>
             </w:tcMar>
           </w:tcPr>
           <w:p>
             <w:pPr>
-              <w:spacing w:before="0" w:after="0" w:line="269" w:lineRule="auto"/>
+              <w:spacing w:before="0" w:after="0" w:line="254" w:lineRule="auto"/>
               <w:jc w:val="center"/>
             </w:pPr>
             <w:r>
@@ -3019,7 +3107,7 @@
                 <w:rFonts w:ascii="Microsoft YaHei" w:hAnsi="Microsoft YaHei" w:eastAsia="Microsoft YaHei"/>
                 <w:b w:val="0"/>
                 <w:color w:val="1F1F1F"/>
-                <w:sz w:val="19"/>
+                <w:sz w:val="18"/>
               </w:rPr>
               <w:t>5</w:t>
             </w:r>
@@ -3030,15 +3118,15 @@
             <w:tcW w:type="dxa" w:w="2520"/>
             <w:vAlign w:val="center"/>
             <w:tcMar>
-              <w:top w:w="90" w:type="dxa"/>
-              <w:start w:w="110" w:type="dxa"/>
-              <w:bottom w:w="90" w:type="dxa"/>
-              <w:end w:w="110" w:type="dxa"/>
+              <w:top w:w="65" w:type="dxa"/>
+              <w:start w:w="105" w:type="dxa"/>
+              <w:bottom w:w="65" w:type="dxa"/>
+              <w:end w:w="105" w:type="dxa"/>
             </w:tcMar>
           </w:tcPr>
           <w:p>
             <w:pPr>
-              <w:spacing w:before="0" w:after="0" w:line="269" w:lineRule="auto"/>
+              <w:spacing w:before="0" w:after="0" w:line="254" w:lineRule="auto"/>
               <w:jc w:val="left"/>
             </w:pPr>
             <w:r>
@@ -3046,7 +3134,7 @@
                 <w:rFonts w:ascii="Microsoft YaHei" w:hAnsi="Microsoft YaHei" w:eastAsia="Microsoft YaHei"/>
                 <w:b w:val="0"/>
                 <w:color w:val="1F1F1F"/>
-                <w:sz w:val="19"/>
+                <w:sz w:val="18"/>
               </w:rPr>
               <w:t>Arrow 交接</w:t>
             </w:r>
@@ -3057,15 +3145,15 @@
             <w:tcW w:type="dxa" w:w="6696"/>
             <w:vAlign w:val="center"/>
             <w:tcMar>
-              <w:top w:w="90" w:type="dxa"/>
-              <w:start w:w="110" w:type="dxa"/>
-              <w:bottom w:w="90" w:type="dxa"/>
-              <w:end w:w="110" w:type="dxa"/>
+              <w:top w:w="65" w:type="dxa"/>
+              <w:start w:w="105" w:type="dxa"/>
+              <w:bottom w:w="65" w:type="dxa"/>
+              <w:end w:w="105" w:type="dxa"/>
             </w:tcMar>
           </w:tcPr>
           <w:p>
             <w:pPr>
-              <w:spacing w:before="0" w:after="0" w:line="269" w:lineRule="auto"/>
+              <w:spacing w:before="0" w:after="0" w:line="254" w:lineRule="auto"/>
               <w:jc w:val="left"/>
             </w:pPr>
             <w:r>
@@ -3073,7 +3161,7 @@
                 <w:rFonts w:ascii="Microsoft YaHei" w:hAnsi="Microsoft YaHei" w:eastAsia="Microsoft YaHei"/>
                 <w:b w:val="0"/>
                 <w:color w:val="1F1F1F"/>
-                <w:sz w:val="19"/>
+                <w:sz w:val="18"/>
               </w:rPr>
               <w:t>隐私发现和发布清单可完成 IPC 写入与读取</w:t>
             </w:r>
@@ -3090,15 +3178,15 @@
             <w:shd w:fill="F4F7FA"/>
             <w:vAlign w:val="center"/>
             <w:tcMar>
-              <w:top w:w="90" w:type="dxa"/>
-              <w:start w:w="110" w:type="dxa"/>
-              <w:bottom w:w="90" w:type="dxa"/>
-              <w:end w:w="110" w:type="dxa"/>
+              <w:top w:w="65" w:type="dxa"/>
+              <w:start w:w="105" w:type="dxa"/>
+              <w:bottom w:w="65" w:type="dxa"/>
+              <w:end w:w="105" w:type="dxa"/>
             </w:tcMar>
           </w:tcPr>
           <w:p>
             <w:pPr>
-              <w:spacing w:before="0" w:after="0" w:line="269" w:lineRule="auto"/>
+              <w:spacing w:before="0" w:after="0" w:line="254" w:lineRule="auto"/>
               <w:jc w:val="center"/>
             </w:pPr>
             <w:r>
@@ -3106,7 +3194,7 @@
                 <w:rFonts w:ascii="Microsoft YaHei" w:hAnsi="Microsoft YaHei" w:eastAsia="Microsoft YaHei"/>
                 <w:b w:val="0"/>
                 <w:color w:val="1F1F1F"/>
-                <w:sz w:val="19"/>
+                <w:sz w:val="18"/>
               </w:rPr>
               <w:t>6</w:t>
             </w:r>
@@ -3118,15 +3206,15 @@
             <w:shd w:fill="F4F7FA"/>
             <w:vAlign w:val="center"/>
             <w:tcMar>
-              <w:top w:w="90" w:type="dxa"/>
-              <w:start w:w="110" w:type="dxa"/>
-              <w:bottom w:w="90" w:type="dxa"/>
-              <w:end w:w="110" w:type="dxa"/>
+              <w:top w:w="65" w:type="dxa"/>
+              <w:start w:w="105" w:type="dxa"/>
+              <w:bottom w:w="65" w:type="dxa"/>
+              <w:end w:w="105" w:type="dxa"/>
             </w:tcMar>
           </w:tcPr>
           <w:p>
             <w:pPr>
-              <w:spacing w:before="0" w:after="0" w:line="269" w:lineRule="auto"/>
+              <w:spacing w:before="0" w:after="0" w:line="254" w:lineRule="auto"/>
               <w:jc w:val="left"/>
             </w:pPr>
             <w:r>
@@ -3134,7 +3222,7 @@
                 <w:rFonts w:ascii="Microsoft YaHei" w:hAnsi="Microsoft YaHei" w:eastAsia="Microsoft YaHei"/>
                 <w:b w:val="0"/>
                 <w:color w:val="1F1F1F"/>
-                <w:sz w:val="19"/>
+                <w:sz w:val="18"/>
               </w:rPr>
               <w:t>材料一致</w:t>
             </w:r>
@@ -3146,15 +3234,15 @@
             <w:shd w:fill="F4F7FA"/>
             <w:vAlign w:val="center"/>
             <w:tcMar>
-              <w:top w:w="90" w:type="dxa"/>
-              <w:start w:w="110" w:type="dxa"/>
-              <w:bottom w:w="90" w:type="dxa"/>
-              <w:end w:w="110" w:type="dxa"/>
+              <w:top w:w="65" w:type="dxa"/>
+              <w:start w:w="105" w:type="dxa"/>
+              <w:bottom w:w="65" w:type="dxa"/>
+              <w:end w:w="105" w:type="dxa"/>
             </w:tcMar>
           </w:tcPr>
           <w:p>
             <w:pPr>
-              <w:spacing w:before="0" w:after="0" w:line="269" w:lineRule="auto"/>
+              <w:spacing w:before="0" w:after="0" w:line="254" w:lineRule="auto"/>
               <w:jc w:val="left"/>
             </w:pPr>
             <w:r>
@@ -3162,7 +3250,7 @@
                 <w:rFonts w:ascii="Microsoft YaHei" w:hAnsi="Microsoft YaHei" w:eastAsia="Microsoft YaHei"/>
                 <w:b w:val="0"/>
                 <w:color w:val="1F1F1F"/>
-                <w:sz w:val="19"/>
+                <w:sz w:val="18"/>
               </w:rPr>
               <w:t>README、申报书、差异说明、演示输出和当前代码一致</w:t>
             </w:r>
@@ -3187,7 +3275,7 @@
     <w:sectPr>
       <w:footerReference w:type="default" r:id="rId9"/>
       <w:pgSz w:w="11909" w:h="16834"/>
-      <w:pgMar w:top="979" w:right="1037" w:bottom="950" w:left="1037" w:header="720" w:footer="720" w:gutter="0"/>
+      <w:pgMar w:top="864" w:right="1037" w:bottom="950" w:left="1037" w:header="720" w:footer="720" w:gutter="0"/>
       <w:cols w:space="720"/>
       <w:docGrid w:linePitch="360"/>
     </w:sectPr>
@@ -3945,9 +4033,6 @@
     <w:qFormat/>
     <w:rsid w:val="00FC693F"/>
     <w:pPr>
-      <w:pBdr>
-        <w:bottom w:val="single" w:sz="8" w:space="4" w:color="4F81BD" w:themeColor="accent1"/>
-      </w:pBdr>
       <w:spacing w:after="300" w:line="240" w:lineRule="auto"/>
       <w:contextualSpacing/>
     </w:pPr>

</xml_diff>

<commit_message>
feat: broaden privacy release workflows
</commit_message>
<xml_diff>
--- a/docs/MoonSentinel项目申报书.docx
+++ b/docs/MoonSentinel项目申报书.docx
@@ -5,3323 +5,271 @@
     <w:p>
       <w:pPr>
         <w:pStyle w:val="Title"/>
-        <w:spacing w:before="100" w:after="100"/>
         <w:jc w:val="center"/>
       </w:pPr>
       <w:r>
-        <w:rPr>
-          <w:rFonts w:ascii="Microsoft YaHei" w:hAnsi="Microsoft YaHei" w:eastAsia="Microsoft YaHei"/>
-          <w:b/>
-          <w:color w:val="000000"/>
-          <w:sz w:val="41"/>
-        </w:rPr>
         <w:t>MoonSentinel 项目申报书</w:t>
       </w:r>
     </w:p>
     <w:p>
       <w:pPr>
-        <w:spacing w:after="200"/>
-        <w:jc w:val="center"/>
+        <w:pStyle w:val="Heading1"/>
       </w:pPr>
       <w:r>
-        <w:rPr>
-          <w:rFonts w:ascii="Microsoft YaHei" w:hAnsi="Microsoft YaHei" w:eastAsia="Microsoft YaHei"/>
-          <w:b/>
-          <w:color w:val="1F1F1F"/>
-          <w:sz w:val="24"/>
-        </w:rPr>
-        <w:t>用途绑定的 Arrow 隐私发布门禁</w:t>
+        <w:t>基本信息</w:t>
       </w:r>
     </w:p>
-    <w:tbl>
-      <w:tblPr>
-        <w:tblW w:type="auto" w:w="0"/>
-        <w:jc w:val="center"/>
-        <w:tblLayout w:type="fixed"/>
-        <w:tblLook w:firstColumn="1" w:firstRow="1" w:lastColumn="0" w:lastRow="0" w:noHBand="0" w:noVBand="1" w:val="04A0"/>
-        <w:tblBorders>
-          <w:top w:val="single" w:sz="6" w:space="0" w:color="D9D9D9"/>
-          <w:left w:val="single" w:sz="6" w:space="0" w:color="D9D9D9"/>
-          <w:bottom w:val="single" w:sz="6" w:space="0" w:color="D9D9D9"/>
-          <w:right w:val="single" w:sz="6" w:space="0" w:color="D9D9D9"/>
-          <w:insideH w:val="single" w:sz="6" w:space="0" w:color="D9D9D9"/>
-          <w:insideV w:val="single" w:sz="6" w:space="0" w:color="D9D9D9"/>
-        </w:tblBorders>
-      </w:tblPr>
-      <w:tblGrid>
-        <w:gridCol w:w="4917"/>
-        <w:gridCol w:w="4917"/>
-      </w:tblGrid>
-      <w:tr>
-        <w:tc>
-          <w:tcPr>
-            <w:tcW w:type="dxa" w:w="2016"/>
-            <w:shd w:fill="E8EEF5"/>
-            <w:vAlign w:val="center"/>
-            <w:tcMar>
-              <w:top w:w="42" w:type="dxa"/>
-              <w:start w:w="105" w:type="dxa"/>
-              <w:bottom w:w="42" w:type="dxa"/>
-              <w:end w:w="105" w:type="dxa"/>
-            </w:tcMar>
-          </w:tcPr>
-          <w:p>
-            <w:pPr>
-              <w:spacing w:before="0" w:after="0" w:line="254" w:lineRule="auto"/>
-              <w:jc w:val="center"/>
-            </w:pPr>
-            <w:r>
-              <w:rPr>
-                <w:rFonts w:ascii="Microsoft YaHei" w:hAnsi="Microsoft YaHei" w:eastAsia="Microsoft YaHei"/>
-                <w:b/>
-                <w:color w:val="1F1F1F"/>
-                <w:sz w:val="18"/>
-              </w:rPr>
-              <w:t>项目名称</w:t>
-            </w:r>
-          </w:p>
-        </w:tc>
-        <w:tc>
-          <w:tcPr>
-            <w:tcW w:type="dxa" w:w="7992"/>
-            <w:vAlign w:val="center"/>
-            <w:tcMar>
-              <w:top w:w="42" w:type="dxa"/>
-              <w:start w:w="105" w:type="dxa"/>
-              <w:bottom w:w="42" w:type="dxa"/>
-              <w:end w:w="105" w:type="dxa"/>
-            </w:tcMar>
-          </w:tcPr>
-          <w:p>
-            <w:pPr>
-              <w:spacing w:before="0" w:after="0" w:line="254" w:lineRule="auto"/>
-              <w:jc w:val="left"/>
-            </w:pPr>
-            <w:r>
-              <w:rPr>
-                <w:rFonts w:ascii="Microsoft YaHei" w:hAnsi="Microsoft YaHei" w:eastAsia="Microsoft YaHei"/>
-                <w:b w:val="0"/>
-                <w:color w:val="1F1F1F"/>
-                <w:sz w:val="18"/>
-              </w:rPr>
-              <w:t>MoonSentinel</w:t>
-            </w:r>
-          </w:p>
-        </w:tc>
-      </w:tr>
-      <w:tr>
-        <w:tc>
-          <w:tcPr>
-            <w:tcW w:type="dxa" w:w="2016"/>
-            <w:shd w:fill="E8EEF5"/>
-            <w:vAlign w:val="center"/>
-            <w:tcMar>
-              <w:top w:w="42" w:type="dxa"/>
-              <w:start w:w="105" w:type="dxa"/>
-              <w:bottom w:w="42" w:type="dxa"/>
-              <w:end w:w="105" w:type="dxa"/>
-            </w:tcMar>
-          </w:tcPr>
-          <w:p>
-            <w:pPr>
-              <w:spacing w:before="0" w:after="0" w:line="254" w:lineRule="auto"/>
-              <w:jc w:val="center"/>
-            </w:pPr>
-            <w:r>
-              <w:rPr>
-                <w:rFonts w:ascii="Microsoft YaHei" w:hAnsi="Microsoft YaHei" w:eastAsia="Microsoft YaHei"/>
-                <w:b/>
-                <w:color w:val="1F1F1F"/>
-                <w:sz w:val="18"/>
-              </w:rPr>
-              <w:t>项目负责人</w:t>
-            </w:r>
-          </w:p>
-        </w:tc>
-        <w:tc>
-          <w:tcPr>
-            <w:tcW w:type="dxa" w:w="7992"/>
-            <w:vAlign w:val="center"/>
-            <w:tcMar>
-              <w:top w:w="42" w:type="dxa"/>
-              <w:start w:w="105" w:type="dxa"/>
-              <w:bottom w:w="42" w:type="dxa"/>
-              <w:end w:w="105" w:type="dxa"/>
-            </w:tcMar>
-          </w:tcPr>
-          <w:p>
-            <w:pPr>
-              <w:spacing w:before="0" w:after="0" w:line="254" w:lineRule="auto"/>
-              <w:jc w:val="left"/>
-            </w:pPr>
-            <w:r>
-              <w:rPr>
-                <w:rFonts w:ascii="Microsoft YaHei" w:hAnsi="Microsoft YaHei" w:eastAsia="Microsoft YaHei"/>
-                <w:b w:val="0"/>
-                <w:color w:val="1F1F1F"/>
-                <w:sz w:val="18"/>
-              </w:rPr>
-              <w:t>苏天纬</w:t>
-            </w:r>
-          </w:p>
-        </w:tc>
-      </w:tr>
-      <w:tr>
-        <w:tc>
-          <w:tcPr>
-            <w:tcW w:type="dxa" w:w="2016"/>
-            <w:shd w:fill="E8EEF5"/>
-            <w:vAlign w:val="center"/>
-            <w:tcMar>
-              <w:top w:w="42" w:type="dxa"/>
-              <w:start w:w="105" w:type="dxa"/>
-              <w:bottom w:w="42" w:type="dxa"/>
-              <w:end w:w="105" w:type="dxa"/>
-            </w:tcMar>
-          </w:tcPr>
-          <w:p>
-            <w:pPr>
-              <w:spacing w:before="0" w:after="0" w:line="254" w:lineRule="auto"/>
-              <w:jc w:val="center"/>
-            </w:pPr>
-            <w:r>
-              <w:rPr>
-                <w:rFonts w:ascii="Microsoft YaHei" w:hAnsi="Microsoft YaHei" w:eastAsia="Microsoft YaHei"/>
-                <w:b/>
-                <w:color w:val="1F1F1F"/>
-                <w:sz w:val="18"/>
-              </w:rPr>
-              <w:t>代码仓库</w:t>
-            </w:r>
-          </w:p>
-        </w:tc>
-        <w:tc>
-          <w:tcPr>
-            <w:tcW w:type="dxa" w:w="7992"/>
-            <w:vAlign w:val="center"/>
-            <w:tcMar>
-              <w:top w:w="42" w:type="dxa"/>
-              <w:start w:w="105" w:type="dxa"/>
-              <w:bottom w:w="42" w:type="dxa"/>
-              <w:end w:w="105" w:type="dxa"/>
-            </w:tcMar>
-          </w:tcPr>
-          <w:p>
-            <w:pPr>
-              <w:spacing w:before="0" w:after="0" w:line="254" w:lineRule="auto"/>
-              <w:jc w:val="left"/>
-            </w:pPr>
-            <w:r>
-              <w:rPr>
-                <w:rFonts w:ascii="Microsoft YaHei" w:hAnsi="Microsoft YaHei" w:eastAsia="Microsoft YaHei"/>
-                <w:b w:val="0"/>
-                <w:color w:val="1F1F1F"/>
-                <w:sz w:val="18"/>
-              </w:rPr>
-              <w:t>https://github.com/STW135-2026/moonsentinel</w:t>
-            </w:r>
-          </w:p>
-        </w:tc>
-      </w:tr>
-      <w:tr>
-        <w:tc>
-          <w:tcPr>
-            <w:tcW w:type="dxa" w:w="2016"/>
-            <w:shd w:fill="E8EEF5"/>
-            <w:vAlign w:val="center"/>
-            <w:tcMar>
-              <w:top w:w="42" w:type="dxa"/>
-              <w:start w:w="105" w:type="dxa"/>
-              <w:bottom w:w="42" w:type="dxa"/>
-              <w:end w:w="105" w:type="dxa"/>
-            </w:tcMar>
-          </w:tcPr>
-          <w:p>
-            <w:pPr>
-              <w:spacing w:before="0" w:after="0" w:line="254" w:lineRule="auto"/>
-              <w:jc w:val="center"/>
-            </w:pPr>
-            <w:r>
-              <w:rPr>
-                <w:rFonts w:ascii="Microsoft YaHei" w:hAnsi="Microsoft YaHei" w:eastAsia="Microsoft YaHei"/>
-                <w:b/>
-                <w:color w:val="1F1F1F"/>
-                <w:sz w:val="18"/>
-              </w:rPr>
-              <w:t>开源许可证</w:t>
-            </w:r>
-          </w:p>
-        </w:tc>
-        <w:tc>
-          <w:tcPr>
-            <w:tcW w:type="dxa" w:w="7992"/>
-            <w:vAlign w:val="center"/>
-            <w:tcMar>
-              <w:top w:w="42" w:type="dxa"/>
-              <w:start w:w="105" w:type="dxa"/>
-              <w:bottom w:w="42" w:type="dxa"/>
-              <w:end w:w="105" w:type="dxa"/>
-            </w:tcMar>
-          </w:tcPr>
-          <w:p>
-            <w:pPr>
-              <w:spacing w:before="0" w:after="0" w:line="254" w:lineRule="auto"/>
-              <w:jc w:val="left"/>
-            </w:pPr>
-            <w:r>
-              <w:rPr>
-                <w:rFonts w:ascii="Microsoft YaHei" w:hAnsi="Microsoft YaHei" w:eastAsia="Microsoft YaHei"/>
-                <w:b w:val="0"/>
-                <w:color w:val="1F1F1F"/>
-                <w:sz w:val="18"/>
-              </w:rPr>
-              <w:t>Apache-2.0</w:t>
-            </w:r>
-          </w:p>
-        </w:tc>
-      </w:tr>
-      <w:tr>
-        <w:tc>
-          <w:tcPr>
-            <w:tcW w:type="dxa" w:w="2016"/>
-            <w:shd w:fill="E8EEF5"/>
-            <w:vAlign w:val="center"/>
-            <w:tcMar>
-              <w:top w:w="42" w:type="dxa"/>
-              <w:start w:w="105" w:type="dxa"/>
-              <w:bottom w:w="42" w:type="dxa"/>
-              <w:end w:w="105" w:type="dxa"/>
-            </w:tcMar>
-          </w:tcPr>
-          <w:p>
-            <w:pPr>
-              <w:spacing w:before="0" w:after="0" w:line="254" w:lineRule="auto"/>
-              <w:jc w:val="center"/>
-            </w:pPr>
-            <w:r>
-              <w:rPr>
-                <w:rFonts w:ascii="Microsoft YaHei" w:hAnsi="Microsoft YaHei" w:eastAsia="Microsoft YaHei"/>
-                <w:b/>
-                <w:color w:val="1F1F1F"/>
-                <w:sz w:val="18"/>
-              </w:rPr>
-              <w:t>底层依赖</w:t>
-            </w:r>
-          </w:p>
-        </w:tc>
-        <w:tc>
-          <w:tcPr>
-            <w:tcW w:type="dxa" w:w="7992"/>
-            <w:vAlign w:val="center"/>
-            <w:tcMar>
-              <w:top w:w="42" w:type="dxa"/>
-              <w:start w:w="105" w:type="dxa"/>
-              <w:bottom w:w="42" w:type="dxa"/>
-              <w:end w:w="105" w:type="dxa"/>
-            </w:tcMar>
-          </w:tcPr>
-          <w:p>
-            <w:pPr>
-              <w:spacing w:before="0" w:after="0" w:line="254" w:lineRule="auto"/>
-              <w:jc w:val="left"/>
-            </w:pPr>
-            <w:r>
-              <w:rPr>
-                <w:rFonts w:ascii="Microsoft YaHei" w:hAnsi="Microsoft YaHei" w:eastAsia="Microsoft YaHei"/>
-                <w:b w:val="0"/>
-                <w:color w:val="1F1F1F"/>
-                <w:sz w:val="18"/>
-              </w:rPr>
-              <w:t>shunge/arrow@0.1.0  MIT</w:t>
-            </w:r>
-          </w:p>
-        </w:tc>
-      </w:tr>
-    </w:tbl>
     <w:p>
       <w:pPr>
-        <w:spacing w:before="160" w:after="140" w:line="288" w:lineRule="auto"/>
+        <w:pStyle w:val="ListBullet"/>
       </w:pPr>
       <w:r>
-        <w:rPr>
-          <w:rFonts w:ascii="Microsoft YaHei" w:hAnsi="Microsoft YaHei" w:eastAsia="Microsoft YaHei"/>
-          <w:b/>
-          <w:color w:val="000000"/>
-          <w:sz w:val="21"/>
-        </w:rPr>
-        <w:t xml:space="preserve">本次修订结论  </w:t>
+        <w:t>项目名称：MoonSentinel——多场景数据共享前的授权核验与隐私发布工具</w:t>
       </w:r>
+    </w:p>
+    <w:p>
+      <w:pPr>
+        <w:pStyle w:val="ListBullet"/>
+      </w:pPr>
       <w:r>
-        <w:rPr>
-          <w:rFonts w:ascii="Microsoft YaHei" w:hAnsi="Microsoft YaHei" w:eastAsia="Microsoft YaHei"/>
-          <w:b w:val="0"/>
-          <w:color w:val="1F1F1F"/>
-          <w:sz w:val="21"/>
-        </w:rPr>
-        <w:t>MoonSentinel 已从通用数据质量规则项目重构为用途绑定的隐私发布授权器。当前生产接口不再提供 Required、Unique、Range、Enum、Profile、Contract Diff 等数据质量能力，而是围绕用途、接收方、逐行同意、k 匿名、l-diversity 和最小化发布完成可执行决策。</w:t>
+        <w:t>项目负责人：苏天纬</w:t>
+      </w:r>
+    </w:p>
+    <w:p>
+      <w:pPr>
+        <w:pStyle w:val="ListBullet"/>
+      </w:pPr>
+      <w:r>
+        <w:t>开源许可证：Apache-2.0</w:t>
+      </w:r>
+    </w:p>
+    <w:p>
+      <w:pPr>
+        <w:pStyle w:val="ListBullet"/>
+      </w:pPr>
+      <w:r>
+        <w:t>代码仓库：https://github.com/STW135-2026/moonsentinel</w:t>
       </w:r>
     </w:p>
     <w:p>
       <w:pPr>
         <w:pStyle w:val="Heading1"/>
-        <w:keepNext/>
-        <w:spacing w:before="180" w:after="80"/>
       </w:pPr>
       <w:r>
-        <w:rPr>
-          <w:rFonts w:ascii="Microsoft YaHei" w:hAnsi="Microsoft YaHei" w:eastAsia="Microsoft YaHei"/>
-          <w:b/>
-          <w:color w:val="000000"/>
-          <w:sz w:val="28"/>
-        </w:rPr>
-        <w:t>一 项目定位</w:t>
+        <w:t>项目从什么问题开始</w:t>
       </w:r>
     </w:p>
     <w:p>
-      <w:pPr>
-        <w:spacing w:after="80" w:line="288" w:lineRule="auto"/>
-        <w:ind w:firstLine="420"/>
-      </w:pPr>
       <w:r>
-        <w:rPr>
-          <w:rFonts w:ascii="Microsoft YaHei" w:hAnsi="Microsoft YaHei" w:eastAsia="Microsoft YaHei"/>
-          <w:b w:val="0"/>
-          <w:color w:val="1F1F1F"/>
-          <w:sz w:val="21"/>
-        </w:rPr>
-        <w:t>MoonSentinel 是使用 MoonBit 编写的 Arrow 隐私发布门禁。调用方提交 Arrow RecordBatch、PrivacyPolicy 和 ReleaseRequest，系统判断这批数据在指定用途和接收方条件下能否发布，并同时生成获准数据、隔离数据、隐私发现和发布清单四个 Arrow RecordBatch。</w:t>
+        <w:t>一份数据通过格式和质量检查，不等于它可以直接交给合作方。交付人员还要确认本次用途是否获准、接收方是否在授权范围内、每条记录是否具有对应同意，以及交付结果中是否仍有能够识别个人的字段或过小人群。</w:t>
       </w:r>
     </w:p>
     <w:p>
-      <w:pPr>
-        <w:spacing w:after="80" w:line="288" w:lineRule="auto"/>
-        <w:ind w:firstLine="420"/>
-      </w:pPr>
       <w:r>
-        <w:rPr>
-          <w:rFonts w:ascii="Microsoft YaHei" w:hAnsi="Microsoft YaHei" w:eastAsia="Microsoft YaHei"/>
-          <w:b w:val="0"/>
-          <w:color w:val="1F1F1F"/>
-          <w:sz w:val="21"/>
-        </w:rPr>
-        <w:t>本项目回答的是“这批数据能否因这个用途交给这个接收方”这一授权问题，而不是“字段格式是否正确”这一数据质量问题。它不提供通用合同校验、质量评分、数据画像、合同差异或 CSV/JSONL 验证命令。</w:t>
+        <w:t>这不是某一个行业才会遇到的问题。科研机构交换样本、企业把业务数据交给外部服务商、团队共享用户或设备数据、整理可公开数据集时，都要面对相似的决定：数据是否可以用于这次目的，接收方是否合适，哪些记录具备授权，哪些字段应当删除或处理，以及小群体是否容易被重新识别。</w:t>
+      </w:r>
+    </w:p>
+    <w:p>
+      <w:r>
+        <w:t>目前这些条件常散落在临时 SQL、导出脚本和人工表格里；源表新增列时，select * 还可能把新字段一并带出。问题发生后，团队也很难复现当时依据什么放行了哪些行和列。MoonSentinel把一次发布请求、隐私策略和输出结果绑定起来，让这项检查可以重复执行，并留下可核对的原因。</w:t>
       </w:r>
     </w:p>
     <w:p>
       <w:pPr>
         <w:pStyle w:val="Heading1"/>
-        <w:keepNext/>
-        <w:spacing w:before="180" w:after="80"/>
       </w:pPr>
       <w:r>
-        <w:rPr>
-          <w:rFonts w:ascii="Microsoft YaHei" w:hAnsi="Microsoft YaHei" w:eastAsia="Microsoft YaHei"/>
-          <w:b/>
-          <w:color w:val="000000"/>
-          <w:sz w:val="28"/>
-        </w:rPr>
-        <w:t>二 实际问题和目标用户</w:t>
+        <w:t>项目做什么</w:t>
+      </w:r>
+    </w:p>
+    <w:p>
+      <w:r>
+        <w:t>MoonSentinel 是用 MoonBit 编写的数据共享隐私发布门禁。输入可以是 Arrow RecordBatch、JSONL 或 CSV：文本适配器将记录转为 Arrow，再交给同一套发布策略。JSONL 每行一个扁平对象；CSV 使用首行表头，按 UTF-8 文本列导入，未加引号的空单元格转为 null，"" 保留为空字符串。调用方同时提供 PrivacyPolicy 和一次 ReleaseRequest。请求中写明请求编号、用途和接收方；策略中写明允许的用途、允许的接收方、策略认可的同意值、准标识符、敏感字段及各列的输出方式。</w:t>
+      </w:r>
+    </w:p>
+    <w:p>
+      <w:r>
+        <w:t>核心规则不依赖具体行业，按固定顺序处理一次交付：</w:t>
       </w:r>
     </w:p>
     <w:p>
       <w:pPr>
-        <w:spacing w:after="80" w:line="288" w:lineRule="auto"/>
-        <w:ind w:firstLine="420"/>
+        <w:pStyle w:val="ListNumber"/>
       </w:pPr>
       <w:r>
-        <w:rPr>
-          <w:rFonts w:ascii="Microsoft YaHei" w:hAnsi="Microsoft YaHei" w:eastAsia="Microsoft YaHei"/>
-          <w:b w:val="0"/>
-          <w:color w:val="1F1F1F"/>
-          <w:sz w:val="21"/>
-        </w:rPr>
-        <w:t>研究数据、风控样本、合作方数据集和 AI 训练数据经常已经满足格式要求，却仍可能因为用途越界、接收方未获授权、用户未同意、准标识符群体过小、敏感属性过于集中或多余字段外泄而不能发布。MoonSentinel 把这些隐私条件变成可测试、可审计的代码路径。</w:t>
+        <w:t>用途或接收方不在允许范围内时，整批拒绝；</w:t>
       </w:r>
     </w:p>
     <w:p>
       <w:pPr>
-        <w:spacing w:after="60" w:line="274" w:lineRule="auto"/>
-        <w:ind w:left="432" w:hanging="288"/>
+        <w:pStyle w:val="ListNumber"/>
       </w:pPr>
       <w:r>
-        <w:rPr>
-          <w:rFonts w:ascii="Microsoft YaHei" w:hAnsi="Microsoft YaHei" w:eastAsia="Microsoft YaHei"/>
-          <w:b w:val="0"/>
-          <w:color w:val="1F1F1F"/>
-          <w:sz w:val="21"/>
-        </w:rPr>
-        <w:t>1. 数据负责人在向合作方交付数据前，验证用途、接收方和最小群体规模。</w:t>
+        <w:t>逐行检查同意字段，缺失或不符合策略的记录进入隔离结果；</w:t>
       </w:r>
     </w:p>
     <w:p>
       <w:pPr>
-        <w:spacing w:after="60" w:line="274" w:lineRule="auto"/>
-        <w:ind w:left="432" w:hanging="288"/>
+        <w:pStyle w:val="ListNumber"/>
       </w:pPr>
       <w:r>
-        <w:rPr>
-          <w:rFonts w:ascii="Microsoft YaHei" w:hAnsi="Microsoft YaHei" w:eastAsia="Microsoft YaHei"/>
-          <w:b w:val="0"/>
-          <w:color w:val="1F1F1F"/>
-          <w:sz w:val="21"/>
-        </w:rPr>
-        <w:t>2. 研究与风控团队只获得与申请用途相关的字段和已同意的记录。</w:t>
+        <w:t>对候选记录执行 k-匿名和 l-diversity 检查，降低小群体特征带来的重新识别风险；</w:t>
       </w:r>
     </w:p>
     <w:p>
       <w:pPr>
-        <w:spacing w:after="60" w:line="274" w:lineRule="auto"/>
-        <w:ind w:left="432" w:hanging="288"/>
+        <w:pStyle w:val="ListNumber"/>
       </w:pPr>
       <w:r>
-        <w:rPr>
-          <w:rFonts w:ascii="Microsoft YaHei" w:hAnsi="Microsoft YaHei" w:eastAsia="Microsoft YaHei"/>
-          <w:b w:val="0"/>
-          <w:color w:val="1F1F1F"/>
-          <w:sz w:val="21"/>
-        </w:rPr>
-        <w:t>3. 浏览器或边缘应用通过 MoonBit/Wasm 在本地执行同一套发布策略。</w:t>
+        <w:t>只输出策略明确列出的字段，直接标识符和敏感字段只能删除或替换；</w:t>
       </w:r>
     </w:p>
     <w:p>
       <w:pPr>
-        <w:spacing w:after="60" w:line="274" w:lineRule="auto"/>
-        <w:ind w:left="432" w:hanging="288"/>
+        <w:pStyle w:val="ListNumber"/>
       </w:pPr>
       <w:r>
-        <w:rPr>
-          <w:rFonts w:ascii="Microsoft YaHei" w:hAnsi="Microsoft YaHei" w:eastAsia="Microsoft YaHei"/>
-          <w:b w:val="0"/>
-          <w:color w:val="1F1F1F"/>
-          <w:sz w:val="21"/>
-        </w:rPr>
-        <w:t>4. 审计人员通过 Arrow 发布清单追踪申请编号、策略编号、放行量和隔离量。</w:t>
+        <w:t>同时生成可交付数据、隔离数据、拒绝原因和交付回执四个 Arrow 表。</w:t>
       </w:r>
     </w:p>
     <w:p>
       <w:pPr>
         <w:pStyle w:val="Heading1"/>
-        <w:keepNext/>
-        <w:spacing w:before="180" w:after="80"/>
       </w:pPr>
       <w:r>
-        <w:rPr>
-          <w:rFonts w:ascii="Microsoft YaHei" w:hAnsi="Microsoft YaHei" w:eastAsia="Microsoft YaHei"/>
-          <w:b/>
-          <w:color w:val="000000"/>
-          <w:sz w:val="28"/>
-        </w:rPr>
-        <w:t>三 已完成的 MVP</w:t>
-      </w:r>
-    </w:p>
-    <w:tbl>
-      <w:tblPr>
-        <w:tblW w:type="auto" w:w="0"/>
-        <w:jc w:val="center"/>
-        <w:tblLayout w:type="fixed"/>
-        <w:tblLook w:firstColumn="1" w:firstRow="1" w:lastColumn="0" w:lastRow="0" w:noHBand="0" w:noVBand="1" w:val="04A0"/>
-        <w:tblBorders>
-          <w:top w:val="single" w:sz="6" w:space="0" w:color="D9D9D9"/>
-          <w:left w:val="single" w:sz="6" w:space="0" w:color="D9D9D9"/>
-          <w:bottom w:val="single" w:sz="6" w:space="0" w:color="D9D9D9"/>
-          <w:right w:val="single" w:sz="6" w:space="0" w:color="D9D9D9"/>
-          <w:insideH w:val="single" w:sz="6" w:space="0" w:color="D9D9D9"/>
-          <w:insideV w:val="single" w:sz="6" w:space="0" w:color="D9D9D9"/>
-        </w:tblBorders>
-      </w:tblPr>
-      <w:tblGrid>
-        <w:gridCol w:w="3278"/>
-        <w:gridCol w:w="3278"/>
-        <w:gridCol w:w="3278"/>
-      </w:tblGrid>
-      <w:tr>
-        <w:trPr>
-          <w:tblHeader w:val="true"/>
-          <w:cantSplit w:val="true"/>
-        </w:trPr>
-        <w:tc>
-          <w:tcPr>
-            <w:tcW w:type="dxa" w:w="1656"/>
-            <w:shd w:fill="17365D"/>
-            <w:vAlign w:val="center"/>
-            <w:tcMar>
-              <w:top w:w="65" w:type="dxa"/>
-              <w:start w:w="105" w:type="dxa"/>
-              <w:bottom w:w="65" w:type="dxa"/>
-              <w:end w:w="105" w:type="dxa"/>
-            </w:tcMar>
-          </w:tcPr>
-          <w:p>
-            <w:pPr>
-              <w:spacing w:before="0" w:after="0" w:line="254" w:lineRule="auto"/>
-              <w:jc w:val="center"/>
-            </w:pPr>
-            <w:r>
-              <w:rPr>
-                <w:rFonts w:ascii="Microsoft YaHei" w:hAnsi="Microsoft YaHei" w:eastAsia="Microsoft YaHei"/>
-                <w:b/>
-                <w:color w:val="FFFFFF"/>
-                <w:sz w:val="18"/>
-              </w:rPr>
-              <w:t>能力</w:t>
-            </w:r>
-          </w:p>
-        </w:tc>
-        <w:tc>
-          <w:tcPr>
-            <w:tcW w:type="dxa" w:w="6408"/>
-            <w:shd w:fill="17365D"/>
-            <w:vAlign w:val="center"/>
-            <w:tcMar>
-              <w:top w:w="65" w:type="dxa"/>
-              <w:start w:w="105" w:type="dxa"/>
-              <w:bottom w:w="65" w:type="dxa"/>
-              <w:end w:w="105" w:type="dxa"/>
-            </w:tcMar>
-          </w:tcPr>
-          <w:p>
-            <w:pPr>
-              <w:spacing w:before="0" w:after="0" w:line="254" w:lineRule="auto"/>
-              <w:jc w:val="center"/>
-            </w:pPr>
-            <w:r>
-              <w:rPr>
-                <w:rFonts w:ascii="Microsoft YaHei" w:hAnsi="Microsoft YaHei" w:eastAsia="Microsoft YaHei"/>
-                <w:b/>
-                <w:color w:val="FFFFFF"/>
-                <w:sz w:val="18"/>
-              </w:rPr>
-              <w:t>当前实现</w:t>
-            </w:r>
-          </w:p>
-        </w:tc>
-        <w:tc>
-          <w:tcPr>
-            <w:tcW w:type="dxa" w:w="1944"/>
-            <w:shd w:fill="17365D"/>
-            <w:vAlign w:val="center"/>
-            <w:tcMar>
-              <w:top w:w="65" w:type="dxa"/>
-              <w:start w:w="105" w:type="dxa"/>
-              <w:bottom w:w="65" w:type="dxa"/>
-              <w:end w:w="105" w:type="dxa"/>
-            </w:tcMar>
-          </w:tcPr>
-          <w:p>
-            <w:pPr>
-              <w:spacing w:before="0" w:after="0" w:line="254" w:lineRule="auto"/>
-              <w:jc w:val="center"/>
-            </w:pPr>
-            <w:r>
-              <w:rPr>
-                <w:rFonts w:ascii="Microsoft YaHei" w:hAnsi="Microsoft YaHei" w:eastAsia="Microsoft YaHei"/>
-                <w:b/>
-                <w:color w:val="FFFFFF"/>
-                <w:sz w:val="18"/>
-              </w:rPr>
-              <w:t>验证</w:t>
-            </w:r>
-          </w:p>
-        </w:tc>
-      </w:tr>
-      <w:tr>
-        <w:trPr>
-          <w:cantSplit w:val="true"/>
-        </w:trPr>
-        <w:tc>
-          <w:tcPr>
-            <w:tcW w:type="dxa" w:w="1656"/>
-            <w:vAlign w:val="center"/>
-            <w:tcMar>
-              <w:top w:w="65" w:type="dxa"/>
-              <w:start w:w="105" w:type="dxa"/>
-              <w:bottom w:w="65" w:type="dxa"/>
-              <w:end w:w="105" w:type="dxa"/>
-            </w:tcMar>
-          </w:tcPr>
-          <w:p>
-            <w:pPr>
-              <w:spacing w:before="0" w:after="0" w:line="254" w:lineRule="auto"/>
-              <w:jc w:val="center"/>
-            </w:pPr>
-            <w:r>
-              <w:rPr>
-                <w:rFonts w:ascii="Microsoft YaHei" w:hAnsi="Microsoft YaHei" w:eastAsia="Microsoft YaHei"/>
-                <w:b w:val="0"/>
-                <w:color w:val="1F1F1F"/>
-                <w:sz w:val="18"/>
-              </w:rPr>
-              <w:t>用途约束</w:t>
-            </w:r>
-          </w:p>
-        </w:tc>
-        <w:tc>
-          <w:tcPr>
-            <w:tcW w:type="dxa" w:w="6408"/>
-            <w:vAlign w:val="center"/>
-            <w:tcMar>
-              <w:top w:w="65" w:type="dxa"/>
-              <w:start w:w="105" w:type="dxa"/>
-              <w:bottom w:w="65" w:type="dxa"/>
-              <w:end w:w="105" w:type="dxa"/>
-            </w:tcMar>
-          </w:tcPr>
-          <w:p>
-            <w:pPr>
-              <w:spacing w:before="0" w:after="0" w:line="254" w:lineRule="auto"/>
-              <w:jc w:val="left"/>
-            </w:pPr>
-            <w:r>
-              <w:rPr>
-                <w:rFonts w:ascii="Microsoft YaHei" w:hAnsi="Microsoft YaHei" w:eastAsia="Microsoft YaHei"/>
-                <w:b w:val="0"/>
-                <w:color w:val="1F1F1F"/>
-                <w:sz w:val="18"/>
-              </w:rPr>
-              <w:t>策略列出允许用途，越界用途整批拒绝</w:t>
-            </w:r>
-          </w:p>
-        </w:tc>
-        <w:tc>
-          <w:tcPr>
-            <w:tcW w:type="dxa" w:w="1944"/>
-            <w:vAlign w:val="center"/>
-            <w:tcMar>
-              <w:top w:w="65" w:type="dxa"/>
-              <w:start w:w="105" w:type="dxa"/>
-              <w:bottom w:w="65" w:type="dxa"/>
-              <w:end w:w="105" w:type="dxa"/>
-            </w:tcMar>
-          </w:tcPr>
-          <w:p>
-            <w:pPr>
-              <w:spacing w:before="0" w:after="0" w:line="254" w:lineRule="auto"/>
-              <w:jc w:val="center"/>
-            </w:pPr>
-            <w:r>
-              <w:rPr>
-                <w:rFonts w:ascii="Microsoft YaHei" w:hAnsi="Microsoft YaHei" w:eastAsia="Microsoft YaHei"/>
-                <w:b w:val="0"/>
-                <w:color w:val="1F1F1F"/>
-                <w:sz w:val="18"/>
-              </w:rPr>
-              <w:t>自动化测试</w:t>
-            </w:r>
-          </w:p>
-        </w:tc>
-      </w:tr>
-      <w:tr>
-        <w:trPr>
-          <w:cantSplit w:val="true"/>
-        </w:trPr>
-        <w:tc>
-          <w:tcPr>
-            <w:tcW w:type="dxa" w:w="1656"/>
-            <w:shd w:fill="F4F7FA"/>
-            <w:vAlign w:val="center"/>
-            <w:tcMar>
-              <w:top w:w="65" w:type="dxa"/>
-              <w:start w:w="105" w:type="dxa"/>
-              <w:bottom w:w="65" w:type="dxa"/>
-              <w:end w:w="105" w:type="dxa"/>
-            </w:tcMar>
-          </w:tcPr>
-          <w:p>
-            <w:pPr>
-              <w:spacing w:before="0" w:after="0" w:line="254" w:lineRule="auto"/>
-              <w:jc w:val="center"/>
-            </w:pPr>
-            <w:r>
-              <w:rPr>
-                <w:rFonts w:ascii="Microsoft YaHei" w:hAnsi="Microsoft YaHei" w:eastAsia="Microsoft YaHei"/>
-                <w:b w:val="0"/>
-                <w:color w:val="1F1F1F"/>
-                <w:sz w:val="18"/>
-              </w:rPr>
-              <w:t>接收方约束</w:t>
-            </w:r>
-          </w:p>
-        </w:tc>
-        <w:tc>
-          <w:tcPr>
-            <w:tcW w:type="dxa" w:w="6408"/>
-            <w:shd w:fill="F4F7FA"/>
-            <w:vAlign w:val="center"/>
-            <w:tcMar>
-              <w:top w:w="65" w:type="dxa"/>
-              <w:start w:w="105" w:type="dxa"/>
-              <w:bottom w:w="65" w:type="dxa"/>
-              <w:end w:w="105" w:type="dxa"/>
-            </w:tcMar>
-          </w:tcPr>
-          <w:p>
-            <w:pPr>
-              <w:spacing w:before="0" w:after="0" w:line="254" w:lineRule="auto"/>
-              <w:jc w:val="left"/>
-            </w:pPr>
-            <w:r>
-              <w:rPr>
-                <w:rFonts w:ascii="Microsoft YaHei" w:hAnsi="Microsoft YaHei" w:eastAsia="Microsoft YaHei"/>
-                <w:b w:val="0"/>
-                <w:color w:val="1F1F1F"/>
-                <w:sz w:val="18"/>
-              </w:rPr>
-              <w:t>Internal、Partner、Public 分级授权</w:t>
-            </w:r>
-          </w:p>
-        </w:tc>
-        <w:tc>
-          <w:tcPr>
-            <w:tcW w:type="dxa" w:w="1944"/>
-            <w:shd w:fill="F4F7FA"/>
-            <w:vAlign w:val="center"/>
-            <w:tcMar>
-              <w:top w:w="65" w:type="dxa"/>
-              <w:start w:w="105" w:type="dxa"/>
-              <w:bottom w:w="65" w:type="dxa"/>
-              <w:end w:w="105" w:type="dxa"/>
-            </w:tcMar>
-          </w:tcPr>
-          <w:p>
-            <w:pPr>
-              <w:spacing w:before="0" w:after="0" w:line="254" w:lineRule="auto"/>
-              <w:jc w:val="center"/>
-            </w:pPr>
-            <w:r>
-              <w:rPr>
-                <w:rFonts w:ascii="Microsoft YaHei" w:hAnsi="Microsoft YaHei" w:eastAsia="Microsoft YaHei"/>
-                <w:b w:val="0"/>
-                <w:color w:val="1F1F1F"/>
-                <w:sz w:val="18"/>
-              </w:rPr>
-              <w:t>自动化测试</w:t>
-            </w:r>
-          </w:p>
-        </w:tc>
-      </w:tr>
-      <w:tr>
-        <w:trPr>
-          <w:cantSplit w:val="true"/>
-        </w:trPr>
-        <w:tc>
-          <w:tcPr>
-            <w:tcW w:type="dxa" w:w="1656"/>
-            <w:vAlign w:val="center"/>
-            <w:tcMar>
-              <w:top w:w="65" w:type="dxa"/>
-              <w:start w:w="105" w:type="dxa"/>
-              <w:bottom w:w="65" w:type="dxa"/>
-              <w:end w:w="105" w:type="dxa"/>
-            </w:tcMar>
-          </w:tcPr>
-          <w:p>
-            <w:pPr>
-              <w:spacing w:before="0" w:after="0" w:line="254" w:lineRule="auto"/>
-              <w:jc w:val="center"/>
-            </w:pPr>
-            <w:r>
-              <w:rPr>
-                <w:rFonts w:ascii="Microsoft YaHei" w:hAnsi="Microsoft YaHei" w:eastAsia="Microsoft YaHei"/>
-                <w:b w:val="0"/>
-                <w:color w:val="1F1F1F"/>
-                <w:sz w:val="18"/>
-              </w:rPr>
-              <w:t>逐行同意</w:t>
-            </w:r>
-          </w:p>
-        </w:tc>
-        <w:tc>
-          <w:tcPr>
-            <w:tcW w:type="dxa" w:w="6408"/>
-            <w:vAlign w:val="center"/>
-            <w:tcMar>
-              <w:top w:w="65" w:type="dxa"/>
-              <w:start w:w="105" w:type="dxa"/>
-              <w:bottom w:w="65" w:type="dxa"/>
-              <w:end w:w="105" w:type="dxa"/>
-            </w:tcMar>
-          </w:tcPr>
-          <w:p>
-            <w:pPr>
-              <w:spacing w:before="0" w:after="0" w:line="254" w:lineRule="auto"/>
-              <w:jc w:val="left"/>
-            </w:pPr>
-            <w:r>
-              <w:rPr>
-                <w:rFonts w:ascii="Microsoft YaHei" w:hAnsi="Microsoft YaHei" w:eastAsia="Microsoft YaHei"/>
-                <w:b w:val="0"/>
-                <w:color w:val="1F1F1F"/>
-                <w:sz w:val="18"/>
-              </w:rPr>
-              <w:t>按同意列筛选候选记录，未同意行进入隔离</w:t>
-            </w:r>
-          </w:p>
-        </w:tc>
-        <w:tc>
-          <w:tcPr>
-            <w:tcW w:type="dxa" w:w="1944"/>
-            <w:vAlign w:val="center"/>
-            <w:tcMar>
-              <w:top w:w="65" w:type="dxa"/>
-              <w:start w:w="105" w:type="dxa"/>
-              <w:bottom w:w="65" w:type="dxa"/>
-              <w:end w:w="105" w:type="dxa"/>
-            </w:tcMar>
-          </w:tcPr>
-          <w:p>
-            <w:pPr>
-              <w:spacing w:before="0" w:after="0" w:line="254" w:lineRule="auto"/>
-              <w:jc w:val="center"/>
-            </w:pPr>
-            <w:r>
-              <w:rPr>
-                <w:rFonts w:ascii="Microsoft YaHei" w:hAnsi="Microsoft YaHei" w:eastAsia="Microsoft YaHei"/>
-                <w:b w:val="0"/>
-                <w:color w:val="1F1F1F"/>
-                <w:sz w:val="18"/>
-              </w:rPr>
-              <w:t>自动化测试</w:t>
-            </w:r>
-          </w:p>
-        </w:tc>
-      </w:tr>
-      <w:tr>
-        <w:trPr>
-          <w:cantSplit w:val="true"/>
-        </w:trPr>
-        <w:tc>
-          <w:tcPr>
-            <w:tcW w:type="dxa" w:w="1656"/>
-            <w:shd w:fill="F4F7FA"/>
-            <w:vAlign w:val="center"/>
-            <w:tcMar>
-              <w:top w:w="65" w:type="dxa"/>
-              <w:start w:w="105" w:type="dxa"/>
-              <w:bottom w:w="65" w:type="dxa"/>
-              <w:end w:w="105" w:type="dxa"/>
-            </w:tcMar>
-          </w:tcPr>
-          <w:p>
-            <w:pPr>
-              <w:spacing w:before="0" w:after="0" w:line="254" w:lineRule="auto"/>
-              <w:jc w:val="center"/>
-            </w:pPr>
-            <w:r>
-              <w:rPr>
-                <w:rFonts w:ascii="Microsoft YaHei" w:hAnsi="Microsoft YaHei" w:eastAsia="Microsoft YaHei"/>
-                <w:b w:val="0"/>
-                <w:color w:val="1F1F1F"/>
-                <w:sz w:val="18"/>
-              </w:rPr>
-              <w:t>k 匿名</w:t>
-            </w:r>
-          </w:p>
-        </w:tc>
-        <w:tc>
-          <w:tcPr>
-            <w:tcW w:type="dxa" w:w="6408"/>
-            <w:shd w:fill="F4F7FA"/>
-            <w:vAlign w:val="center"/>
-            <w:tcMar>
-              <w:top w:w="65" w:type="dxa"/>
-              <w:start w:w="105" w:type="dxa"/>
-              <w:bottom w:w="65" w:type="dxa"/>
-              <w:end w:w="105" w:type="dxa"/>
-            </w:tcMar>
-          </w:tcPr>
-          <w:p>
-            <w:pPr>
-              <w:spacing w:before="0" w:after="0" w:line="254" w:lineRule="auto"/>
-              <w:jc w:val="left"/>
-            </w:pPr>
-            <w:r>
-              <w:rPr>
-                <w:rFonts w:ascii="Microsoft YaHei" w:hAnsi="Microsoft YaHei" w:eastAsia="Microsoft YaHei"/>
-                <w:b w:val="0"/>
-                <w:color w:val="1F1F1F"/>
-                <w:sz w:val="18"/>
-              </w:rPr>
-              <w:t>只在已同意候选行中按准标识符组合计算等价类</w:t>
-            </w:r>
-          </w:p>
-        </w:tc>
-        <w:tc>
-          <w:tcPr>
-            <w:tcW w:type="dxa" w:w="1944"/>
-            <w:shd w:fill="F4F7FA"/>
-            <w:vAlign w:val="center"/>
-            <w:tcMar>
-              <w:top w:w="65" w:type="dxa"/>
-              <w:start w:w="105" w:type="dxa"/>
-              <w:bottom w:w="65" w:type="dxa"/>
-              <w:end w:w="105" w:type="dxa"/>
-            </w:tcMar>
-          </w:tcPr>
-          <w:p>
-            <w:pPr>
-              <w:spacing w:before="0" w:after="0" w:line="254" w:lineRule="auto"/>
-              <w:jc w:val="center"/>
-            </w:pPr>
-            <w:r>
-              <w:rPr>
-                <w:rFonts w:ascii="Microsoft YaHei" w:hAnsi="Microsoft YaHei" w:eastAsia="Microsoft YaHei"/>
-                <w:b w:val="0"/>
-                <w:color w:val="1F1F1F"/>
-                <w:sz w:val="18"/>
-              </w:rPr>
-              <w:t>自动化测试</w:t>
-            </w:r>
-          </w:p>
-        </w:tc>
-      </w:tr>
-      <w:tr>
-        <w:trPr>
-          <w:cantSplit w:val="true"/>
-        </w:trPr>
-        <w:tc>
-          <w:tcPr>
-            <w:tcW w:type="dxa" w:w="1656"/>
-            <w:vAlign w:val="center"/>
-            <w:tcMar>
-              <w:top w:w="65" w:type="dxa"/>
-              <w:start w:w="105" w:type="dxa"/>
-              <w:bottom w:w="65" w:type="dxa"/>
-              <w:end w:w="105" w:type="dxa"/>
-            </w:tcMar>
-          </w:tcPr>
-          <w:p>
-            <w:pPr>
-              <w:spacing w:before="0" w:after="0" w:line="254" w:lineRule="auto"/>
-              <w:jc w:val="center"/>
-            </w:pPr>
-            <w:r>
-              <w:rPr>
-                <w:rFonts w:ascii="Microsoft YaHei" w:hAnsi="Microsoft YaHei" w:eastAsia="Microsoft YaHei"/>
-                <w:b w:val="0"/>
-                <w:color w:val="1F1F1F"/>
-                <w:sz w:val="18"/>
-              </w:rPr>
-              <w:t>l-diversity</w:t>
-            </w:r>
-          </w:p>
-        </w:tc>
-        <w:tc>
-          <w:tcPr>
-            <w:tcW w:type="dxa" w:w="6408"/>
-            <w:vAlign w:val="center"/>
-            <w:tcMar>
-              <w:top w:w="65" w:type="dxa"/>
-              <w:start w:w="105" w:type="dxa"/>
-              <w:bottom w:w="65" w:type="dxa"/>
-              <w:end w:w="105" w:type="dxa"/>
-            </w:tcMar>
-          </w:tcPr>
-          <w:p>
-            <w:pPr>
-              <w:spacing w:before="0" w:after="0" w:line="254" w:lineRule="auto"/>
-              <w:jc w:val="left"/>
-            </w:pPr>
-            <w:r>
-              <w:rPr>
-                <w:rFonts w:ascii="Microsoft YaHei" w:hAnsi="Microsoft YaHei" w:eastAsia="Microsoft YaHei"/>
-                <w:b w:val="0"/>
-                <w:color w:val="1F1F1F"/>
-                <w:sz w:val="18"/>
-              </w:rPr>
-              <w:t>只在通过 k 匿名的固定候选集中检查敏感属性不同值</w:t>
-            </w:r>
-          </w:p>
-        </w:tc>
-        <w:tc>
-          <w:tcPr>
-            <w:tcW w:type="dxa" w:w="1944"/>
-            <w:vAlign w:val="center"/>
-            <w:tcMar>
-              <w:top w:w="65" w:type="dxa"/>
-              <w:start w:w="105" w:type="dxa"/>
-              <w:bottom w:w="65" w:type="dxa"/>
-              <w:end w:w="105" w:type="dxa"/>
-            </w:tcMar>
-          </w:tcPr>
-          <w:p>
-            <w:pPr>
-              <w:spacing w:before="0" w:after="0" w:line="254" w:lineRule="auto"/>
-              <w:jc w:val="center"/>
-            </w:pPr>
-            <w:r>
-              <w:rPr>
-                <w:rFonts w:ascii="Microsoft YaHei" w:hAnsi="Microsoft YaHei" w:eastAsia="Microsoft YaHei"/>
-                <w:b w:val="0"/>
-                <w:color w:val="1F1F1F"/>
-                <w:sz w:val="18"/>
-              </w:rPr>
-              <w:t>自动化测试</w:t>
-            </w:r>
-          </w:p>
-        </w:tc>
-      </w:tr>
-      <w:tr>
-        <w:trPr>
-          <w:cantSplit w:val="true"/>
-        </w:trPr>
-        <w:tc>
-          <w:tcPr>
-            <w:tcW w:type="dxa" w:w="1656"/>
-            <w:shd w:fill="F4F7FA"/>
-            <w:vAlign w:val="center"/>
-            <w:tcMar>
-              <w:top w:w="65" w:type="dxa"/>
-              <w:start w:w="105" w:type="dxa"/>
-              <w:bottom w:w="65" w:type="dxa"/>
-              <w:end w:w="105" w:type="dxa"/>
-            </w:tcMar>
-          </w:tcPr>
-          <w:p>
-            <w:pPr>
-              <w:spacing w:before="0" w:after="0" w:line="254" w:lineRule="auto"/>
-              <w:jc w:val="center"/>
-            </w:pPr>
-            <w:r>
-              <w:rPr>
-                <w:rFonts w:ascii="Microsoft YaHei" w:hAnsi="Microsoft YaHei" w:eastAsia="Microsoft YaHei"/>
-                <w:b w:val="0"/>
-                <w:color w:val="1F1F1F"/>
-                <w:sz w:val="18"/>
-              </w:rPr>
-              <w:t>最小化发布</w:t>
-            </w:r>
-          </w:p>
-        </w:tc>
-        <w:tc>
-          <w:tcPr>
-            <w:tcW w:type="dxa" w:w="6408"/>
-            <w:shd w:fill="F4F7FA"/>
-            <w:vAlign w:val="center"/>
-            <w:tcMar>
-              <w:top w:w="65" w:type="dxa"/>
-              <w:start w:w="105" w:type="dxa"/>
-              <w:bottom w:w="65" w:type="dxa"/>
-              <w:end w:w="105" w:type="dxa"/>
-            </w:tcMar>
-          </w:tcPr>
-          <w:p>
-            <w:pPr>
-              <w:spacing w:before="0" w:after="0" w:line="254" w:lineRule="auto"/>
-              <w:jc w:val="left"/>
-            </w:pPr>
-            <w:r>
-              <w:rPr>
-                <w:rFonts w:ascii="Microsoft YaHei" w:hAnsi="Microsoft YaHei" w:eastAsia="Microsoft YaHei"/>
-                <w:b w:val="0"/>
-                <w:color w:val="1F1F1F"/>
-                <w:sz w:val="18"/>
-              </w:rPr>
-              <w:t>仅发布策略列明字段，未列字段默认不输出</w:t>
-            </w:r>
-          </w:p>
-        </w:tc>
-        <w:tc>
-          <w:tcPr>
-            <w:tcW w:type="dxa" w:w="1944"/>
-            <w:shd w:fill="F4F7FA"/>
-            <w:vAlign w:val="center"/>
-            <w:tcMar>
-              <w:top w:w="65" w:type="dxa"/>
-              <w:start w:w="105" w:type="dxa"/>
-              <w:bottom w:w="65" w:type="dxa"/>
-              <w:end w:w="105" w:type="dxa"/>
-            </w:tcMar>
-          </w:tcPr>
-          <w:p>
-            <w:pPr>
-              <w:spacing w:before="0" w:after="0" w:line="254" w:lineRule="auto"/>
-              <w:jc w:val="center"/>
-            </w:pPr>
-            <w:r>
-              <w:rPr>
-                <w:rFonts w:ascii="Microsoft YaHei" w:hAnsi="Microsoft YaHei" w:eastAsia="Microsoft YaHei"/>
-                <w:b w:val="0"/>
-                <w:color w:val="1F1F1F"/>
-                <w:sz w:val="18"/>
-              </w:rPr>
-              <w:t>自动化测试</w:t>
-            </w:r>
-          </w:p>
-        </w:tc>
-      </w:tr>
-      <w:tr>
-        <w:trPr>
-          <w:cantSplit w:val="true"/>
-        </w:trPr>
-        <w:tc>
-          <w:tcPr>
-            <w:tcW w:type="dxa" w:w="1656"/>
-            <w:vAlign w:val="center"/>
-            <w:tcMar>
-              <w:top w:w="65" w:type="dxa"/>
-              <w:start w:w="105" w:type="dxa"/>
-              <w:bottom w:w="65" w:type="dxa"/>
-              <w:end w:w="105" w:type="dxa"/>
-            </w:tcMar>
-          </w:tcPr>
-          <w:p>
-            <w:pPr>
-              <w:spacing w:before="0" w:after="0" w:line="254" w:lineRule="auto"/>
-              <w:jc w:val="center"/>
-            </w:pPr>
-            <w:r>
-              <w:rPr>
-                <w:rFonts w:ascii="Microsoft YaHei" w:hAnsi="Microsoft YaHei" w:eastAsia="Microsoft YaHei"/>
-                <w:b w:val="0"/>
-                <w:color w:val="1F1F1F"/>
-                <w:sz w:val="18"/>
-              </w:rPr>
-              <w:t>敏感处理</w:t>
-            </w:r>
-          </w:p>
-        </w:tc>
-        <w:tc>
-          <w:tcPr>
-            <w:tcW w:type="dxa" w:w="6408"/>
-            <w:vAlign w:val="center"/>
-            <w:tcMar>
-              <w:top w:w="65" w:type="dxa"/>
-              <w:start w:w="105" w:type="dxa"/>
-              <w:bottom w:w="65" w:type="dxa"/>
-              <w:end w:w="105" w:type="dxa"/>
-            </w:tcMar>
-          </w:tcPr>
-          <w:p>
-            <w:pPr>
-              <w:spacing w:before="0" w:after="0" w:line="254" w:lineRule="auto"/>
-              <w:jc w:val="left"/>
-            </w:pPr>
-            <w:r>
-              <w:rPr>
-                <w:rFonts w:ascii="Microsoft YaHei" w:hAnsi="Microsoft YaHei" w:eastAsia="Microsoft YaHei"/>
-                <w:b w:val="0"/>
-                <w:color w:val="1F1F1F"/>
-                <w:sz w:val="18"/>
-              </w:rPr>
-              <w:t>直接标识符和敏感字段必须替换或删除，禁止原值 Keep</w:t>
-            </w:r>
-          </w:p>
-        </w:tc>
-        <w:tc>
-          <w:tcPr>
-            <w:tcW w:type="dxa" w:w="1944"/>
-            <w:vAlign w:val="center"/>
-            <w:tcMar>
-              <w:top w:w="65" w:type="dxa"/>
-              <w:start w:w="105" w:type="dxa"/>
-              <w:bottom w:w="65" w:type="dxa"/>
-              <w:end w:w="105" w:type="dxa"/>
-            </w:tcMar>
-          </w:tcPr>
-          <w:p>
-            <w:pPr>
-              <w:spacing w:before="0" w:after="0" w:line="254" w:lineRule="auto"/>
-              <w:jc w:val="center"/>
-            </w:pPr>
-            <w:r>
-              <w:rPr>
-                <w:rFonts w:ascii="Microsoft YaHei" w:hAnsi="Microsoft YaHei" w:eastAsia="Microsoft YaHei"/>
-                <w:b w:val="0"/>
-                <w:color w:val="1F1F1F"/>
-                <w:sz w:val="18"/>
-              </w:rPr>
-              <w:t>策略校验</w:t>
-            </w:r>
-          </w:p>
-        </w:tc>
-      </w:tr>
-      <w:tr>
-        <w:trPr>
-          <w:cantSplit w:val="true"/>
-        </w:trPr>
-        <w:tc>
-          <w:tcPr>
-            <w:tcW w:type="dxa" w:w="1656"/>
-            <w:shd w:fill="F4F7FA"/>
-            <w:vAlign w:val="center"/>
-            <w:tcMar>
-              <w:top w:w="65" w:type="dxa"/>
-              <w:start w:w="105" w:type="dxa"/>
-              <w:bottom w:w="65" w:type="dxa"/>
-              <w:end w:w="105" w:type="dxa"/>
-            </w:tcMar>
-          </w:tcPr>
-          <w:p>
-            <w:pPr>
-              <w:spacing w:before="0" w:after="0" w:line="254" w:lineRule="auto"/>
-              <w:jc w:val="center"/>
-            </w:pPr>
-            <w:r>
-              <w:rPr>
-                <w:rFonts w:ascii="Microsoft YaHei" w:hAnsi="Microsoft YaHei" w:eastAsia="Microsoft YaHei"/>
-                <w:b w:val="0"/>
-                <w:color w:val="1F1F1F"/>
-                <w:sz w:val="18"/>
-              </w:rPr>
-              <w:t>Arrow 结果</w:t>
-            </w:r>
-          </w:p>
-        </w:tc>
-        <w:tc>
-          <w:tcPr>
-            <w:tcW w:type="dxa" w:w="6408"/>
-            <w:shd w:fill="F4F7FA"/>
-            <w:vAlign w:val="center"/>
-            <w:tcMar>
-              <w:top w:w="65" w:type="dxa"/>
-              <w:start w:w="105" w:type="dxa"/>
-              <w:bottom w:w="65" w:type="dxa"/>
-              <w:end w:w="105" w:type="dxa"/>
-            </w:tcMar>
-          </w:tcPr>
-          <w:p>
-            <w:pPr>
-              <w:spacing w:before="0" w:after="0" w:line="254" w:lineRule="auto"/>
-              <w:jc w:val="left"/>
-            </w:pPr>
-            <w:r>
-              <w:rPr>
-                <w:rFonts w:ascii="Microsoft YaHei" w:hAnsi="Microsoft YaHei" w:eastAsia="Microsoft YaHei"/>
-                <w:b w:val="0"/>
-                <w:color w:val="1F1F1F"/>
-                <w:sz w:val="18"/>
-              </w:rPr>
-              <w:t>approved、quarantine、findings、manifest 四类 RecordBatch</w:t>
-            </w:r>
-          </w:p>
-        </w:tc>
-        <w:tc>
-          <w:tcPr>
-            <w:tcW w:type="dxa" w:w="1944"/>
-            <w:shd w:fill="F4F7FA"/>
-            <w:vAlign w:val="center"/>
-            <w:tcMar>
-              <w:top w:w="65" w:type="dxa"/>
-              <w:start w:w="105" w:type="dxa"/>
-              <w:bottom w:w="65" w:type="dxa"/>
-              <w:end w:w="105" w:type="dxa"/>
-            </w:tcMar>
-          </w:tcPr>
-          <w:p>
-            <w:pPr>
-              <w:spacing w:before="0" w:after="0" w:line="254" w:lineRule="auto"/>
-              <w:jc w:val="center"/>
-            </w:pPr>
-            <w:r>
-              <w:rPr>
-                <w:rFonts w:ascii="Microsoft YaHei" w:hAnsi="Microsoft YaHei" w:eastAsia="Microsoft YaHei"/>
-                <w:b w:val="0"/>
-                <w:color w:val="1F1F1F"/>
-                <w:sz w:val="18"/>
-              </w:rPr>
-              <w:t>IPC 回环</w:t>
-            </w:r>
-          </w:p>
-        </w:tc>
-      </w:tr>
-      <w:tr>
-        <w:trPr>
-          <w:cantSplit w:val="true"/>
-        </w:trPr>
-        <w:tc>
-          <w:tcPr>
-            <w:tcW w:type="dxa" w:w="1656"/>
-            <w:vAlign w:val="center"/>
-            <w:tcMar>
-              <w:top w:w="65" w:type="dxa"/>
-              <w:start w:w="105" w:type="dxa"/>
-              <w:bottom w:w="65" w:type="dxa"/>
-              <w:end w:w="105" w:type="dxa"/>
-            </w:tcMar>
-          </w:tcPr>
-          <w:p>
-            <w:pPr>
-              <w:spacing w:before="0" w:after="0" w:line="254" w:lineRule="auto"/>
-              <w:jc w:val="center"/>
-            </w:pPr>
-            <w:r>
-              <w:rPr>
-                <w:rFonts w:ascii="Microsoft YaHei" w:hAnsi="Microsoft YaHei" w:eastAsia="Microsoft YaHei"/>
-                <w:b w:val="0"/>
-                <w:color w:val="1F1F1F"/>
-                <w:sz w:val="18"/>
-              </w:rPr>
-              <w:t>跨目标</w:t>
-            </w:r>
-          </w:p>
-        </w:tc>
-        <w:tc>
-          <w:tcPr>
-            <w:tcW w:type="dxa" w:w="6408"/>
-            <w:vAlign w:val="center"/>
-            <w:tcMar>
-              <w:top w:w="65" w:type="dxa"/>
-              <w:start w:w="105" w:type="dxa"/>
-              <w:bottom w:w="65" w:type="dxa"/>
-              <w:end w:w="105" w:type="dxa"/>
-            </w:tcMar>
-          </w:tcPr>
-          <w:p>
-            <w:pPr>
-              <w:spacing w:before="0" w:after="0" w:line="254" w:lineRule="auto"/>
-              <w:jc w:val="left"/>
-            </w:pPr>
-            <w:r>
-              <w:rPr>
-                <w:rFonts w:ascii="Microsoft YaHei" w:hAnsi="Microsoft YaHei" w:eastAsia="Microsoft YaHei"/>
-                <w:b w:val="0"/>
-                <w:color w:val="1F1F1F"/>
-                <w:sz w:val="18"/>
-              </w:rPr>
-              <w:t>Native、JavaScript、Wasm、Wasm-GC</w:t>
-            </w:r>
-          </w:p>
-        </w:tc>
-        <w:tc>
-          <w:tcPr>
-            <w:tcW w:type="dxa" w:w="1944"/>
-            <w:vAlign w:val="center"/>
-            <w:tcMar>
-              <w:top w:w="65" w:type="dxa"/>
-              <w:start w:w="105" w:type="dxa"/>
-              <w:bottom w:w="65" w:type="dxa"/>
-              <w:end w:w="105" w:type="dxa"/>
-            </w:tcMar>
-          </w:tcPr>
-          <w:p>
-            <w:pPr>
-              <w:spacing w:before="0" w:after="0" w:line="254" w:lineRule="auto"/>
-              <w:jc w:val="center"/>
-            </w:pPr>
-            <w:r>
-              <w:rPr>
-                <w:rFonts w:ascii="Microsoft YaHei" w:hAnsi="Microsoft YaHei" w:eastAsia="Microsoft YaHei"/>
-                <w:b w:val="0"/>
-                <w:color w:val="1F1F1F"/>
-                <w:sz w:val="18"/>
-              </w:rPr>
-              <w:t>9 项测试全通过</w:t>
-            </w:r>
-          </w:p>
-        </w:tc>
-      </w:tr>
-    </w:tbl>
-    <w:p>
-      <w:pPr>
-        <w:spacing w:after="20"/>
-      </w:pPr>
-    </w:p>
-    <w:p>
-      <w:pPr>
-        <w:pStyle w:val="Heading1"/>
-        <w:keepNext/>
-        <w:spacing w:before="180" w:after="80"/>
-      </w:pPr>
-      <w:r>
-        <w:rPr>
-          <w:rFonts w:ascii="Microsoft YaHei" w:hAnsi="Microsoft YaHei" w:eastAsia="Microsoft YaHei"/>
-          <w:b/>
-          <w:color w:val="000000"/>
-          <w:sz w:val="28"/>
-        </w:rPr>
-        <w:t>四 发布决策流程</w:t>
+        <w:t>一个可运行的例子</w:t>
       </w:r>
     </w:p>
     <w:p>
-      <w:pPr>
-        <w:spacing w:after="60" w:line="274" w:lineRule="auto"/>
-        <w:ind w:left="432" w:hanging="288"/>
-      </w:pPr>
       <w:r>
-        <w:rPr>
-          <w:rFonts w:ascii="Microsoft YaHei" w:hAnsi="Microsoft YaHei" w:eastAsia="Microsoft YaHei"/>
-          <w:b w:val="0"/>
-          <w:color w:val="1F1F1F"/>
-          <w:sz w:val="21"/>
-        </w:rPr>
-        <w:t>1. 校验 PrivacyPolicy 和 ReleaseRequest 是否完整、互相匹配。</w:t>
+        <w:t>仓库中的示例模拟把反欺诈研究数据交给外部合作方。源数据有 6 行，包含用户编号、邮箱、研究同意、国家、年龄段、案件结果和风险分数。策略要求用途为 fraud_research、接收方为Partner，并要求 country + age_band 至少形成 2 人的匿名组，组内案件结果至少有 2 个不同值。</w:t>
       </w:r>
     </w:p>
     <w:p>
-      <w:pPr>
-        <w:spacing w:after="60" w:line="274" w:lineRule="auto"/>
-        <w:ind w:left="432" w:hanging="288"/>
-      </w:pPr>
       <w:r>
-        <w:rPr>
-          <w:rFonts w:ascii="Microsoft YaHei" w:hAnsi="Microsoft YaHei" w:eastAsia="Microsoft YaHei"/>
-          <w:b w:val="0"/>
-          <w:color w:val="1F1F1F"/>
-          <w:sz w:val="21"/>
-        </w:rPr>
-        <w:t>2. 检查用途和接收方是否在策略允许范围内；不允许则整批拒绝。</w:t>
-      </w:r>
-    </w:p>
-    <w:p>
-      <w:pPr>
-        <w:spacing w:after="60" w:line="274" w:lineRule="auto"/>
-        <w:ind w:left="432" w:hanging="288"/>
-      </w:pPr>
-      <w:r>
-        <w:rPr>
-          <w:rFonts w:ascii="Microsoft YaHei" w:hAnsi="Microsoft YaHei" w:eastAsia="Microsoft YaHei"/>
-          <w:b w:val="0"/>
-          <w:color w:val="1F1F1F"/>
-          <w:sz w:val="21"/>
-        </w:rPr>
-        <w:t>3. 依据同意列筛出候选行，未同意或缺少同意的数据进入隔离。</w:t>
-      </w:r>
-    </w:p>
-    <w:p>
-      <w:pPr>
-        <w:spacing w:after="60" w:line="274" w:lineRule="auto"/>
-        <w:ind w:left="432" w:hanging="288"/>
-      </w:pPr>
-      <w:r>
-        <w:rPr>
-          <w:rFonts w:ascii="Microsoft YaHei" w:hAnsi="Microsoft YaHei" w:eastAsia="Microsoft YaHei"/>
-          <w:b w:val="0"/>
-          <w:color w:val="1F1F1F"/>
-          <w:sz w:val="21"/>
-        </w:rPr>
-        <w:t>4. 在候选行内按所有准标识符组合计算等价类，低于 k 的记录不得发布。</w:t>
-      </w:r>
-    </w:p>
-    <w:p>
-      <w:pPr>
-        <w:spacing w:after="60" w:line="274" w:lineRule="auto"/>
-        <w:ind w:left="432" w:hanging="288"/>
-      </w:pPr>
-      <w:r>
-        <w:rPr>
-          <w:rFonts w:ascii="Microsoft YaHei" w:hAnsi="Microsoft YaHei" w:eastAsia="Microsoft YaHei"/>
-          <w:b w:val="0"/>
-          <w:color w:val="1F1F1F"/>
-          <w:sz w:val="21"/>
-        </w:rPr>
-        <w:t>5. 在通过 k 匿名的固定候选集内检查指定敏感属性，不同非空值低于 l 的记录不得发布。</w:t>
-      </w:r>
-    </w:p>
-    <w:p>
-      <w:pPr>
-        <w:spacing w:after="60" w:line="274" w:lineRule="auto"/>
-        <w:ind w:left="432" w:hanging="288"/>
-      </w:pPr>
-      <w:r>
-        <w:rPr>
-          <w:rFonts w:ascii="Microsoft YaHei" w:hAnsi="Microsoft YaHei" w:eastAsia="Microsoft YaHei"/>
-          <w:b w:val="0"/>
-          <w:color w:val="1F1F1F"/>
-          <w:sz w:val="21"/>
-        </w:rPr>
-        <w:t>6. 对获准行执行 Keep、ReplaceUtf8 或 Drop，并默认删除未声明字段。</w:t>
-      </w:r>
-    </w:p>
-    <w:p>
-      <w:pPr>
-        <w:spacing w:after="60" w:line="274" w:lineRule="auto"/>
-        <w:ind w:left="432" w:hanging="288"/>
-      </w:pPr>
-      <w:r>
-        <w:rPr>
-          <w:rFonts w:ascii="Microsoft YaHei" w:hAnsi="Microsoft YaHei" w:eastAsia="Microsoft YaHei"/>
-          <w:b w:val="0"/>
-          <w:color w:val="1F1F1F"/>
-          <w:sz w:val="21"/>
-        </w:rPr>
-        <w:t>7. 输出获准、隔离、隐私发现和单行发布清单，供下游与审计共同使用。</w:t>
-      </w:r>
-    </w:p>
-    <w:p>
-      <w:pPr>
-        <w:spacing w:after="80" w:line="288" w:lineRule="auto"/>
-        <w:ind w:firstLine="420"/>
-      </w:pPr>
-      <w:r>
-        <w:rPr>
-          <w:rFonts w:ascii="Microsoft YaHei" w:hAnsi="Microsoft YaHei" w:eastAsia="Microsoft YaHei"/>
-          <w:b w:val="0"/>
-          <w:color w:val="1F1F1F"/>
-          <w:sz w:val="21"/>
-        </w:rPr>
-        <w:t>策略采用 fail-closed 设计：直接标识符或敏感字段不能以 Keep 发布；准标识符必须保留并参与 k 匿名；l-diversity 列必须是 Sensitive UTF-8；缺失关键列、字段类型错误或请求与策略不匹配均阻断发布。发现明细可以截断，但拒绝计数保持准确。</w:t>
+        <w:t>运行后有 4 行进入可交付数据。1 行因没有同意本次研究被隔离，另 1 行因所在匿名组只有1 人被隔离。用户编号、同意字段和案件结果不进入交付文件，邮箱被替换为 [EMAIL]。交付回执记录请求编号、用途、接收方、处理行数、发布列和匿名阈值。这个结果可以直接通过Arrow IPC 交给下游系统。</w:t>
       </w:r>
     </w:p>
     <w:p>
       <w:pPr>
         <w:pStyle w:val="Heading1"/>
-        <w:keepNext/>
-        <w:spacing w:before="180" w:after="80"/>
       </w:pPr>
       <w:r>
-        <w:rPr>
-          <w:rFonts w:ascii="Microsoft YaHei" w:hAnsi="Microsoft YaHei" w:eastAsia="Microsoft YaHei"/>
-          <w:b/>
-          <w:color w:val="000000"/>
-          <w:sz w:val="28"/>
-        </w:rPr>
-        <w:t>五 可运行演示</w:t>
+        <w:t>实际使用方式与适用范围</w:t>
       </w:r>
     </w:p>
     <w:p>
-      <w:pPr>
-        <w:spacing w:after="80" w:line="288" w:lineRule="auto"/>
-        <w:ind w:firstLine="420"/>
-      </w:pPr>
       <w:r>
-        <w:rPr>
-          <w:rFonts w:ascii="Microsoft YaHei" w:hAnsi="Microsoft YaHei" w:eastAsia="Microsoft YaHei"/>
-          <w:b w:val="0"/>
-          <w:color w:val="1F1F1F"/>
-          <w:sz w:val="21"/>
-        </w:rPr>
-        <w:t>仓库演示申请把客户风控样本交给合作方，用途为 fraud_research。六行输入中四行满足同意、k=2 与 l=2，两个不满足的记录被隔离，邮件字段替换为 [EMAIL]，敏感结果列和未申报字段不会进入获准批次。</w:t>
+        <w:t>MoonSentinel 放在已有数据导出任务的最后一步。上游继续负责从数据库、业务系统或文件中读取数据并完成格式、质量检查；本项目只负责按本次请求核验授权与隐私条件，决定哪些行和列可以交付。相同源数据用于内部分析时可以获准，改为外部服务商、研究协作方或公开用途时则按对应策略重新判断。</w:t>
       </w:r>
     </w:p>
     <w:p>
-      <w:pPr>
-        <w:keepLines/>
-        <w:spacing w:before="60" w:after="120" w:line="259" w:lineRule="auto"/>
-        <w:ind w:left="403"/>
-        <w:shd w:fill="F2F4F7"/>
-      </w:pPr>
       <w:r>
-        <w:rPr>
-          <w:rFonts w:ascii="Consolas" w:hAnsi="Consolas" w:eastAsia="Consolas"/>
-          <w:b w:val="0"/>
-          <w:color w:val="202124"/>
-          <w:sz w:val="17"/>
-        </w:rPr>
-        <w:t>fraud-research-v1/req-2026-001: partial; purpose=fraud_research;</w:t>
-        <w:br/>
-      </w:r>
-      <w:r>
-        <w:rPr>
-          <w:rFonts w:ascii="Consolas" w:hAnsi="Consolas" w:eastAsia="Consolas"/>
-          <w:b w:val="0"/>
-          <w:color w:val="202124"/>
-          <w:sz w:val="17"/>
-        </w:rPr>
-        <w:t>recipient=partner; rows=6; released=4; quarantined=2; denials=2;</w:t>
-        <w:br/>
-      </w:r>
-      <w:r>
-        <w:rPr>
-          <w:rFonts w:ascii="Consolas" w:hAnsi="Consolas" w:eastAsia="Consolas"/>
-          <w:b w:val="0"/>
-          <w:color w:val="202124"/>
-          <w:sz w:val="17"/>
-        </w:rPr>
-        <w:t>k=2; l=2; diversity=case_outcome; findings_shown=2; truncated=false</w:t>
-        <w:br/>
-      </w:r>
-      <w:r>
-        <w:rPr>
-          <w:rFonts w:ascii="Consolas" w:hAnsi="Consolas" w:eastAsia="Consolas"/>
-          <w:b w:val="0"/>
-          <w:color w:val="202124"/>
-          <w:sz w:val="17"/>
-        </w:rPr>
-        <w:t>released columns: email, country, age_band, risk_score</w:t>
-        <w:br/>
-      </w:r>
-      <w:r>
-        <w:rPr>
-          <w:rFonts w:ascii="Consolas" w:hAnsi="Consolas" w:eastAsia="Consolas"/>
-          <w:b w:val="0"/>
-          <w:color w:val="202124"/>
-          <w:sz w:val="17"/>
-        </w:rPr>
-        <w:t>approved rows: 4    quarantined rows: 2    privacy findings: 2</w:t>
-        <w:br/>
-      </w:r>
-      <w:r>
-        <w:rPr>
-          <w:rFonts w:ascii="Consolas" w:hAnsi="Consolas" w:eastAsia="Consolas"/>
-          <w:b w:val="0"/>
-          <w:color w:val="202124"/>
-          <w:sz w:val="17"/>
-        </w:rPr>
-        <w:t>release manifest rows: 1    masked email: [EMAIL]</w:t>
-        <w:br/>
-      </w:r>
-      <w:r>
-        <w:rPr>
-          <w:rFonts w:ascii="Consolas" w:hAnsi="Consolas" w:eastAsia="Consolas"/>
-          <w:b w:val="0"/>
-          <w:color w:val="202124"/>
-          <w:sz w:val="17"/>
-        </w:rPr>
-        <w:t>Arrow IPC handoff: 1136 bytes, 4 released rows</w:t>
-      </w:r>
-    </w:p>
-    <w:p>
-      <w:pPr>
-        <w:keepLines/>
-        <w:spacing w:before="60" w:after="120" w:line="259" w:lineRule="auto"/>
-        <w:ind w:left="403"/>
-        <w:shd w:fill="F2F4F7"/>
-      </w:pPr>
-      <w:r>
-        <w:rPr>
-          <w:rFonts w:ascii="Consolas" w:hAnsi="Consolas" w:eastAsia="Consolas"/>
-          <w:b w:val="0"/>
-          <w:color w:val="202124"/>
-          <w:sz w:val="17"/>
-        </w:rPr>
-        <w:t>moon fmt --check &amp;&amp; moon check --target all --deny-warn</w:t>
-        <w:br/>
-      </w:r>
-      <w:r>
-        <w:rPr>
-          <w:rFonts w:ascii="Consolas" w:hAnsi="Consolas" w:eastAsia="Consolas"/>
-          <w:b w:val="0"/>
-          <w:color w:val="202124"/>
-          <w:sz w:val="17"/>
-        </w:rPr>
-        <w:t>moon test --target all --deny-warn &amp;&amp; moon run cmd/main --target native --deny-warn</w:t>
+        <w:t>当前版本提供 MoonBit 库和可运行示例。JSONL 与 CSV 输入经适配后使用与 Arrow 输入相同的发布策略；获准的 Arrow 结果也可序列化回 JSONL 或 CSV，方便接入常见的文本数据交换流程。CSV 列统一按文本处理，未加引号的空单元格转为 null，"" 保留为空字符串。策略构造、交付决定和四类 Arrow 输出目前在 Native、JavaScript、Wasm、Wasm-GC 上使用同一套实现。</w:t>
       </w:r>
     </w:p>
     <w:p>
       <w:pPr>
         <w:pStyle w:val="Heading1"/>
-        <w:keepNext/>
-        <w:spacing w:before="180" w:after="80"/>
       </w:pPr>
       <w:r>
-        <w:rPr>
-          <w:rFonts w:ascii="Microsoft YaHei" w:hAnsi="Microsoft YaHei" w:eastAsia="Microsoft YaHei"/>
-          <w:b/>
-          <w:color w:val="000000"/>
-          <w:sz w:val="28"/>
-        </w:rPr>
-        <w:t>六 与 MoonVerity 的差异</w:t>
-      </w:r>
-    </w:p>
-    <w:tbl>
-      <w:tblPr>
-        <w:tblW w:type="auto" w:w="0"/>
-        <w:jc w:val="center"/>
-        <w:tblLayout w:type="fixed"/>
-        <w:tblLook w:firstColumn="1" w:firstRow="1" w:lastColumn="0" w:lastRow="0" w:noHBand="0" w:noVBand="1" w:val="04A0"/>
-        <w:tblBorders>
-          <w:top w:val="single" w:sz="6" w:space="0" w:color="D9D9D9"/>
-          <w:left w:val="single" w:sz="6" w:space="0" w:color="D9D9D9"/>
-          <w:bottom w:val="single" w:sz="6" w:space="0" w:color="D9D9D9"/>
-          <w:right w:val="single" w:sz="6" w:space="0" w:color="D9D9D9"/>
-          <w:insideH w:val="single" w:sz="6" w:space="0" w:color="D9D9D9"/>
-          <w:insideV w:val="single" w:sz="6" w:space="0" w:color="D9D9D9"/>
-        </w:tblBorders>
-      </w:tblPr>
-      <w:tblGrid>
-        <w:gridCol w:w="3278"/>
-        <w:gridCol w:w="3278"/>
-        <w:gridCol w:w="3278"/>
-      </w:tblGrid>
-      <w:tr>
-        <w:trPr>
-          <w:tblHeader w:val="true"/>
-          <w:cantSplit w:val="true"/>
-        </w:trPr>
-        <w:tc>
-          <w:tcPr>
-            <w:tcW w:type="dxa" w:w="1728"/>
-            <w:shd w:fill="17365D"/>
-            <w:vAlign w:val="center"/>
-            <w:tcMar>
-              <w:top w:w="65" w:type="dxa"/>
-              <w:start w:w="105" w:type="dxa"/>
-              <w:bottom w:w="65" w:type="dxa"/>
-              <w:end w:w="105" w:type="dxa"/>
-            </w:tcMar>
-          </w:tcPr>
-          <w:p>
-            <w:pPr>
-              <w:spacing w:before="0" w:after="0" w:line="254" w:lineRule="auto"/>
-              <w:jc w:val="center"/>
-            </w:pPr>
-            <w:r>
-              <w:rPr>
-                <w:rFonts w:ascii="Microsoft YaHei" w:hAnsi="Microsoft YaHei" w:eastAsia="Microsoft YaHei"/>
-                <w:b/>
-                <w:color w:val="FFFFFF"/>
-                <w:sz w:val="18"/>
-              </w:rPr>
-              <w:t>维度</w:t>
-            </w:r>
-          </w:p>
-        </w:tc>
-        <w:tc>
-          <w:tcPr>
-            <w:tcW w:type="dxa" w:w="4104"/>
-            <w:shd w:fill="17365D"/>
-            <w:vAlign w:val="center"/>
-            <w:tcMar>
-              <w:top w:w="65" w:type="dxa"/>
-              <w:start w:w="105" w:type="dxa"/>
-              <w:bottom w:w="65" w:type="dxa"/>
-              <w:end w:w="105" w:type="dxa"/>
-            </w:tcMar>
-          </w:tcPr>
-          <w:p>
-            <w:pPr>
-              <w:spacing w:before="0" w:after="0" w:line="254" w:lineRule="auto"/>
-              <w:jc w:val="center"/>
-            </w:pPr>
-            <w:r>
-              <w:rPr>
-                <w:rFonts w:ascii="Microsoft YaHei" w:hAnsi="Microsoft YaHei" w:eastAsia="Microsoft YaHei"/>
-                <w:b/>
-                <w:color w:val="FFFFFF"/>
-                <w:sz w:val="18"/>
-              </w:rPr>
-              <w:t>MoonVerity</w:t>
-            </w:r>
-          </w:p>
-        </w:tc>
-        <w:tc>
-          <w:tcPr>
-            <w:tcW w:type="dxa" w:w="4104"/>
-            <w:shd w:fill="17365D"/>
-            <w:vAlign w:val="center"/>
-            <w:tcMar>
-              <w:top w:w="65" w:type="dxa"/>
-              <w:start w:w="105" w:type="dxa"/>
-              <w:bottom w:w="65" w:type="dxa"/>
-              <w:end w:w="105" w:type="dxa"/>
-            </w:tcMar>
-          </w:tcPr>
-          <w:p>
-            <w:pPr>
-              <w:spacing w:before="0" w:after="0" w:line="254" w:lineRule="auto"/>
-              <w:jc w:val="center"/>
-            </w:pPr>
-            <w:r>
-              <w:rPr>
-                <w:rFonts w:ascii="Microsoft YaHei" w:hAnsi="Microsoft YaHei" w:eastAsia="Microsoft YaHei"/>
-                <w:b/>
-                <w:color w:val="FFFFFF"/>
-                <w:sz w:val="18"/>
-              </w:rPr>
-              <w:t>MoonSentinel</w:t>
-            </w:r>
-          </w:p>
-        </w:tc>
-      </w:tr>
-      <w:tr>
-        <w:trPr>
-          <w:cantSplit w:val="true"/>
-        </w:trPr>
-        <w:tc>
-          <w:tcPr>
-            <w:tcW w:type="dxa" w:w="1728"/>
-            <w:vAlign w:val="center"/>
-            <w:tcMar>
-              <w:top w:w="65" w:type="dxa"/>
-              <w:start w:w="105" w:type="dxa"/>
-              <w:bottom w:w="65" w:type="dxa"/>
-              <w:end w:w="105" w:type="dxa"/>
-            </w:tcMar>
-          </w:tcPr>
-          <w:p>
-            <w:pPr>
-              <w:spacing w:before="0" w:after="0" w:line="254" w:lineRule="auto"/>
-              <w:jc w:val="left"/>
-            </w:pPr>
-            <w:r>
-              <w:rPr>
-                <w:rFonts w:ascii="Microsoft YaHei" w:hAnsi="Microsoft YaHei" w:eastAsia="Microsoft YaHei"/>
-                <w:b w:val="0"/>
-                <w:color w:val="1F1F1F"/>
-                <w:sz w:val="18"/>
-              </w:rPr>
-              <w:t>核心问题</w:t>
-            </w:r>
-          </w:p>
-        </w:tc>
-        <w:tc>
-          <w:tcPr>
-            <w:tcW w:type="dxa" w:w="4104"/>
-            <w:vAlign w:val="center"/>
-            <w:tcMar>
-              <w:top w:w="65" w:type="dxa"/>
-              <w:start w:w="105" w:type="dxa"/>
-              <w:bottom w:w="65" w:type="dxa"/>
-              <w:end w:w="105" w:type="dxa"/>
-            </w:tcMar>
-          </w:tcPr>
-          <w:p>
-            <w:pPr>
-              <w:spacing w:before="0" w:after="0" w:line="254" w:lineRule="auto"/>
-              <w:jc w:val="left"/>
-            </w:pPr>
-            <w:r>
-              <w:rPr>
-                <w:rFonts w:ascii="Microsoft YaHei" w:hAnsi="Microsoft YaHei" w:eastAsia="Microsoft YaHei"/>
-                <w:b w:val="0"/>
-                <w:color w:val="1F1F1F"/>
-                <w:sz w:val="18"/>
-              </w:rPr>
-              <w:t>数据是否满足合同和质量规则</w:t>
-            </w:r>
-          </w:p>
-        </w:tc>
-        <w:tc>
-          <w:tcPr>
-            <w:tcW w:type="dxa" w:w="4104"/>
-            <w:vAlign w:val="center"/>
-            <w:tcMar>
-              <w:top w:w="65" w:type="dxa"/>
-              <w:start w:w="105" w:type="dxa"/>
-              <w:bottom w:w="65" w:type="dxa"/>
-              <w:end w:w="105" w:type="dxa"/>
-            </w:tcMar>
-          </w:tcPr>
-          <w:p>
-            <w:pPr>
-              <w:spacing w:before="0" w:after="0" w:line="254" w:lineRule="auto"/>
-              <w:jc w:val="left"/>
-            </w:pPr>
-            <w:r>
-              <w:rPr>
-                <w:rFonts w:ascii="Microsoft YaHei" w:hAnsi="Microsoft YaHei" w:eastAsia="Microsoft YaHei"/>
-                <w:b w:val="0"/>
-                <w:color w:val="1F1F1F"/>
-                <w:sz w:val="18"/>
-              </w:rPr>
-              <w:t>数据能否因指定用途交给指定接收方</w:t>
-            </w:r>
-          </w:p>
-        </w:tc>
-      </w:tr>
-      <w:tr>
-        <w:trPr>
-          <w:cantSplit w:val="true"/>
-        </w:trPr>
-        <w:tc>
-          <w:tcPr>
-            <w:tcW w:type="dxa" w:w="1728"/>
-            <w:shd w:fill="F4F7FA"/>
-            <w:vAlign w:val="center"/>
-            <w:tcMar>
-              <w:top w:w="65" w:type="dxa"/>
-              <w:start w:w="105" w:type="dxa"/>
-              <w:bottom w:w="65" w:type="dxa"/>
-              <w:end w:w="105" w:type="dxa"/>
-            </w:tcMar>
-          </w:tcPr>
-          <w:p>
-            <w:pPr>
-              <w:spacing w:before="0" w:after="0" w:line="254" w:lineRule="auto"/>
-              <w:jc w:val="left"/>
-            </w:pPr>
-            <w:r>
-              <w:rPr>
-                <w:rFonts w:ascii="Microsoft YaHei" w:hAnsi="Microsoft YaHei" w:eastAsia="Microsoft YaHei"/>
-                <w:b w:val="0"/>
-                <w:color w:val="1F1F1F"/>
-                <w:sz w:val="18"/>
-              </w:rPr>
-              <w:t>输入</w:t>
-            </w:r>
-          </w:p>
-        </w:tc>
-        <w:tc>
-          <w:tcPr>
-            <w:tcW w:type="dxa" w:w="4104"/>
-            <w:shd w:fill="F4F7FA"/>
-            <w:vAlign w:val="center"/>
-            <w:tcMar>
-              <w:top w:w="65" w:type="dxa"/>
-              <w:start w:w="105" w:type="dxa"/>
-              <w:bottom w:w="65" w:type="dxa"/>
-              <w:end w:w="105" w:type="dxa"/>
-            </w:tcMar>
-          </w:tcPr>
-          <w:p>
-            <w:pPr>
-              <w:spacing w:before="0" w:after="0" w:line="254" w:lineRule="auto"/>
-              <w:jc w:val="left"/>
-            </w:pPr>
-            <w:r>
-              <w:rPr>
-                <w:rFonts w:ascii="Microsoft YaHei" w:hAnsi="Microsoft YaHei" w:eastAsia="Microsoft YaHei"/>
-                <w:b w:val="0"/>
-                <w:color w:val="1F1F1F"/>
-                <w:sz w:val="18"/>
-              </w:rPr>
-              <w:t>CSV/JSONL 与数据合同</w:t>
-            </w:r>
-          </w:p>
-        </w:tc>
-        <w:tc>
-          <w:tcPr>
-            <w:tcW w:type="dxa" w:w="4104"/>
-            <w:shd w:fill="F4F7FA"/>
-            <w:vAlign w:val="center"/>
-            <w:tcMar>
-              <w:top w:w="65" w:type="dxa"/>
-              <w:start w:w="105" w:type="dxa"/>
-              <w:bottom w:w="65" w:type="dxa"/>
-              <w:end w:w="105" w:type="dxa"/>
-            </w:tcMar>
-          </w:tcPr>
-          <w:p>
-            <w:pPr>
-              <w:spacing w:before="0" w:after="0" w:line="254" w:lineRule="auto"/>
-              <w:jc w:val="left"/>
-            </w:pPr>
-            <w:r>
-              <w:rPr>
-                <w:rFonts w:ascii="Microsoft YaHei" w:hAnsi="Microsoft YaHei" w:eastAsia="Microsoft YaHei"/>
-                <w:b w:val="0"/>
-                <w:color w:val="1F1F1F"/>
-                <w:sz w:val="18"/>
-              </w:rPr>
-              <w:t>Arrow RecordBatch、隐私策略与发布请求</w:t>
-            </w:r>
-          </w:p>
-        </w:tc>
-      </w:tr>
-      <w:tr>
-        <w:trPr>
-          <w:cantSplit w:val="true"/>
-        </w:trPr>
-        <w:tc>
-          <w:tcPr>
-            <w:tcW w:type="dxa" w:w="1728"/>
-            <w:vAlign w:val="center"/>
-            <w:tcMar>
-              <w:top w:w="65" w:type="dxa"/>
-              <w:start w:w="105" w:type="dxa"/>
-              <w:bottom w:w="65" w:type="dxa"/>
-              <w:end w:w="105" w:type="dxa"/>
-            </w:tcMar>
-          </w:tcPr>
-          <w:p>
-            <w:pPr>
-              <w:spacing w:before="0" w:after="0" w:line="254" w:lineRule="auto"/>
-              <w:jc w:val="left"/>
-            </w:pPr>
-            <w:r>
-              <w:rPr>
-                <w:rFonts w:ascii="Microsoft YaHei" w:hAnsi="Microsoft YaHei" w:eastAsia="Microsoft YaHei"/>
-                <w:b w:val="0"/>
-                <w:color w:val="1F1F1F"/>
-                <w:sz w:val="18"/>
-              </w:rPr>
-              <w:t>主要能力</w:t>
-            </w:r>
-          </w:p>
-        </w:tc>
-        <w:tc>
-          <w:tcPr>
-            <w:tcW w:type="dxa" w:w="4104"/>
-            <w:vAlign w:val="center"/>
-            <w:tcMar>
-              <w:top w:w="65" w:type="dxa"/>
-              <w:start w:w="105" w:type="dxa"/>
-              <w:bottom w:w="65" w:type="dxa"/>
-              <w:end w:w="105" w:type="dxa"/>
-            </w:tcMar>
-          </w:tcPr>
-          <w:p>
-            <w:pPr>
-              <w:spacing w:before="0" w:after="0" w:line="254" w:lineRule="auto"/>
-              <w:jc w:val="left"/>
-            </w:pPr>
-            <w:r>
-              <w:rPr>
-                <w:rFonts w:ascii="Microsoft YaHei" w:hAnsi="Microsoft YaHei" w:eastAsia="Microsoft YaHei"/>
-                <w:b w:val="0"/>
-                <w:color w:val="1F1F1F"/>
-                <w:sz w:val="18"/>
-              </w:rPr>
-              <w:t>Required、类型、范围、枚举、唯一、画像、质量评分、合同差异</w:t>
-            </w:r>
-          </w:p>
-        </w:tc>
-        <w:tc>
-          <w:tcPr>
-            <w:tcW w:type="dxa" w:w="4104"/>
-            <w:vAlign w:val="center"/>
-            <w:tcMar>
-              <w:top w:w="65" w:type="dxa"/>
-              <w:start w:w="105" w:type="dxa"/>
-              <w:bottom w:w="65" w:type="dxa"/>
-              <w:end w:w="105" w:type="dxa"/>
-            </w:tcMar>
-          </w:tcPr>
-          <w:p>
-            <w:pPr>
-              <w:spacing w:before="0" w:after="0" w:line="254" w:lineRule="auto"/>
-              <w:jc w:val="left"/>
-            </w:pPr>
-            <w:r>
-              <w:rPr>
-                <w:rFonts w:ascii="Microsoft YaHei" w:hAnsi="Microsoft YaHei" w:eastAsia="Microsoft YaHei"/>
-                <w:b w:val="0"/>
-                <w:color w:val="1F1F1F"/>
-                <w:sz w:val="18"/>
-              </w:rPr>
-              <w:t>用途/接收方授权、逐行同意、k 匿名、l-diversity、字段最小化</w:t>
-            </w:r>
-          </w:p>
-        </w:tc>
-      </w:tr>
-      <w:tr>
-        <w:trPr>
-          <w:cantSplit w:val="true"/>
-        </w:trPr>
-        <w:tc>
-          <w:tcPr>
-            <w:tcW w:type="dxa" w:w="1728"/>
-            <w:shd w:fill="F4F7FA"/>
-            <w:vAlign w:val="center"/>
-            <w:tcMar>
-              <w:top w:w="65" w:type="dxa"/>
-              <w:start w:w="105" w:type="dxa"/>
-              <w:bottom w:w="65" w:type="dxa"/>
-              <w:end w:w="105" w:type="dxa"/>
-            </w:tcMar>
-          </w:tcPr>
-          <w:p>
-            <w:pPr>
-              <w:spacing w:before="0" w:after="0" w:line="254" w:lineRule="auto"/>
-              <w:jc w:val="left"/>
-            </w:pPr>
-            <w:r>
-              <w:rPr>
-                <w:rFonts w:ascii="Microsoft YaHei" w:hAnsi="Microsoft YaHei" w:eastAsia="Microsoft YaHei"/>
-                <w:b w:val="0"/>
-                <w:color w:val="1F1F1F"/>
-                <w:sz w:val="18"/>
-              </w:rPr>
-              <w:t>处置结果</w:t>
-            </w:r>
-          </w:p>
-        </w:tc>
-        <w:tc>
-          <w:tcPr>
-            <w:tcW w:type="dxa" w:w="4104"/>
-            <w:shd w:fill="F4F7FA"/>
-            <w:vAlign w:val="center"/>
-            <w:tcMar>
-              <w:top w:w="65" w:type="dxa"/>
-              <w:start w:w="105" w:type="dxa"/>
-              <w:bottom w:w="65" w:type="dxa"/>
-              <w:end w:w="105" w:type="dxa"/>
-            </w:tcMar>
-          </w:tcPr>
-          <w:p>
-            <w:pPr>
-              <w:spacing w:before="0" w:after="0" w:line="254" w:lineRule="auto"/>
-              <w:jc w:val="left"/>
-            </w:pPr>
-            <w:r>
-              <w:rPr>
-                <w:rFonts w:ascii="Microsoft YaHei" w:hAnsi="Microsoft YaHei" w:eastAsia="Microsoft YaHei"/>
-                <w:b w:val="0"/>
-                <w:color w:val="1F1F1F"/>
-                <w:sz w:val="18"/>
-              </w:rPr>
-              <w:t>文本或 JSON 质量报告</w:t>
-            </w:r>
-          </w:p>
-        </w:tc>
-        <w:tc>
-          <w:tcPr>
-            <w:tcW w:type="dxa" w:w="4104"/>
-            <w:shd w:fill="F4F7FA"/>
-            <w:vAlign w:val="center"/>
-            <w:tcMar>
-              <w:top w:w="65" w:type="dxa"/>
-              <w:start w:w="105" w:type="dxa"/>
-              <w:bottom w:w="65" w:type="dxa"/>
-              <w:end w:w="105" w:type="dxa"/>
-            </w:tcMar>
-          </w:tcPr>
-          <w:p>
-            <w:pPr>
-              <w:spacing w:before="0" w:after="0" w:line="254" w:lineRule="auto"/>
-              <w:jc w:val="left"/>
-            </w:pPr>
-            <w:r>
-              <w:rPr>
-                <w:rFonts w:ascii="Microsoft YaHei" w:hAnsi="Microsoft YaHei" w:eastAsia="Microsoft YaHei"/>
-                <w:b w:val="0"/>
-                <w:color w:val="1F1F1F"/>
-                <w:sz w:val="18"/>
-              </w:rPr>
-              <w:t>获准、隔离、隐私发现、发布清单四类 Arrow 批次</w:t>
-            </w:r>
-          </w:p>
-        </w:tc>
-      </w:tr>
-      <w:tr>
-        <w:trPr>
-          <w:cantSplit w:val="true"/>
-        </w:trPr>
-        <w:tc>
-          <w:tcPr>
-            <w:tcW w:type="dxa" w:w="1728"/>
-            <w:vAlign w:val="center"/>
-            <w:tcMar>
-              <w:top w:w="65" w:type="dxa"/>
-              <w:start w:w="105" w:type="dxa"/>
-              <w:bottom w:w="65" w:type="dxa"/>
-              <w:end w:w="105" w:type="dxa"/>
-            </w:tcMar>
-          </w:tcPr>
-          <w:p>
-            <w:pPr>
-              <w:spacing w:before="0" w:after="0" w:line="254" w:lineRule="auto"/>
-              <w:jc w:val="left"/>
-            </w:pPr>
-            <w:r>
-              <w:rPr>
-                <w:rFonts w:ascii="Microsoft YaHei" w:hAnsi="Microsoft YaHei" w:eastAsia="Microsoft YaHei"/>
-                <w:b w:val="0"/>
-                <w:color w:val="1F1F1F"/>
-                <w:sz w:val="18"/>
-              </w:rPr>
-              <w:t>决策粒度</w:t>
-            </w:r>
-          </w:p>
-        </w:tc>
-        <w:tc>
-          <w:tcPr>
-            <w:tcW w:type="dxa" w:w="4104"/>
-            <w:vAlign w:val="center"/>
-            <w:tcMar>
-              <w:top w:w="65" w:type="dxa"/>
-              <w:start w:w="105" w:type="dxa"/>
-              <w:bottom w:w="65" w:type="dxa"/>
-              <w:end w:w="105" w:type="dxa"/>
-            </w:tcMar>
-          </w:tcPr>
-          <w:p>
-            <w:pPr>
-              <w:spacing w:before="0" w:after="0" w:line="254" w:lineRule="auto"/>
-              <w:jc w:val="left"/>
-            </w:pPr>
-            <w:r>
-              <w:rPr>
-                <w:rFonts w:ascii="Microsoft YaHei" w:hAnsi="Microsoft YaHei" w:eastAsia="Microsoft YaHei"/>
-                <w:b w:val="0"/>
-                <w:color w:val="1F1F1F"/>
-                <w:sz w:val="18"/>
-              </w:rPr>
-              <w:t>字段与行的质量合格性</w:t>
-            </w:r>
-          </w:p>
-        </w:tc>
-        <w:tc>
-          <w:tcPr>
-            <w:tcW w:type="dxa" w:w="4104"/>
-            <w:vAlign w:val="center"/>
-            <w:tcMar>
-              <w:top w:w="65" w:type="dxa"/>
-              <w:start w:w="105" w:type="dxa"/>
-              <w:bottom w:w="65" w:type="dxa"/>
-              <w:end w:w="105" w:type="dxa"/>
-            </w:tcMar>
-          </w:tcPr>
-          <w:p>
-            <w:pPr>
-              <w:spacing w:before="0" w:after="0" w:line="254" w:lineRule="auto"/>
-              <w:jc w:val="left"/>
-            </w:pPr>
-            <w:r>
-              <w:rPr>
-                <w:rFonts w:ascii="Microsoft YaHei" w:hAnsi="Microsoft YaHei" w:eastAsia="Microsoft YaHei"/>
-                <w:b w:val="0"/>
-                <w:color w:val="1F1F1F"/>
-                <w:sz w:val="18"/>
-              </w:rPr>
-              <w:t>请求级授权与记录级隐私资格</w:t>
-            </w:r>
-          </w:p>
-        </w:tc>
-      </w:tr>
-      <w:tr>
-        <w:trPr>
-          <w:cantSplit w:val="true"/>
-        </w:trPr>
-        <w:tc>
-          <w:tcPr>
-            <w:tcW w:type="dxa" w:w="1728"/>
-            <w:shd w:fill="F4F7FA"/>
-            <w:vAlign w:val="center"/>
-            <w:tcMar>
-              <w:top w:w="65" w:type="dxa"/>
-              <w:start w:w="105" w:type="dxa"/>
-              <w:bottom w:w="65" w:type="dxa"/>
-              <w:end w:w="105" w:type="dxa"/>
-            </w:tcMar>
-          </w:tcPr>
-          <w:p>
-            <w:pPr>
-              <w:spacing w:before="0" w:after="0" w:line="254" w:lineRule="auto"/>
-              <w:jc w:val="left"/>
-            </w:pPr>
-            <w:r>
-              <w:rPr>
-                <w:rFonts w:ascii="Microsoft YaHei" w:hAnsi="Microsoft YaHei" w:eastAsia="Microsoft YaHei"/>
-                <w:b w:val="0"/>
-                <w:color w:val="1F1F1F"/>
-                <w:sz w:val="18"/>
-              </w:rPr>
-              <w:t>明确不做</w:t>
-            </w:r>
-          </w:p>
-        </w:tc>
-        <w:tc>
-          <w:tcPr>
-            <w:tcW w:type="dxa" w:w="4104"/>
-            <w:shd w:fill="F4F7FA"/>
-            <w:vAlign w:val="center"/>
-            <w:tcMar>
-              <w:top w:w="65" w:type="dxa"/>
-              <w:start w:w="105" w:type="dxa"/>
-              <w:bottom w:w="65" w:type="dxa"/>
-              <w:end w:w="105" w:type="dxa"/>
-            </w:tcMar>
-          </w:tcPr>
-          <w:p>
-            <w:pPr>
-              <w:spacing w:before="0" w:after="0" w:line="254" w:lineRule="auto"/>
-              <w:jc w:val="left"/>
-            </w:pPr>
-            <w:r>
-              <w:rPr>
-                <w:rFonts w:ascii="Microsoft YaHei" w:hAnsi="Microsoft YaHei" w:eastAsia="Microsoft YaHei"/>
-                <w:b w:val="0"/>
-                <w:color w:val="1F1F1F"/>
-                <w:sz w:val="18"/>
-              </w:rPr>
-              <w:t>—</w:t>
-            </w:r>
-          </w:p>
-        </w:tc>
-        <w:tc>
-          <w:tcPr>
-            <w:tcW w:type="dxa" w:w="4104"/>
-            <w:shd w:fill="F4F7FA"/>
-            <w:vAlign w:val="center"/>
-            <w:tcMar>
-              <w:top w:w="65" w:type="dxa"/>
-              <w:start w:w="105" w:type="dxa"/>
-              <w:bottom w:w="65" w:type="dxa"/>
-              <w:end w:w="105" w:type="dxa"/>
-            </w:tcMar>
-          </w:tcPr>
-          <w:p>
-            <w:pPr>
-              <w:spacing w:before="0" w:after="0" w:line="254" w:lineRule="auto"/>
-              <w:jc w:val="left"/>
-            </w:pPr>
-            <w:r>
-              <w:rPr>
-                <w:rFonts w:ascii="Microsoft YaHei" w:hAnsi="Microsoft YaHei" w:eastAsia="Microsoft YaHei"/>
-                <w:b w:val="0"/>
-                <w:color w:val="1F1F1F"/>
-                <w:sz w:val="18"/>
-              </w:rPr>
-              <w:t>通用质量合同、Profile、Contract Diff、CSV/JSONL CLI</w:t>
-            </w:r>
-          </w:p>
-        </w:tc>
-      </w:tr>
-    </w:tbl>
-    <w:p>
-      <w:pPr>
-        <w:spacing w:after="20"/>
-      </w:pPr>
-    </w:p>
-    <w:p>
-      <w:pPr>
-        <w:spacing w:after="80" w:line="288" w:lineRule="auto"/>
-        <w:ind w:firstLine="420"/>
-      </w:pPr>
-      <w:r>
-        <w:rPr>
-          <w:rFonts w:ascii="Microsoft YaHei" w:hAnsi="Microsoft YaHei" w:eastAsia="Microsoft YaHei"/>
-          <w:b w:val="0"/>
-          <w:color w:val="1F1F1F"/>
-          <w:sz w:val="21"/>
-        </w:rPr>
-        <w:t>本次核查逐项阅读了 Wchwch777/MoonVerity 的 README、申报书、架构文档以及 core/quality.mbt、core/validation.mbt、core/profile.mbt、core/diff.mbt 和 CLI。MoonSentinel 已删除与其重叠的通用质量规则模型，并用新的 PrivacyPolicy、ReleaseRequest、ConsentRequirement、DataClass、Treatment 和 ReleaseBundle 构成公开 API。</w:t>
+        <w:t>与现有项目的区别</w:t>
       </w:r>
     </w:p>
     <w:p>
-      <w:pPr>
-        <w:spacing w:after="80" w:line="288" w:lineRule="auto"/>
-        <w:ind w:firstLine="420"/>
-      </w:pPr>
       <w:r>
-        <w:rPr>
-          <w:rFonts w:ascii="Microsoft YaHei" w:hAnsi="Microsoft YaHei" w:eastAsia="Microsoft YaHei"/>
-          <w:b w:val="0"/>
-          <w:color w:val="1F1F1F"/>
-          <w:sz w:val="21"/>
-        </w:rPr>
-        <w:t>2026 年 9 月 21 日扩展检索 GitHub，并核查 MoonRedact、moonbit-fhir、moon-privacy-budget、MoonTrustFlow、MoonLogfmt Lens 与 PhotoPrivacy；未发现同时实现 Arrow 发布请求、逐行同意、k 匿名、l-diversity 和四类 Arrow 输出的 MoonBit 项目。</w:t>
+        <w:t>MoonSentinel 不做 CSV 或 JSONL 数据合同、非空检查、范围检查、画像、质量评分和合同差异。这些属于 MoonVerity 等数据质量工具的范围。MoonSentinel 也不是自由文本敏感词扫描器或差分隐私查询引擎。它处理的是一次具体的数据交付请求，核心依据是用途、接收方、逐行同意、匿名组和列级处置。</w:t>
+      </w:r>
+    </w:p>
+    <w:p>
+      <w:r>
+        <w:t>项目已针对 MoonVerity、MoonRedact、moonbit-fhir、moon-privacy-budget、MoonTrustFlow 等公开仓库做过功能对照。完整记录见差异化核查。</w:t>
       </w:r>
     </w:p>
     <w:p>
       <w:pPr>
         <w:pStyle w:val="Heading1"/>
-        <w:keepNext/>
-        <w:spacing w:before="180" w:after="80"/>
       </w:pPr>
       <w:r>
-        <w:rPr>
-          <w:rFonts w:ascii="Microsoft YaHei" w:hAnsi="Microsoft YaHei" w:eastAsia="Microsoft YaHei"/>
-          <w:b/>
-          <w:color w:val="000000"/>
-          <w:sz w:val="28"/>
-        </w:rPr>
-        <w:t>七 创新点和应用价值</w:t>
+        <w:t>已完成成果</w:t>
       </w:r>
     </w:p>
     <w:p>
       <w:pPr>
-        <w:spacing w:after="60" w:line="274" w:lineRule="auto"/>
-        <w:ind w:left="432" w:hanging="288"/>
+        <w:pStyle w:val="ListBullet"/>
       </w:pPr>
       <w:r>
-        <w:rPr>
-          <w:rFonts w:ascii="Microsoft YaHei" w:hAnsi="Microsoft YaHei" w:eastAsia="Microsoft YaHei"/>
-          <w:b w:val="0"/>
-          <w:color w:val="1F1F1F"/>
-          <w:sz w:val="21"/>
-        </w:rPr>
-        <w:t>1. 把用途和接收方作为运行时发布请求的一部分，而非只做静态 Schema 检查。</w:t>
+        <w:t>已实现用途和接收方授权、逐行同意、k-匿名、l-diversity、列白名单和敏感字段处置；</w:t>
       </w:r>
     </w:p>
     <w:p>
       <w:pPr>
-        <w:spacing w:after="60" w:line="274" w:lineRule="auto"/>
-        <w:ind w:left="432" w:hanging="288"/>
+        <w:pStyle w:val="ListBullet"/>
       </w:pPr>
       <w:r>
-        <w:rPr>
-          <w:rFonts w:ascii="Microsoft YaHei" w:hAnsi="Microsoft YaHei" w:eastAsia="Microsoft YaHei"/>
-          <w:b w:val="0"/>
-          <w:color w:val="1F1F1F"/>
-          <w:sz w:val="21"/>
-        </w:rPr>
-        <w:t>2. 同意资格先于 k 匿名计算，避免未授权记录虚增等价类并造成错误放行。</w:t>
+        <w:t>已实现 approved、quarantine、findings、manifest 四个 Arrow 输出；</w:t>
       </w:r>
     </w:p>
     <w:p>
       <w:pPr>
-        <w:spacing w:after="60" w:line="274" w:lineRule="auto"/>
-        <w:ind w:left="432" w:hanging="288"/>
+        <w:pStyle w:val="ListBullet"/>
       </w:pPr>
       <w:r>
-        <w:rPr>
-          <w:rFonts w:ascii="Microsoft YaHei" w:hAnsi="Microsoft YaHei" w:eastAsia="Microsoft YaHei"/>
-          <w:b w:val="0"/>
-          <w:color w:val="1F1F1F"/>
-          <w:sz w:val="21"/>
-        </w:rPr>
-        <w:t>3. l-diversity 在通过 k 匿名的固定候选集上运行，避免匿名组泄露过于单一的敏感属性。</w:t>
+        <w:t>已提供 CSV、JSONL 与 Arrow 转换函数；演示将两种文本输入送入同一隐私策略，再导出获准结果；</w:t>
       </w:r>
     </w:p>
     <w:p>
       <w:pPr>
-        <w:spacing w:after="60" w:line="274" w:lineRule="auto"/>
-        <w:ind w:left="432" w:hanging="288"/>
+        <w:pStyle w:val="ListBullet"/>
       </w:pPr>
       <w:r>
-        <w:rPr>
-          <w:rFonts w:ascii="Microsoft YaHei" w:hAnsi="Microsoft YaHei" w:eastAsia="Microsoft YaHei"/>
-          <w:b w:val="0"/>
-          <w:color w:val="1F1F1F"/>
-          <w:sz w:val="21"/>
-        </w:rPr>
-        <w:t>4. 数据分类和处理方式在策略校验阶段强绑定，敏感原值不能误配置为直接发布。</w:t>
+        <w:t>自动化测试覆盖正常交付、授权拒绝、策略失败关闭、匿名性检查、文本往返、Arrow IPC 往返和非法输入；</w:t>
+      </w:r>
+    </w:p>
+    <w:p>
+      <w:r>
+        <w:t>CSV 用例还覆盖带引号字段、逗号、转义双引号、UTF-8 文本、空值往返、发布过滤和格式错误输入。</w:t>
       </w:r>
     </w:p>
     <w:p>
       <w:pPr>
-        <w:spacing w:after="60" w:line="274" w:lineRule="auto"/>
-        <w:ind w:left="432" w:hanging="288"/>
+        <w:pStyle w:val="ListBullet"/>
       </w:pPr>
       <w:r>
-        <w:rPr>
-          <w:rFonts w:ascii="Microsoft YaHei" w:hAnsi="Microsoft YaHei" w:eastAsia="Microsoft YaHei"/>
-          <w:b w:val="0"/>
-          <w:color w:val="1F1F1F"/>
-          <w:sz w:val="21"/>
-        </w:rPr>
-        <w:t>5. 默认不发布未声明字段，以数据最小化代替事后依赖人工删列。</w:t>
+        <w:t>提供 moon fmt --check、moon check --target all --deny-warn 和 moon test --target all --deny-warn 验证命令。</w:t>
       </w:r>
     </w:p>
     <w:p>
-      <w:pPr>
-        <w:spacing w:after="60" w:line="274" w:lineRule="auto"/>
-        <w:ind w:left="432" w:hanging="288"/>
-      </w:pPr>
       <w:r>
-        <w:rPr>
-          <w:rFonts w:ascii="Microsoft YaHei" w:hAnsi="Microsoft YaHei" w:eastAsia="Microsoft YaHei"/>
-          <w:b w:val="0"/>
-          <w:color w:val="1F1F1F"/>
-          <w:sz w:val="21"/>
-        </w:rPr>
-        <w:t>6. 发布数据与审计证据均为 Arrow，便于 Wasm、浏览器和分析管道直接交接。</w:t>
+        <w:t>测试命令可针对 Native、JavaScript、Wasm 和 Wasm-GC 目标运行。</w:t>
       </w:r>
     </w:p>
     <w:p>
       <w:pPr>
         <w:pStyle w:val="Heading1"/>
-        <w:keepNext/>
-        <w:spacing w:before="180" w:after="80"/>
       </w:pPr>
       <w:r>
-        <w:rPr>
-          <w:rFonts w:ascii="Microsoft YaHei" w:hAnsi="Microsoft YaHei" w:eastAsia="Microsoft YaHei"/>
-          <w:b/>
-          <w:color w:val="000000"/>
-          <w:sz w:val="28"/>
-        </w:rPr>
-        <w:t>八 原创和依赖边界</w:t>
+        <w:t>当前边界与下一步</w:t>
       </w:r>
     </w:p>
     <w:p>
-      <w:pPr>
-        <w:spacing w:after="80" w:line="288" w:lineRule="auto"/>
-        <w:ind w:firstLine="420"/>
-      </w:pPr>
       <w:r>
-        <w:rPr>
-          <w:rFonts w:ascii="Microsoft YaHei" w:hAnsi="Microsoft YaHei" w:eastAsia="Microsoft YaHei"/>
-          <w:b w:val="0"/>
-          <w:color w:val="1F1F1F"/>
-          <w:sz w:val="21"/>
-        </w:rPr>
-        <w:t>本仓库原创实现隐私策略校验、请求授权、逐行同意、候选集内 k 匿名、敏感属性 l-diversity、数据最小化、字段处理、拒绝原因和发布清单。Arrow Schema、Column、RecordBatch 及 IPC 编解码来自公开依赖 shunge/arrow@0.1.0，不作为原创成果申报。</w:t>
+        <w:t>JSONL 当前仅支持一行一个扁平对象，嵌套对象和数组不支持；单列混合类型会拒绝，整数与小数混合时提升为浮点数；绝对值超过 9007199254740991 的 JSON 数值会拒绝，以避免解析精度造成静默改值。CSV 使用首行表头，所有列按 UTF-8 文本导入，未加引号的空单元格转为 null，引用的空字符串保留，不自动推断数值和布尔类型。跨批次匿名统计和更灵活的脱敏策略尚未实现。项目在单个批次内计算匿名组，敏感字段替换只支持 UTF-8 固定值。隔离结果保留原始行，必须存放在受控区域。项目提供技术检查和可追溯输出，不替代法务判断，也不宣称 k-匿名和 l-diversity 能消除所有重新识别风险。</w:t>
       </w:r>
     </w:p>
     <w:p>
-      <w:pPr>
-        <w:spacing w:after="80" w:line="288" w:lineRule="auto"/>
-        <w:ind w:firstLine="420"/>
-      </w:pPr>
       <w:r>
-        <w:rPr>
-          <w:rFonts w:ascii="Microsoft YaHei" w:hAnsi="Microsoft YaHei" w:eastAsia="Microsoft YaHei"/>
-          <w:b w:val="0"/>
-          <w:color w:val="1F1F1F"/>
-          <w:sz w:val="21"/>
-        </w:rPr>
-        <w:t>当前生产包只公开 PrivacyPolicy、ReleaseRequest、ConsentRequirement、DataClass、Treatment、PrivacyReport 和 ReleaseBundle 等隐私发布类型，不再公开 Contract、Rule、Severity、ValidationReport 或通用质量评分接口。</w:t>
-      </w:r>
-    </w:p>
-    <w:p>
-      <w:pPr>
-        <w:pStyle w:val="Heading1"/>
-        <w:keepNext/>
-        <w:spacing w:before="180" w:after="80"/>
-      </w:pPr>
-      <w:r>
-        <w:rPr>
-          <w:rFonts w:ascii="Microsoft YaHei" w:hAnsi="Microsoft YaHei" w:eastAsia="Microsoft YaHei"/>
-          <w:b/>
-          <w:color w:val="000000"/>
-          <w:sz w:val="28"/>
-        </w:rPr>
-        <w:t>九 当前限制和路线</w:t>
-      </w:r>
-    </w:p>
-    <w:p>
-      <w:pPr>
-        <w:pStyle w:val="ListBullet"/>
-        <w:spacing w:after="40" w:line="278" w:lineRule="auto"/>
-        <w:ind w:left="389" w:hanging="216"/>
-      </w:pPr>
-      <w:r>
-        <w:rPr>
-          <w:rFonts w:ascii="Microsoft YaHei" w:hAnsi="Microsoft YaHei" w:eastAsia="Microsoft YaHei"/>
-          <w:b w:val="0"/>
-          <w:color w:val="1F1F1F"/>
-          <w:sz w:val="21"/>
-        </w:rPr>
-        <w:t>当前 k 匿名和 l-diversity 作用于单个 RecordBatch；l-diversity 只支持 UTF-8 敏感属性，空值不计入不同值数量。</w:t>
-      </w:r>
-    </w:p>
-    <w:p>
-      <w:pPr>
-        <w:pStyle w:val="ListBullet"/>
-        <w:spacing w:after="40" w:line="278" w:lineRule="auto"/>
-        <w:ind w:left="389" w:hanging="216"/>
-      </w:pPr>
-      <w:r>
-        <w:rPr>
-          <w:rFonts w:ascii="Microsoft YaHei" w:hAnsi="Microsoft YaHei" w:eastAsia="Microsoft YaHei"/>
-          <w:b w:val="0"/>
-          <w:color w:val="1F1F1F"/>
-          <w:sz w:val="21"/>
-        </w:rPr>
-        <w:t>当前敏感字段处理为固定字符串替换或删除，尚未接入密钥化假名服务。</w:t>
-      </w:r>
-    </w:p>
-    <w:p>
-      <w:pPr>
-        <w:pStyle w:val="ListBullet"/>
-        <w:spacing w:after="40" w:line="278" w:lineRule="auto"/>
-        <w:ind w:left="389" w:hanging="216"/>
-      </w:pPr>
-      <w:r>
-        <w:rPr>
-          <w:rFonts w:ascii="Microsoft YaHei" w:hAnsi="Microsoft YaHei" w:eastAsia="Microsoft YaHei"/>
-          <w:b w:val="0"/>
-          <w:color w:val="1F1F1F"/>
-          <w:sz w:val="21"/>
-        </w:rPr>
-        <w:t>下一阶段计划增加 t-closeness、策略版本签名和可验证发布清单。</w:t>
-      </w:r>
-    </w:p>
-    <w:p>
-      <w:pPr>
-        <w:pStyle w:val="ListBullet"/>
-        <w:spacing w:after="40" w:line="278" w:lineRule="auto"/>
-        <w:ind w:left="389" w:hanging="216"/>
-      </w:pPr>
-      <w:r>
-        <w:rPr>
-          <w:rFonts w:ascii="Microsoft YaHei" w:hAnsi="Microsoft YaHei" w:eastAsia="Microsoft YaHei"/>
-          <w:b w:val="0"/>
-          <w:color w:val="1F1F1F"/>
-          <w:sz w:val="21"/>
-        </w:rPr>
-        <w:t>项目不是法律合规意见；实际部署仍需由数据责任人结合地区法规配置策略。</w:t>
-      </w:r>
-    </w:p>
-    <w:p>
-      <w:pPr>
-        <w:pStyle w:val="Heading1"/>
-        <w:keepNext/>
-        <w:spacing w:before="180" w:after="80"/>
-      </w:pPr>
-      <w:r>
-        <w:rPr>
-          <w:rFonts w:ascii="Microsoft YaHei" w:hAnsi="Microsoft YaHei" w:eastAsia="Microsoft YaHei"/>
-          <w:b/>
-          <w:color w:val="000000"/>
-          <w:sz w:val="28"/>
-        </w:rPr>
-        <w:t>十 验收标准</w:t>
-      </w:r>
-    </w:p>
-    <w:tbl>
-      <w:tblPr>
-        <w:tblW w:type="auto" w:w="0"/>
-        <w:jc w:val="center"/>
-        <w:tblLayout w:type="fixed"/>
-        <w:tblLook w:firstColumn="1" w:firstRow="1" w:lastColumn="0" w:lastRow="0" w:noHBand="0" w:noVBand="1" w:val="04A0"/>
-        <w:tblBorders>
-          <w:top w:val="single" w:sz="6" w:space="0" w:color="D9D9D9"/>
-          <w:left w:val="single" w:sz="6" w:space="0" w:color="D9D9D9"/>
-          <w:bottom w:val="single" w:sz="6" w:space="0" w:color="D9D9D9"/>
-          <w:right w:val="single" w:sz="6" w:space="0" w:color="D9D9D9"/>
-          <w:insideH w:val="single" w:sz="6" w:space="0" w:color="D9D9D9"/>
-          <w:insideV w:val="single" w:sz="6" w:space="0" w:color="D9D9D9"/>
-        </w:tblBorders>
-      </w:tblPr>
-      <w:tblGrid>
-        <w:gridCol w:w="3278"/>
-        <w:gridCol w:w="3278"/>
-        <w:gridCol w:w="3278"/>
-      </w:tblGrid>
-      <w:tr>
-        <w:trPr>
-          <w:tblHeader w:val="true"/>
-          <w:cantSplit w:val="true"/>
-        </w:trPr>
-        <w:tc>
-          <w:tcPr>
-            <w:tcW w:type="dxa" w:w="792"/>
-            <w:shd w:fill="17365D"/>
-            <w:vAlign w:val="center"/>
-            <w:tcMar>
-              <w:top w:w="65" w:type="dxa"/>
-              <w:start w:w="105" w:type="dxa"/>
-              <w:bottom w:w="65" w:type="dxa"/>
-              <w:end w:w="105" w:type="dxa"/>
-            </w:tcMar>
-          </w:tcPr>
-          <w:p>
-            <w:pPr>
-              <w:spacing w:before="0" w:after="0" w:line="254" w:lineRule="auto"/>
-              <w:jc w:val="center"/>
-            </w:pPr>
-            <w:r>
-              <w:rPr>
-                <w:rFonts w:ascii="Microsoft YaHei" w:hAnsi="Microsoft YaHei" w:eastAsia="Microsoft YaHei"/>
-                <w:b/>
-                <w:color w:val="FFFFFF"/>
-                <w:sz w:val="18"/>
-              </w:rPr>
-              <w:t>编号</w:t>
-            </w:r>
-          </w:p>
-        </w:tc>
-        <w:tc>
-          <w:tcPr>
-            <w:tcW w:type="dxa" w:w="2520"/>
-            <w:shd w:fill="17365D"/>
-            <w:vAlign w:val="center"/>
-            <w:tcMar>
-              <w:top w:w="65" w:type="dxa"/>
-              <w:start w:w="105" w:type="dxa"/>
-              <w:bottom w:w="65" w:type="dxa"/>
-              <w:end w:w="105" w:type="dxa"/>
-            </w:tcMar>
-          </w:tcPr>
-          <w:p>
-            <w:pPr>
-              <w:spacing w:before="0" w:after="0" w:line="254" w:lineRule="auto"/>
-              <w:jc w:val="center"/>
-            </w:pPr>
-            <w:r>
-              <w:rPr>
-                <w:rFonts w:ascii="Microsoft YaHei" w:hAnsi="Microsoft YaHei" w:eastAsia="Microsoft YaHei"/>
-                <w:b/>
-                <w:color w:val="FFFFFF"/>
-                <w:sz w:val="18"/>
-              </w:rPr>
-              <w:t>验收项</w:t>
-            </w:r>
-          </w:p>
-        </w:tc>
-        <w:tc>
-          <w:tcPr>
-            <w:tcW w:type="dxa" w:w="6696"/>
-            <w:shd w:fill="17365D"/>
-            <w:vAlign w:val="center"/>
-            <w:tcMar>
-              <w:top w:w="65" w:type="dxa"/>
-              <w:start w:w="105" w:type="dxa"/>
-              <w:bottom w:w="65" w:type="dxa"/>
-              <w:end w:w="105" w:type="dxa"/>
-            </w:tcMar>
-          </w:tcPr>
-          <w:p>
-            <w:pPr>
-              <w:spacing w:before="0" w:after="0" w:line="254" w:lineRule="auto"/>
-              <w:jc w:val="center"/>
-            </w:pPr>
-            <w:r>
-              <w:rPr>
-                <w:rFonts w:ascii="Microsoft YaHei" w:hAnsi="Microsoft YaHei" w:eastAsia="Microsoft YaHei"/>
-                <w:b/>
-                <w:color w:val="FFFFFF"/>
-                <w:sz w:val="18"/>
-              </w:rPr>
-              <w:t>通过条件</w:t>
-            </w:r>
-          </w:p>
-        </w:tc>
-      </w:tr>
-      <w:tr>
-        <w:trPr>
-          <w:cantSplit w:val="true"/>
-        </w:trPr>
-        <w:tc>
-          <w:tcPr>
-            <w:tcW w:type="dxa" w:w="792"/>
-            <w:vAlign w:val="center"/>
-            <w:tcMar>
-              <w:top w:w="65" w:type="dxa"/>
-              <w:start w:w="105" w:type="dxa"/>
-              <w:bottom w:w="65" w:type="dxa"/>
-              <w:end w:w="105" w:type="dxa"/>
-            </w:tcMar>
-          </w:tcPr>
-          <w:p>
-            <w:pPr>
-              <w:spacing w:before="0" w:after="0" w:line="254" w:lineRule="auto"/>
-              <w:jc w:val="center"/>
-            </w:pPr>
-            <w:r>
-              <w:rPr>
-                <w:rFonts w:ascii="Microsoft YaHei" w:hAnsi="Microsoft YaHei" w:eastAsia="Microsoft YaHei"/>
-                <w:b w:val="0"/>
-                <w:color w:val="1F1F1F"/>
-                <w:sz w:val="18"/>
-              </w:rPr>
-              <w:t>1</w:t>
-            </w:r>
-          </w:p>
-        </w:tc>
-        <w:tc>
-          <w:tcPr>
-            <w:tcW w:type="dxa" w:w="2520"/>
-            <w:vAlign w:val="center"/>
-            <w:tcMar>
-              <w:top w:w="65" w:type="dxa"/>
-              <w:start w:w="105" w:type="dxa"/>
-              <w:bottom w:w="65" w:type="dxa"/>
-              <w:end w:w="105" w:type="dxa"/>
-            </w:tcMar>
-          </w:tcPr>
-          <w:p>
-            <w:pPr>
-              <w:spacing w:before="0" w:after="0" w:line="254" w:lineRule="auto"/>
-              <w:jc w:val="left"/>
-            </w:pPr>
-            <w:r>
-              <w:rPr>
-                <w:rFonts w:ascii="Microsoft YaHei" w:hAnsi="Microsoft YaHei" w:eastAsia="Microsoft YaHei"/>
-                <w:b w:val="0"/>
-                <w:color w:val="1F1F1F"/>
-                <w:sz w:val="18"/>
-              </w:rPr>
-              <w:t>差异化接口</w:t>
-            </w:r>
-          </w:p>
-        </w:tc>
-        <w:tc>
-          <w:tcPr>
-            <w:tcW w:type="dxa" w:w="6696"/>
-            <w:vAlign w:val="center"/>
-            <w:tcMar>
-              <w:top w:w="65" w:type="dxa"/>
-              <w:start w:w="105" w:type="dxa"/>
-              <w:bottom w:w="65" w:type="dxa"/>
-              <w:end w:w="105" w:type="dxa"/>
-            </w:tcMar>
-          </w:tcPr>
-          <w:p>
-            <w:pPr>
-              <w:spacing w:before="0" w:after="0" w:line="254" w:lineRule="auto"/>
-              <w:jc w:val="left"/>
-            </w:pPr>
-            <w:r>
-              <w:rPr>
-                <w:rFonts w:ascii="Microsoft YaHei" w:hAnsi="Microsoft YaHei" w:eastAsia="Microsoft YaHei"/>
-                <w:b w:val="0"/>
-                <w:color w:val="1F1F1F"/>
-                <w:sz w:val="18"/>
-              </w:rPr>
-              <w:t>公开 API 不含通用质量合同、质量评分、画像或合同差异</w:t>
-            </w:r>
-          </w:p>
-        </w:tc>
-      </w:tr>
-      <w:tr>
-        <w:trPr>
-          <w:cantSplit w:val="true"/>
-        </w:trPr>
-        <w:tc>
-          <w:tcPr>
-            <w:tcW w:type="dxa" w:w="792"/>
-            <w:shd w:fill="F4F7FA"/>
-            <w:vAlign w:val="center"/>
-            <w:tcMar>
-              <w:top w:w="65" w:type="dxa"/>
-              <w:start w:w="105" w:type="dxa"/>
-              <w:bottom w:w="65" w:type="dxa"/>
-              <w:end w:w="105" w:type="dxa"/>
-            </w:tcMar>
-          </w:tcPr>
-          <w:p>
-            <w:pPr>
-              <w:spacing w:before="0" w:after="0" w:line="254" w:lineRule="auto"/>
-              <w:jc w:val="center"/>
-            </w:pPr>
-            <w:r>
-              <w:rPr>
-                <w:rFonts w:ascii="Microsoft YaHei" w:hAnsi="Microsoft YaHei" w:eastAsia="Microsoft YaHei"/>
-                <w:b w:val="0"/>
-                <w:color w:val="1F1F1F"/>
-                <w:sz w:val="18"/>
-              </w:rPr>
-              <w:t>2</w:t>
-            </w:r>
-          </w:p>
-        </w:tc>
-        <w:tc>
-          <w:tcPr>
-            <w:tcW w:type="dxa" w:w="2520"/>
-            <w:shd w:fill="F4F7FA"/>
-            <w:vAlign w:val="center"/>
-            <w:tcMar>
-              <w:top w:w="65" w:type="dxa"/>
-              <w:start w:w="105" w:type="dxa"/>
-              <w:bottom w:w="65" w:type="dxa"/>
-              <w:end w:w="105" w:type="dxa"/>
-            </w:tcMar>
-          </w:tcPr>
-          <w:p>
-            <w:pPr>
-              <w:spacing w:before="0" w:after="0" w:line="254" w:lineRule="auto"/>
-              <w:jc w:val="left"/>
-            </w:pPr>
-            <w:r>
-              <w:rPr>
-                <w:rFonts w:ascii="Microsoft YaHei" w:hAnsi="Microsoft YaHei" w:eastAsia="Microsoft YaHei"/>
-                <w:b w:val="0"/>
-                <w:color w:val="1F1F1F"/>
-                <w:sz w:val="18"/>
-              </w:rPr>
-              <w:t>完整授权链</w:t>
-            </w:r>
-          </w:p>
-        </w:tc>
-        <w:tc>
-          <w:tcPr>
-            <w:tcW w:type="dxa" w:w="6696"/>
-            <w:shd w:fill="F4F7FA"/>
-            <w:vAlign w:val="center"/>
-            <w:tcMar>
-              <w:top w:w="65" w:type="dxa"/>
-              <w:start w:w="105" w:type="dxa"/>
-              <w:bottom w:w="65" w:type="dxa"/>
-              <w:end w:w="105" w:type="dxa"/>
-            </w:tcMar>
-          </w:tcPr>
-          <w:p>
-            <w:pPr>
-              <w:spacing w:before="0" w:after="0" w:line="254" w:lineRule="auto"/>
-              <w:jc w:val="left"/>
-            </w:pPr>
-            <w:r>
-              <w:rPr>
-                <w:rFonts w:ascii="Microsoft YaHei" w:hAnsi="Microsoft YaHei" w:eastAsia="Microsoft YaHei"/>
-                <w:b w:val="0"/>
-                <w:color w:val="1F1F1F"/>
-                <w:sz w:val="18"/>
-              </w:rPr>
-              <w:t>用途、接收方、同意、k 匿名、l-diversity 和最小化均参与结果</w:t>
-            </w:r>
-          </w:p>
-        </w:tc>
-      </w:tr>
-      <w:tr>
-        <w:trPr>
-          <w:cantSplit w:val="true"/>
-        </w:trPr>
-        <w:tc>
-          <w:tcPr>
-            <w:tcW w:type="dxa" w:w="792"/>
-            <w:vAlign w:val="center"/>
-            <w:tcMar>
-              <w:top w:w="65" w:type="dxa"/>
-              <w:start w:w="105" w:type="dxa"/>
-              <w:bottom w:w="65" w:type="dxa"/>
-              <w:end w:w="105" w:type="dxa"/>
-            </w:tcMar>
-          </w:tcPr>
-          <w:p>
-            <w:pPr>
-              <w:spacing w:before="0" w:after="0" w:line="254" w:lineRule="auto"/>
-              <w:jc w:val="center"/>
-            </w:pPr>
-            <w:r>
-              <w:rPr>
-                <w:rFonts w:ascii="Microsoft YaHei" w:hAnsi="Microsoft YaHei" w:eastAsia="Microsoft YaHei"/>
-                <w:b w:val="0"/>
-                <w:color w:val="1F1F1F"/>
-                <w:sz w:val="18"/>
-              </w:rPr>
-              <w:t>3</w:t>
-            </w:r>
-          </w:p>
-        </w:tc>
-        <w:tc>
-          <w:tcPr>
-            <w:tcW w:type="dxa" w:w="2520"/>
-            <w:vAlign w:val="center"/>
-            <w:tcMar>
-              <w:top w:w="65" w:type="dxa"/>
-              <w:start w:w="105" w:type="dxa"/>
-              <w:bottom w:w="65" w:type="dxa"/>
-              <w:end w:w="105" w:type="dxa"/>
-            </w:tcMar>
-          </w:tcPr>
-          <w:p>
-            <w:pPr>
-              <w:spacing w:before="0" w:after="0" w:line="254" w:lineRule="auto"/>
-              <w:jc w:val="left"/>
-            </w:pPr>
-            <w:r>
-              <w:rPr>
-                <w:rFonts w:ascii="Microsoft YaHei" w:hAnsi="Microsoft YaHei" w:eastAsia="Microsoft YaHei"/>
-                <w:b w:val="0"/>
-                <w:color w:val="1F1F1F"/>
-                <w:sz w:val="18"/>
-              </w:rPr>
-              <w:t>隐私失败关闭</w:t>
-            </w:r>
-          </w:p>
-        </w:tc>
-        <w:tc>
-          <w:tcPr>
-            <w:tcW w:type="dxa" w:w="6696"/>
-            <w:vAlign w:val="center"/>
-            <w:tcMar>
-              <w:top w:w="65" w:type="dxa"/>
-              <w:start w:w="105" w:type="dxa"/>
-              <w:bottom w:w="65" w:type="dxa"/>
-              <w:end w:w="105" w:type="dxa"/>
-            </w:tcMar>
-          </w:tcPr>
-          <w:p>
-            <w:pPr>
-              <w:spacing w:before="0" w:after="0" w:line="254" w:lineRule="auto"/>
-              <w:jc w:val="left"/>
-            </w:pPr>
-            <w:r>
-              <w:rPr>
-                <w:rFonts w:ascii="Microsoft YaHei" w:hAnsi="Microsoft YaHei" w:eastAsia="Microsoft YaHei"/>
-                <w:b w:val="0"/>
-                <w:color w:val="1F1F1F"/>
-                <w:sz w:val="18"/>
-              </w:rPr>
-              <w:t>策略或关键列无效时不产生可发布记录</w:t>
-            </w:r>
-          </w:p>
-        </w:tc>
-      </w:tr>
-      <w:tr>
-        <w:trPr>
-          <w:cantSplit w:val="true"/>
-        </w:trPr>
-        <w:tc>
-          <w:tcPr>
-            <w:tcW w:type="dxa" w:w="792"/>
-            <w:shd w:fill="F4F7FA"/>
-            <w:vAlign w:val="center"/>
-            <w:tcMar>
-              <w:top w:w="65" w:type="dxa"/>
-              <w:start w:w="105" w:type="dxa"/>
-              <w:bottom w:w="65" w:type="dxa"/>
-              <w:end w:w="105" w:type="dxa"/>
-            </w:tcMar>
-          </w:tcPr>
-          <w:p>
-            <w:pPr>
-              <w:spacing w:before="0" w:after="0" w:line="254" w:lineRule="auto"/>
-              <w:jc w:val="center"/>
-            </w:pPr>
-            <w:r>
-              <w:rPr>
-                <w:rFonts w:ascii="Microsoft YaHei" w:hAnsi="Microsoft YaHei" w:eastAsia="Microsoft YaHei"/>
-                <w:b w:val="0"/>
-                <w:color w:val="1F1F1F"/>
-                <w:sz w:val="18"/>
-              </w:rPr>
-              <w:t>4</w:t>
-            </w:r>
-          </w:p>
-        </w:tc>
-        <w:tc>
-          <w:tcPr>
-            <w:tcW w:type="dxa" w:w="2520"/>
-            <w:shd w:fill="F4F7FA"/>
-            <w:vAlign w:val="center"/>
-            <w:tcMar>
-              <w:top w:w="65" w:type="dxa"/>
-              <w:start w:w="105" w:type="dxa"/>
-              <w:bottom w:w="65" w:type="dxa"/>
-              <w:end w:w="105" w:type="dxa"/>
-            </w:tcMar>
-          </w:tcPr>
-          <w:p>
-            <w:pPr>
-              <w:spacing w:before="0" w:after="0" w:line="254" w:lineRule="auto"/>
-              <w:jc w:val="left"/>
-            </w:pPr>
-            <w:r>
-              <w:rPr>
-                <w:rFonts w:ascii="Microsoft YaHei" w:hAnsi="Microsoft YaHei" w:eastAsia="Microsoft YaHei"/>
-                <w:b w:val="0"/>
-                <w:color w:val="1F1F1F"/>
-                <w:sz w:val="18"/>
-              </w:rPr>
-              <w:t>全目标测试</w:t>
-            </w:r>
-          </w:p>
-        </w:tc>
-        <w:tc>
-          <w:tcPr>
-            <w:tcW w:type="dxa" w:w="6696"/>
-            <w:shd w:fill="F4F7FA"/>
-            <w:vAlign w:val="center"/>
-            <w:tcMar>
-              <w:top w:w="65" w:type="dxa"/>
-              <w:start w:w="105" w:type="dxa"/>
-              <w:bottom w:w="65" w:type="dxa"/>
-              <w:end w:w="105" w:type="dxa"/>
-            </w:tcMar>
-          </w:tcPr>
-          <w:p>
-            <w:pPr>
-              <w:spacing w:before="0" w:after="0" w:line="254" w:lineRule="auto"/>
-              <w:jc w:val="left"/>
-            </w:pPr>
-            <w:r>
-              <w:rPr>
-                <w:rFonts w:ascii="Microsoft YaHei" w:hAnsi="Microsoft YaHei" w:eastAsia="Microsoft YaHei"/>
-                <w:b w:val="0"/>
-                <w:color w:val="1F1F1F"/>
-                <w:sz w:val="18"/>
-              </w:rPr>
-              <w:t>9 项测试在 Native、JavaScript、Wasm、Wasm-GC 全部通过</w:t>
-            </w:r>
-          </w:p>
-        </w:tc>
-      </w:tr>
-      <w:tr>
-        <w:trPr>
-          <w:cantSplit w:val="true"/>
-        </w:trPr>
-        <w:tc>
-          <w:tcPr>
-            <w:tcW w:type="dxa" w:w="792"/>
-            <w:vAlign w:val="center"/>
-            <w:tcMar>
-              <w:top w:w="65" w:type="dxa"/>
-              <w:start w:w="105" w:type="dxa"/>
-              <w:bottom w:w="65" w:type="dxa"/>
-              <w:end w:w="105" w:type="dxa"/>
-            </w:tcMar>
-          </w:tcPr>
-          <w:p>
-            <w:pPr>
-              <w:spacing w:before="0" w:after="0" w:line="254" w:lineRule="auto"/>
-              <w:jc w:val="center"/>
-            </w:pPr>
-            <w:r>
-              <w:rPr>
-                <w:rFonts w:ascii="Microsoft YaHei" w:hAnsi="Microsoft YaHei" w:eastAsia="Microsoft YaHei"/>
-                <w:b w:val="0"/>
-                <w:color w:val="1F1F1F"/>
-                <w:sz w:val="18"/>
-              </w:rPr>
-              <w:t>5</w:t>
-            </w:r>
-          </w:p>
-        </w:tc>
-        <w:tc>
-          <w:tcPr>
-            <w:tcW w:type="dxa" w:w="2520"/>
-            <w:vAlign w:val="center"/>
-            <w:tcMar>
-              <w:top w:w="65" w:type="dxa"/>
-              <w:start w:w="105" w:type="dxa"/>
-              <w:bottom w:w="65" w:type="dxa"/>
-              <w:end w:w="105" w:type="dxa"/>
-            </w:tcMar>
-          </w:tcPr>
-          <w:p>
-            <w:pPr>
-              <w:spacing w:before="0" w:after="0" w:line="254" w:lineRule="auto"/>
-              <w:jc w:val="left"/>
-            </w:pPr>
-            <w:r>
-              <w:rPr>
-                <w:rFonts w:ascii="Microsoft YaHei" w:hAnsi="Microsoft YaHei" w:eastAsia="Microsoft YaHei"/>
-                <w:b w:val="0"/>
-                <w:color w:val="1F1F1F"/>
-                <w:sz w:val="18"/>
-              </w:rPr>
-              <w:t>Arrow 交接</w:t>
-            </w:r>
-          </w:p>
-        </w:tc>
-        <w:tc>
-          <w:tcPr>
-            <w:tcW w:type="dxa" w:w="6696"/>
-            <w:vAlign w:val="center"/>
-            <w:tcMar>
-              <w:top w:w="65" w:type="dxa"/>
-              <w:start w:w="105" w:type="dxa"/>
-              <w:bottom w:w="65" w:type="dxa"/>
-              <w:end w:w="105" w:type="dxa"/>
-            </w:tcMar>
-          </w:tcPr>
-          <w:p>
-            <w:pPr>
-              <w:spacing w:before="0" w:after="0" w:line="254" w:lineRule="auto"/>
-              <w:jc w:val="left"/>
-            </w:pPr>
-            <w:r>
-              <w:rPr>
-                <w:rFonts w:ascii="Microsoft YaHei" w:hAnsi="Microsoft YaHei" w:eastAsia="Microsoft YaHei"/>
-                <w:b w:val="0"/>
-                <w:color w:val="1F1F1F"/>
-                <w:sz w:val="18"/>
-              </w:rPr>
-              <w:t>隐私发现和发布清单可完成 IPC 写入与读取</w:t>
-            </w:r>
-          </w:p>
-        </w:tc>
-      </w:tr>
-      <w:tr>
-        <w:trPr>
-          <w:cantSplit w:val="true"/>
-        </w:trPr>
-        <w:tc>
-          <w:tcPr>
-            <w:tcW w:type="dxa" w:w="792"/>
-            <w:shd w:fill="F4F7FA"/>
-            <w:vAlign w:val="center"/>
-            <w:tcMar>
-              <w:top w:w="65" w:type="dxa"/>
-              <w:start w:w="105" w:type="dxa"/>
-              <w:bottom w:w="65" w:type="dxa"/>
-              <w:end w:w="105" w:type="dxa"/>
-            </w:tcMar>
-          </w:tcPr>
-          <w:p>
-            <w:pPr>
-              <w:spacing w:before="0" w:after="0" w:line="254" w:lineRule="auto"/>
-              <w:jc w:val="center"/>
-            </w:pPr>
-            <w:r>
-              <w:rPr>
-                <w:rFonts w:ascii="Microsoft YaHei" w:hAnsi="Microsoft YaHei" w:eastAsia="Microsoft YaHei"/>
-                <w:b w:val="0"/>
-                <w:color w:val="1F1F1F"/>
-                <w:sz w:val="18"/>
-              </w:rPr>
-              <w:t>6</w:t>
-            </w:r>
-          </w:p>
-        </w:tc>
-        <w:tc>
-          <w:tcPr>
-            <w:tcW w:type="dxa" w:w="2520"/>
-            <w:shd w:fill="F4F7FA"/>
-            <w:vAlign w:val="center"/>
-            <w:tcMar>
-              <w:top w:w="65" w:type="dxa"/>
-              <w:start w:w="105" w:type="dxa"/>
-              <w:bottom w:w="65" w:type="dxa"/>
-              <w:end w:w="105" w:type="dxa"/>
-            </w:tcMar>
-          </w:tcPr>
-          <w:p>
-            <w:pPr>
-              <w:spacing w:before="0" w:after="0" w:line="254" w:lineRule="auto"/>
-              <w:jc w:val="left"/>
-            </w:pPr>
-            <w:r>
-              <w:rPr>
-                <w:rFonts w:ascii="Microsoft YaHei" w:hAnsi="Microsoft YaHei" w:eastAsia="Microsoft YaHei"/>
-                <w:b w:val="0"/>
-                <w:color w:val="1F1F1F"/>
-                <w:sz w:val="18"/>
-              </w:rPr>
-              <w:t>材料一致</w:t>
-            </w:r>
-          </w:p>
-        </w:tc>
-        <w:tc>
-          <w:tcPr>
-            <w:tcW w:type="dxa" w:w="6696"/>
-            <w:shd w:fill="F4F7FA"/>
-            <w:vAlign w:val="center"/>
-            <w:tcMar>
-              <w:top w:w="65" w:type="dxa"/>
-              <w:start w:w="105" w:type="dxa"/>
-              <w:bottom w:w="65" w:type="dxa"/>
-              <w:end w:w="105" w:type="dxa"/>
-            </w:tcMar>
-          </w:tcPr>
-          <w:p>
-            <w:pPr>
-              <w:spacing w:before="0" w:after="0" w:line="254" w:lineRule="auto"/>
-              <w:jc w:val="left"/>
-            </w:pPr>
-            <w:r>
-              <w:rPr>
-                <w:rFonts w:ascii="Microsoft YaHei" w:hAnsi="Microsoft YaHei" w:eastAsia="Microsoft YaHei"/>
-                <w:b w:val="0"/>
-                <w:color w:val="1F1F1F"/>
-                <w:sz w:val="18"/>
-              </w:rPr>
-              <w:t>README、申报书、差异说明、演示输出和当前代码一致</w:t>
-            </w:r>
-          </w:p>
-        </w:tc>
-      </w:tr>
-    </w:tbl>
-    <w:p>
-      <w:pPr>
-        <w:spacing w:after="0" w:before="0" w:line="20" w:lineRule="exact"/>
-      </w:pPr>
-      <w:r>
-        <w:rPr>
-          <w:rFonts w:ascii="Microsoft YaHei" w:hAnsi="Microsoft YaHei" w:eastAsia="Microsoft YaHei"/>
-          <w:b w:val="0"/>
-          <w:color w:val="FFFFFF"/>
-          <w:sz w:val="2"/>
-        </w:rPr>
-        <w:t xml:space="preserve"> </w:t>
+        <w:t>下一步评估跨批次处理。CSV 和 JSONL 适配复用现有策略，不另设一套授权规则。</w:t>
       </w:r>
     </w:p>
     <w:sectPr>
-      <w:footerReference w:type="default" r:id="rId9"/>
-      <w:pgSz w:w="11909" w:h="16834"/>
-      <w:pgMar w:top="864" w:right="1037" w:bottom="950" w:left="1037" w:header="720" w:footer="720" w:gutter="0"/>
+      <w:pgSz w:w="12240" w:h="15840"/>
+      <w:pgMar w:top="1134" w:right="1304" w:bottom="1134" w:left="1304" w:header="720" w:footer="720" w:gutter="0"/>
       <w:cols w:space="720"/>
       <w:docGrid w:linePitch="360"/>
     </w:sectPr>
   </w:body>
 </w:document>
-</file>
-
-<file path=word/footer1.xml><?xml version="1.0" encoding="utf-8"?>
-<w:ftr xmlns:m="http://schemas.openxmlformats.org/officeDocument/2006/math" xmlns:mc="http://schemas.openxmlformats.org/markup-compatibility/2006" xmlns:mo="http://schemas.microsoft.com/office/mac/office/2008/main" xmlns:mv="urn:schemas-microsoft-com:mac:vml" xmlns:o="urn:schemas-microsoft-com:office:office" xmlns:r="http://schemas.openxmlformats.org/officeDocument/2006/relationships" xmlns:v="urn:schemas-microsoft-com:vml" xmlns:w10="urn:schemas-microsoft-com:office:word" xmlns:w14="http://schemas.microsoft.com/office/word/2010/wordml" xmlns:w="http://schemas.openxmlformats.org/wordprocessingml/2006/main" xmlns:wne="http://schemas.microsoft.com/office/word/2006/wordml" xmlns:wp14="http://schemas.microsoft.com/office/word/2010/wordprocessingDrawing" xmlns:wp="http://schemas.openxmlformats.org/drawingml/2006/wordprocessingDrawing" xmlns:wpc="http://schemas.microsoft.com/office/word/2010/wordprocessingCanvas" xmlns:wpg="http://schemas.microsoft.com/office/word/2010/wordprocessingGroup" xmlns:wpi="http://schemas.microsoft.com/office/word/2010/wordprocessingInk" xmlns:wps="http://schemas.microsoft.com/office/word/2010/wordprocessingShape" mc:Ignorable="w14 wp14">
-  <w:p>
-    <w:pPr>
-      <w:pStyle w:val="Footer"/>
-      <w:spacing w:before="60"/>
-      <w:jc w:val="center"/>
-    </w:pPr>
-    <w:r>
-      <w:rPr>
-        <w:rFonts w:ascii="Microsoft YaHei" w:hAnsi="Microsoft YaHei" w:eastAsia="Microsoft YaHei"/>
-        <w:b w:val="0"/>
-        <w:color w:val="6B7280"/>
-        <w:sz w:val="17"/>
-      </w:rPr>
-      <w:t xml:space="preserve">MoonSentinel 项目申报书  第 </w:t>
-    </w:r>
-    <w:r>
-      <w:rPr>
-        <w:rFonts w:ascii="Microsoft YaHei" w:hAnsi="Microsoft YaHei" w:eastAsia="Microsoft YaHei"/>
-        <w:b w:val="0"/>
-        <w:color w:val="6B7280"/>
-        <w:sz w:val="17"/>
-      </w:rPr>
-      <w:fldChar w:fldCharType="begin"/>
-      <w:instrText xml:space="preserve"> PAGE </w:instrText>
-      <w:fldChar w:fldCharType="end"/>
-    </w:r>
-    <w:r>
-      <w:rPr>
-        <w:rFonts w:ascii="Microsoft YaHei" w:hAnsi="Microsoft YaHei" w:eastAsia="Microsoft YaHei"/>
-        <w:b w:val="0"/>
-        <w:color w:val="6B7280"/>
-        <w:sz w:val="17"/>
-      </w:rPr>
-      <w:t xml:space="preserve"> 页</w:t>
-    </w:r>
-  </w:p>
-</w:ftr>
 </file>
 
 <file path=word/numbering.xml><?xml version="1.0" encoding="utf-8"?>
@@ -3687,8 +635,12 @@
     <w:name w:val="Normal"/>
     <w:qFormat/>
     <w:rsid w:val="00FC693F"/>
+    <w:pPr>
+      <w:spacing w:after="100" w:line="276" w:lineRule="auto"/>
+    </w:pPr>
     <w:rPr>
       <w:rFonts w:ascii="Microsoft YaHei" w:hAnsi="Microsoft YaHei" w:eastAsia="Microsoft YaHei"/>
+      <w:color w:val="000000"/>
       <w:sz w:val="21"/>
     </w:rPr>
   </w:style>
@@ -3754,7 +706,7 @@
       <w:rFonts w:asciiTheme="majorHAnsi" w:eastAsiaTheme="majorEastAsia" w:hAnsiTheme="majorHAnsi" w:cstheme="majorBidi" w:ascii="Microsoft YaHei" w:hAnsi="Microsoft YaHei" w:eastAsia="Microsoft YaHei"/>
       <w:b/>
       <w:bCs/>
-      <w:color w:val="365F91" w:themeColor="accent1" w:themeShade="BF"/>
+      <w:color w:val="000000"/>
       <w:sz w:val="28"/>
       <w:szCs w:val="28"/>
     </w:rPr>
@@ -3775,7 +727,7 @@
       <w:outlineLvl w:val="1"/>
     </w:pPr>
     <w:rPr>
-      <w:rFonts w:asciiTheme="majorHAnsi" w:eastAsiaTheme="majorEastAsia" w:hAnsiTheme="majorHAnsi" w:cstheme="majorBidi" w:ascii="Microsoft YaHei" w:hAnsi="Microsoft YaHei" w:eastAsia="Microsoft YaHei"/>
+      <w:rFonts w:asciiTheme="majorHAnsi" w:eastAsiaTheme="majorEastAsia" w:hAnsiTheme="majorHAnsi" w:cstheme="majorBidi"/>
       <w:b/>
       <w:bCs/>
       <w:color w:val="4F81BD" w:themeColor="accent1"/>
@@ -4033,15 +985,20 @@
     <w:qFormat/>
     <w:rsid w:val="00FC693F"/>
     <w:pPr>
+      <w:keepNext/>
+      <w:pBdr>
+        <w:bottom w:val="single" w:sz="8" w:space="4" w:color="4F81BD" w:themeColor="accent1"/>
+      </w:pBdr>
       <w:spacing w:after="300" w:line="240" w:lineRule="auto"/>
       <w:contextualSpacing/>
     </w:pPr>
     <w:rPr>
       <w:rFonts w:asciiTheme="majorHAnsi" w:eastAsiaTheme="majorEastAsia" w:hAnsiTheme="majorHAnsi" w:cstheme="majorBidi" w:ascii="Microsoft YaHei" w:hAnsi="Microsoft YaHei" w:eastAsia="Microsoft YaHei"/>
-      <w:color w:val="17365D" w:themeColor="text2" w:themeShade="BF"/>
+      <w:b/>
+      <w:color w:val="000000"/>
       <w:spacing w:val="5"/>
       <w:kern w:val="28"/>
-      <w:sz w:val="52"/>
+      <w:sz w:val="36"/>
       <w:szCs w:val="52"/>
     </w:rPr>
   </w:style>

</xml_diff>